<commit_message>
End of day 4/10/26
</commit_message>
<xml_diff>
--- a/About.docx
+++ b/About.docx
@@ -175,7 +175,13 @@
         <w:t>) to view available pages, then select the destination you wish to access.</w:t>
       </w:r>
       <w:r>
-        <w:t xml:space="preserve"> The current page title is displayed next to the menu icon. To return to the Home page from any section, use the back arrow. Drag to scroll up or down. Change the background color by using the button at the bottom of the main page.</w:t>
+        <w:t xml:space="preserve"> The current page title is displayed next to the menu icon. To return to the Home page from any section, use the back arrow. Drag to scroll up or down. Change the background color by using the button at the bottom of the </w:t>
+      </w:r>
+      <w:r>
+        <w:t>home</w:t>
+      </w:r>
+      <w:r>
+        <w:t xml:space="preserve"> page.</w:t>
       </w:r>
       <w:r>
         <w:br/>
@@ -293,30 +299,6 @@
       </w:r>
       <w:r>
         <w:t xml:space="preserve"> and support</w:t>
-      </w:r>
-    </w:p>
-    <w:p>
-      <w:pPr>
-        <w:pStyle w:val="ListParagraph"/>
-        <w:numPr>
-          <w:ilvl w:val="0"/>
-          <w:numId w:val="12"/>
-        </w:numPr>
-      </w:pPr>
-      <w:r>
-        <w:t xml:space="preserve">Tuner – </w:t>
-      </w:r>
-      <w:r>
-        <w:tab/>
-      </w:r>
-      <w:r>
-        <w:t>Di</w:t>
-      </w:r>
-      <w:r>
-        <w:t>splay of a single note heard in various formats.</w:t>
-      </w:r>
-      <w:r>
-        <w:br/>
       </w:r>
     </w:p>
     <w:p>
@@ -520,7 +502,16 @@
         </w:numPr>
       </w:pPr>
       <w:r>
-        <w:t xml:space="preserve">When the button shows a green circle, tap to start listening and refresh the notes </w:t>
+        <w:t xml:space="preserve">When the button </w:t>
+      </w:r>
+      <w:r>
+        <w:t>is</w:t>
+      </w:r>
+      <w:r>
+        <w:t xml:space="preserve"> a green circle, tap to start listening</w:t>
+      </w:r>
+      <w:r>
+        <w:t>.</w:t>
       </w:r>
     </w:p>
     <w:p>
@@ -531,7 +522,13 @@
         </w:numPr>
       </w:pPr>
       <w:r>
-        <w:t>When it shows a red square, tap to stop listening</w:t>
+        <w:t>While listening  it becomes a red square</w:t>
+      </w:r>
+      <w:r>
+        <w:t>, tap to stop listening</w:t>
+      </w:r>
+      <w:r>
+        <w:t>.</w:t>
       </w:r>
     </w:p>
     <w:p>
@@ -1493,7 +1490,7 @@
 <w:numbering xmlns:wpc="http://schemas.microsoft.com/office/word/2010/wordprocessingCanvas" xmlns:cx="http://schemas.microsoft.com/office/drawing/2014/chartex" xmlns:cx1="http://schemas.microsoft.com/office/drawing/2015/9/8/chartex" xmlns:cx2="http://schemas.microsoft.com/office/drawing/2015/10/21/chartex" xmlns:cx3="http://schemas.microsoft.com/office/drawing/2016/5/9/chartex" xmlns:cx4="http://schemas.microsoft.com/office/drawing/2016/5/10/chartex" xmlns:cx5="http://schemas.microsoft.com/office/drawing/2016/5/11/chartex" xmlns:cx6="http://schemas.microsoft.com/office/drawing/2016/5/12/chartex" xmlns:cx7="http://schemas.microsoft.com/office/drawing/2016/5/13/chartex" xmlns:cx8="http://schemas.microsoft.com/office/drawing/2016/5/14/chartex" xmlns:mc="http://schemas.openxmlformats.org/markup-compatibility/2006" xmlns:aink="http://schemas.microsoft.com/office/drawing/2016/ink" xmlns:am3d="http://schemas.microsoft.com/office/drawing/2017/model3d" xmlns:o="urn:schemas-microsoft-com:office:office" xmlns:oel="http://schemas.microsoft.com/office/2019/extlst" xmlns:r="http://schemas.openxmlformats.org/officeDocument/2006/relationships" xmlns:m="http://schemas.openxmlformats.org/officeDocument/2006/math" xmlns:v="urn:schemas-microsoft-com:vml" xmlns:wp14="http://schemas.microsoft.com/office/word/2010/wordprocessingDrawing" xmlns:wp="http://schemas.openxmlformats.org/drawingml/2006/wordprocessingDrawing" xmlns:w10="urn:schemas-microsoft-com:office:word" xmlns:w="http://schemas.openxmlformats.org/wordprocessingml/2006/main" xmlns:w14="http://schemas.microsoft.com/office/word/2010/wordml" xmlns:w15="http://schemas.microsoft.com/office/word/2012/wordml" xmlns:w16cex="http://schemas.microsoft.com/office/word/2018/wordml/cex" xmlns:w16cid="http://schemas.microsoft.com/office/word/2016/wordml/cid" xmlns:w16="http://schemas.microsoft.com/office/word/2018/wordml" xmlns:w16du="http://schemas.microsoft.com/office/word/2023/wordml/word16du" xmlns:w16sdtdh="http://schemas.microsoft.com/office/word/2020/wordml/sdtdatahash" xmlns:w16sdtfl="http://schemas.microsoft.com/office/word/2024/wordml/sdtformatlock" xmlns:w16se="http://schemas.microsoft.com/office/word/2015/wordml/symex" xmlns:wpg="http://schemas.microsoft.com/office/word/2010/wordprocessingGroup" xmlns:wpi="http://schemas.microsoft.com/office/word/2010/wordprocessingInk" xmlns:wne="http://schemas.microsoft.com/office/word/2006/wordml" xmlns:wps="http://schemas.microsoft.com/office/word/2010/wordprocessingShape" mc:Ignorable="w14 w15 w16se w16cid w16 w16cex w16sdtdh w16sdtfl w16du wp14">
   <w:numPicBullet w:numPicBulletId="0">
     <w:pict>
-      <v:rect id="_x0000_i1287" style="width:0;height:1.5pt" o:hralign="center" o:bullet="t" o:hrstd="t" o:hr="t" fillcolor="#a0a0a0" stroked="f"/>
+      <v:rect id="_x0000_i1034" style="width:0;height:1.5pt" o:hralign="center" o:bullet="t" o:hrstd="t" o:hr="t" fillcolor="#a0a0a0" stroked="f"/>
     </w:pict>
   </w:numPicBullet>
   <w:abstractNum w:abstractNumId="0" w15:restartNumberingAfterBreak="0">
@@ -3290,7 +3287,6 @@
     <w:lvl w:ilvl="1">
       <w:start w:val="1"/>
       <w:numFmt w:val="decimal"/>
-      <w:pStyle w:val="Heading2"/>
       <w:lvlText w:val="%1.%2"/>
       <w:lvlJc w:val="left"/>
       <w:pPr>
@@ -3300,7 +3296,6 @@
     <w:lvl w:ilvl="2">
       <w:start w:val="1"/>
       <w:numFmt w:val="decimal"/>
-      <w:pStyle w:val="Heading3"/>
       <w:lvlText w:val="%1.%2.%3"/>
       <w:lvlJc w:val="left"/>
       <w:pPr>
@@ -3310,7 +3305,6 @@
     <w:lvl w:ilvl="3">
       <w:start w:val="1"/>
       <w:numFmt w:val="decimal"/>
-      <w:pStyle w:val="Heading4"/>
       <w:lvlText w:val="%1.%2.%3.%4"/>
       <w:lvlJc w:val="left"/>
       <w:pPr>

</xml_diff>

<commit_message>
End of day 4/14/2026
</commit_message>
<xml_diff>
--- a/About.docx
+++ b/About.docx
@@ -134,7 +134,7 @@
       </w:r>
       <w:r>
         <w:rPr>
-          <w:rStyle w:val="Heading2Char"/>
+          <w:rStyle w:val="Heading1Char"/>
         </w:rPr>
         <w:t>Features</w:t>
       </w:r>
@@ -149,13 +149,13 @@
       </w:r>
       <w:r>
         <w:rPr>
-          <w:rStyle w:val="Heading3Char"/>
+          <w:rStyle w:val="Heading2Char"/>
         </w:rPr>
         <w:t>N</w:t>
       </w:r>
       <w:r>
         <w:rPr>
-          <w:rStyle w:val="Heading3Char"/>
+          <w:rStyle w:val="Heading2Char"/>
         </w:rPr>
         <w:t>avigation</w:t>
       </w:r>
@@ -303,8 +303,7 @@
     </w:p>
     <w:p>
       <w:pPr>
-        <w:pStyle w:val="Heading1"/>
-        <w:ind w:left="720" w:hanging="720"/>
+        <w:pStyle w:val="Heading2"/>
       </w:pPr>
       <w:r>
         <w:t>Home Page</w:t>
@@ -313,7 +312,7 @@
     <w:p>
       <w:r>
         <w:rPr>
-          <w:rStyle w:val="Heading4Char"/>
+          <w:rStyle w:val="Heading3Char"/>
         </w:rPr>
         <w:t>Staff and Notes</w:t>
       </w:r>
@@ -345,11 +344,14 @@
       <w:r>
         <w:t xml:space="preserve"> octave.</w:t>
       </w:r>
+      <w:r>
+        <w:t xml:space="preserve"> </w:t>
+      </w:r>
     </w:p>
     <w:p>
       <w:r>
         <w:rPr>
-          <w:rStyle w:val="Heading4Char"/>
+          <w:rStyle w:val="Heading3Char"/>
         </w:rPr>
         <w:t>Feedback Display</w:t>
       </w:r>
@@ -357,25 +359,7 @@
         <w:br/>
       </w:r>
       <w:r>
-        <w:t>Below the staff is a row of feedback indicators.</w:t>
-      </w:r>
-      <w:r>
-        <w:t xml:space="preserve"> </w:t>
-      </w:r>
-      <w:r>
-        <w:t xml:space="preserve">Each indicator corresponds to </w:t>
-      </w:r>
-      <w:r>
-        <w:t>the</w:t>
-      </w:r>
-      <w:r>
-        <w:t xml:space="preserve"> note </w:t>
-      </w:r>
-      <w:r>
-        <w:t xml:space="preserve">above it </w:t>
-      </w:r>
-      <w:r>
-        <w:t>displayed on the staff.</w:t>
+        <w:t>Beneath each note is a brown rectangular indicator.</w:t>
       </w:r>
     </w:p>
     <w:p>
@@ -390,6 +374,9 @@
         <w:t xml:space="preserve">An indicator turns green when you play </w:t>
       </w:r>
       <w:r>
+        <w:t xml:space="preserve">the </w:t>
+      </w:r>
+      <w:r>
         <w:t>correct note.</w:t>
       </w:r>
     </w:p>
@@ -425,20 +412,13 @@
     </w:p>
     <w:p>
       <w:pPr>
-        <w:pStyle w:val="Heading2"/>
-        <w:numPr>
-          <w:ilvl w:val="0"/>
-          <w:numId w:val="0"/>
-        </w:numPr>
+        <w:pStyle w:val="Heading3"/>
       </w:pPr>
       <w:r>
         <w:t>Buttons</w:t>
       </w:r>
       <w:r>
-        <w:t xml:space="preserve"> and </w:t>
-      </w:r>
-      <w:r>
-        <w:t>Controls</w:t>
+        <w:t xml:space="preserve"> Labels and Pickers</w:t>
       </w:r>
     </w:p>
     <w:p>
@@ -446,23 +426,15 @@
         <w:pStyle w:val="Heading5"/>
       </w:pPr>
       <w:r>
-        <w:t>Auto Play</w:t>
-      </w:r>
-      <w:r>
-        <w:br/>
-      </w:r>
-      <w:r>
-        <w:rPr>
-          <w:b w:val="0"/>
-          <w:bCs/>
-          <w:i w:val="0"/>
-          <w:iCs/>
-          <w:sz w:val="24"/>
-        </w:rPr>
-        <w:t>This triangular button plays the displayed tune using a synthesized reference tone. This helps you learn the sound of a scale</w:t>
-      </w:r>
-      <w:r>
-        <w:t>.</w:t>
+        <w:t xml:space="preserve">Instrument </w:t>
+      </w:r>
+      <w:r>
+        <w:t>(Label and Picker)</w:t>
+      </w:r>
+    </w:p>
+    <w:p>
+      <w:r>
+        <w:t>Select your instrument from a list grouped by key. This and all other choices are remembered. They will appear next time you open the app.</w:t>
       </w:r>
     </w:p>
     <w:p>
@@ -470,106 +442,50 @@
         <w:pStyle w:val="Heading5"/>
       </w:pPr>
       <w:r>
-        <w:rPr>
-          <w:rStyle w:val="Heading5Char"/>
-          <w:b/>
-          <w:i/>
-        </w:rPr>
-        <w:t xml:space="preserve">Start </w:t>
-      </w:r>
-      <w:r>
-        <w:rPr>
-          <w:rStyle w:val="Heading5Char"/>
-          <w:b/>
-          <w:i/>
-        </w:rPr>
-        <w:t>/</w:t>
-      </w:r>
-      <w:r>
-        <w:rPr>
-          <w:rStyle w:val="Heading5Char"/>
-          <w:b/>
-          <w:i/>
-        </w:rPr>
-        <w:t xml:space="preserve"> Stop Listening</w:t>
-      </w:r>
-    </w:p>
-    <w:p>
-      <w:pPr>
-        <w:numPr>
-          <w:ilvl w:val="0"/>
-          <w:numId w:val="14"/>
-        </w:numPr>
-      </w:pPr>
-      <w:r>
-        <w:t xml:space="preserve">When the button </w:t>
-      </w:r>
-      <w:r>
-        <w:t>is</w:t>
-      </w:r>
-      <w:r>
-        <w:t xml:space="preserve"> a green circle, tap to start listening</w:t>
-      </w:r>
-      <w:r>
-        <w:t>.</w:t>
-      </w:r>
-    </w:p>
-    <w:p>
-      <w:pPr>
-        <w:numPr>
-          <w:ilvl w:val="0"/>
-          <w:numId w:val="14"/>
-        </w:numPr>
-      </w:pPr>
-      <w:r>
-        <w:t>While listening  it becomes a red square</w:t>
-      </w:r>
-      <w:r>
-        <w:t>, tap to stop listening</w:t>
-      </w:r>
-      <w:r>
-        <w:t>.</w:t>
-      </w:r>
-    </w:p>
-    <w:p>
-      <w:pPr>
-        <w:rPr>
-          <w:b/>
-          <w:i/>
-        </w:rPr>
-      </w:pPr>
-      <w:r>
-        <w:rPr>
-          <w:rStyle w:val="Heading5Char"/>
-        </w:rPr>
-        <w:t xml:space="preserve">Instrument </w:t>
-      </w:r>
-      <w:r>
-        <w:br/>
-      </w:r>
-      <w:r>
-        <w:t>Select your instrument from a list grouped by key. Your choice is remembered.</w:t>
-      </w:r>
-      <w:r>
-        <w:rPr>
-          <w:b/>
-          <w:i/>
-        </w:rPr>
-        <w:t xml:space="preserve"> </w:t>
-      </w:r>
-    </w:p>
-    <w:p>
-      <w:r>
-        <w:rPr>
-          <w:rStyle w:val="Heading5Char"/>
-        </w:rPr>
         <w:t>Key</w:t>
       </w:r>
-      <w:r>
-        <w:br/>
-      </w:r>
-      <w:r>
-        <w:t>Displays the key signature (transposed for your instrument). The concert key is shown in the top-left label. This picker is not always visible.</w:t>
+    </w:p>
+    <w:p>
+      <w:r>
+        <w:t xml:space="preserve">Select </w:t>
+      </w:r>
+      <w:r>
+        <w:t xml:space="preserve"> the key signature (transposed for your instrument)</w:t>
+      </w:r>
+      <w:r>
+        <w:t xml:space="preserve"> in which you want the music </w:t>
+      </w:r>
+      <w:r>
+        <w:t>to be written.</w:t>
+      </w:r>
+      <w:r>
+        <w:t xml:space="preserve"> This picker is not always visible.</w:t>
+      </w:r>
+    </w:p>
+    <w:p>
+      <w:pPr>
+        <w:pStyle w:val="Heading5"/>
+      </w:pPr>
+      <w:r>
+        <w:t>Name of selected Scale</w:t>
+      </w:r>
+    </w:p>
+    <w:p>
+      <w:r>
+        <w:t>This could be Major, Minor and etc.</w:t>
+      </w:r>
+    </w:p>
+    <w:p>
+      <w:pPr>
+        <w:pStyle w:val="Heading5"/>
+      </w:pPr>
+      <w:r>
+        <w:t>Concert Key</w:t>
+      </w:r>
+    </w:p>
+    <w:p>
+      <w:r>
+        <w:t>This is automatically displayed when you pick a key.</w:t>
       </w:r>
     </w:p>
     <w:p>
@@ -586,7 +502,11 @@
     </w:p>
     <w:p>
       <w:pPr>
-        <w:ind w:left="360"/>
+        <w:pStyle w:val="ListParagraph"/>
+        <w:numPr>
+          <w:ilvl w:val="0"/>
+          <w:numId w:val="19"/>
+        </w:numPr>
       </w:pPr>
       <w:r>
         <w:rPr>
@@ -597,19 +517,37 @@
         <w:t>Selected Scale</w:t>
       </w:r>
       <w:r>
-        <w:br/>
-        <w:t>The scale e.g. C Major , Eb Harmonic Minor</w:t>
-      </w:r>
-      <w:r>
-        <w:t xml:space="preserve"> </w:t>
-      </w:r>
-      <w:r>
-        <w:t xml:space="preserve"> is selected on the Settings page.</w:t>
-      </w:r>
-    </w:p>
-    <w:p>
-      <w:pPr>
-        <w:ind w:left="360"/>
+        <w:rPr>
+          <w:rStyle w:val="Heading6Char"/>
+          <w:b/>
+          <w:bCs/>
+        </w:rPr>
+        <w:br/>
+      </w:r>
+      <w:r>
+        <w:rPr>
+          <w:rStyle w:val="Heading6Char"/>
+          <w:i w:val="0"/>
+          <w:iCs w:val="0"/>
+        </w:rPr>
+        <w:t>Use the picker on the Settings page to select the scale.</w:t>
+      </w:r>
+      <w:r>
+        <w:rPr>
+          <w:rStyle w:val="Heading6Char"/>
+          <w:i w:val="0"/>
+          <w:iCs w:val="0"/>
+        </w:rPr>
+        <w:br/>
+      </w:r>
+    </w:p>
+    <w:p>
+      <w:pPr>
+        <w:pStyle w:val="ListParagraph"/>
+        <w:numPr>
+          <w:ilvl w:val="0"/>
+          <w:numId w:val="19"/>
+        </w:numPr>
       </w:pPr>
       <w:r>
         <w:rPr>
@@ -645,6 +583,10 @@
       <w:r>
         <w:t>Selected note range</w:t>
       </w:r>
+      <w:r>
+        <w:br/>
+        <w:t>Use the pickers on the Settings page to select the lowest and highest notes.</w:t>
+      </w:r>
     </w:p>
     <w:p>
       <w:pPr>
@@ -696,7 +638,7 @@
     </w:p>
     <w:p>
       <w:pPr>
-        <w:ind w:left="360"/>
+        <w:ind w:left="360" w:firstLine="360"/>
       </w:pPr>
       <w:r>
         <w:t xml:space="preserve">The threshold is controlled by </w:t>
@@ -706,33 +648,53 @@
           <w:b/>
           <w:bCs/>
         </w:rPr>
-        <w:t>“Omit notes at/above % correct.”</w:t>
-      </w:r>
-    </w:p>
-    <w:p>
-      <w:pPr>
-        <w:ind w:left="360"/>
-      </w:pPr>
-      <w:r>
-        <w:t>This uses the statistics shown on the Statistics page. Notes above the selected threshold are excluded (once played enough times).</w:t>
-      </w:r>
-    </w:p>
-    <w:p>
-      <w:pPr>
-        <w:ind w:left="360"/>
-        <w:rPr>
-          <w:i/>
-          <w:iCs/>
-        </w:rPr>
-      </w:pPr>
-      <w:r>
-        <w:t xml:space="preserve">A </w:t>
+        <w:t>“Omit notes at/above % correct”</w:t>
       </w:r>
       <w:r>
         <w:rPr>
           <w:b/>
           <w:bCs/>
         </w:rPr>
+        <w:t xml:space="preserve"> </w:t>
+      </w:r>
+      <w:r>
+        <w:t>which is set by a slider on the Settings page.</w:t>
+      </w:r>
+    </w:p>
+    <w:p>
+      <w:pPr>
+        <w:ind w:left="360" w:firstLine="360"/>
+      </w:pPr>
+      <w:r>
+        <w:t>This uses the statistics shown on the Statistics page. Notes above the selected threshold are excluded (once played enough times).</w:t>
+      </w:r>
+    </w:p>
+    <w:p>
+      <w:pPr>
+        <w:ind w:left="360" w:firstLine="360"/>
+      </w:pPr>
+      <w:r>
+        <w:t xml:space="preserve">“Enough times” is defined by </w:t>
+      </w:r>
+      <w:r>
+        <w:rPr>
+          <w:b/>
+          <w:bCs/>
+        </w:rPr>
+        <w:t xml:space="preserve">Minimum Correct Count </w:t>
+      </w:r>
+      <w:r>
+        <w:t>which is set by a slider of the Settings page.</w:t>
+      </w:r>
+    </w:p>
+    <w:p>
+      <w:pPr>
+        <w:ind w:left="360"/>
+      </w:pPr>
+      <w:r>
+        <w:t xml:space="preserve">A </w:t>
+      </w:r>
+      <w:r>
         <w:t>Repeat</w:t>
       </w:r>
       <w:r>
@@ -745,10 +707,29 @@
         </w:rPr>
         <w:t xml:space="preserve"> </w:t>
       </w:r>
-    </w:p>
-    <w:p>
-      <w:pPr>
-        <w:ind w:left="360"/>
+      <w:r>
+        <w:t>The delay time between repeats is set by a slider on the Advanced Page. Repeats happen when the button is green and not when it is brown.</w:t>
+      </w:r>
+      <w:r>
+        <w:br/>
+      </w:r>
+      <w:r>
+        <w:t xml:space="preserve">It is common for the number of notes in the random tune to become smaller and smaller with each repeat </w:t>
+      </w:r>
+      <w:r>
+        <w:t>as</w:t>
+      </w:r>
+      <w:r>
+        <w:t xml:space="preserve"> you  master more of them.</w:t>
+      </w:r>
+    </w:p>
+    <w:p>
+      <w:pPr>
+        <w:pStyle w:val="ListParagraph"/>
+        <w:numPr>
+          <w:ilvl w:val="0"/>
+          <w:numId w:val="19"/>
+        </w:numPr>
       </w:pPr>
       <w:r>
         <w:rPr>
@@ -769,33 +750,85 @@
         <w:t>This page displays a staff on he left and a tuner on the right. When you play a note it is drawn on the staff and its name is displayed on the right. For example if you play middle  C it will display C4. It will also display the deviation from the standard frequency in cents (100 cents = 1 semitone).</w:t>
       </w:r>
       <w:r>
-        <w:t xml:space="preserve"> The two </w:t>
-      </w:r>
-      <w:r>
-        <w:t>frequencies</w:t>
-      </w:r>
-      <w:r>
-        <w:t xml:space="preserve"> are also shown.</w:t>
-      </w:r>
-      <w:r>
-        <w:t xml:space="preserve"> The Key picker is not shown for the tuner.</w:t>
-      </w:r>
-    </w:p>
-    <w:p>
-      <w:r>
-        <w:rPr>
-          <w:rStyle w:val="Heading5Char"/>
-        </w:rPr>
-        <w:t>Buy Premium</w:t>
-      </w:r>
-      <w:r>
-        <w:br/>
-      </w:r>
-      <w:r>
-        <w:t>Allows you to purchase the Premium version, which unlocks additional features. Future improvements will be included at no additional cost.</w:t>
-      </w:r>
-      <w:r>
-        <w:t>.</w:t>
+        <w:t xml:space="preserve"> </w:t>
+      </w:r>
+      <w:r>
+        <w:br/>
+        <w:t>The frequency of the note that was heard and the frequency of the nearest standard note are shown.</w:t>
+      </w:r>
+      <w:r>
+        <w:br/>
+      </w:r>
+      <w:r>
+        <w:t>The Key picker is not shown</w:t>
+      </w:r>
+      <w:r>
+        <w:t>: the notes are written in the key of C.</w:t>
+      </w:r>
+    </w:p>
+    <w:p>
+      <w:pPr>
+        <w:ind w:left="360"/>
+      </w:pPr>
+    </w:p>
+    <w:p>
+      <w:pPr>
+        <w:pStyle w:val="Heading5"/>
+      </w:pPr>
+      <w:r>
+        <w:t>Auto Play</w:t>
+      </w:r>
+    </w:p>
+    <w:p>
+      <w:pPr>
+        <w:ind w:left="360"/>
+      </w:pPr>
+      <w:r>
+        <w:t>Tap the  triangular green button to make the phone play the notes. This helps you learn the sound of a scale. The button turns red while playing. As it plays the notes it also listens and displays feedback.</w:t>
+      </w:r>
+    </w:p>
+    <w:p>
+      <w:pPr>
+        <w:pStyle w:val="Heading5"/>
+      </w:pPr>
+      <w:r>
+        <w:t>Start / Stop Listening</w:t>
+      </w:r>
+    </w:p>
+    <w:p>
+      <w:pPr>
+        <w:ind w:left="360"/>
+      </w:pPr>
+      <w:r>
+        <w:t>•</w:t>
+      </w:r>
+      <w:r>
+        <w:tab/>
+        <w:t>Tap the circular green button  to make the phone listen to the notes that you play.</w:t>
+      </w:r>
+    </w:p>
+    <w:p>
+      <w:pPr>
+        <w:ind w:left="360"/>
+      </w:pPr>
+      <w:r>
+        <w:t>•</w:t>
+      </w:r>
+      <w:r>
+        <w:tab/>
+        <w:t>Feedback will begin when it hears the first note played correctly.</w:t>
+      </w:r>
+    </w:p>
+    <w:p>
+      <w:pPr>
+        <w:ind w:left="360"/>
+      </w:pPr>
+      <w:r>
+        <w:t>•</w:t>
+      </w:r>
+      <w:r>
+        <w:tab/>
+        <w:t>While listening  it becomes a red square. Tap this to stop listening.</w:t>
       </w:r>
     </w:p>
     <w:p>
@@ -807,25 +840,24 @@
       </w:r>
       <w:r>
         <w:br/>
-        <w:t>This displays a tool to select the background color of the staff panel. The same color is used for the background of other pages. You can scroll the tool up and down. When you see a color you like in the preview panel at the bottom left, tap the OK button and the tool will close.</w:t>
-      </w:r>
-    </w:p>
-    <w:p>
-      <w:r>
-        <w:rPr>
-          <w:rStyle w:val="Heading5Char"/>
-        </w:rPr>
-        <w:t>Reset Button</w:t>
-      </w:r>
-      <w:r>
-        <w:br/>
-        <w:t>A tap will make all settings revert to the factory default values.</w:t>
-      </w:r>
-    </w:p>
-    <w:p>
-      <w:pPr>
-        <w:pStyle w:val="Heading1"/>
-        <w:ind w:left="720" w:hanging="720"/>
+        <w:t xml:space="preserve">This displays a tool to select the background color of the staff panel. </w:t>
+      </w:r>
+      <w:r>
+        <w:t xml:space="preserve">It is done either by dragging the white circle to the color you want or by using the arrow buttons. There is a slider to adjust the whiteness. </w:t>
+      </w:r>
+      <w:r>
+        <w:t>The same color is used for the background</w:t>
+      </w:r>
+      <w:r>
+        <w:t>s</w:t>
+      </w:r>
+      <w:r>
+        <w:t xml:space="preserve"> of other pages. You can scroll the tool up and down. When you see a color you like in the preview panel at the bottom left, tap the OK button and the tool will close.</w:t>
+      </w:r>
+    </w:p>
+    <w:p>
+      <w:pPr>
+        <w:pStyle w:val="Heading2"/>
       </w:pPr>
       <w:r>
         <w:t>Settings Page</w:t>
@@ -959,8 +991,7 @@
     </w:p>
     <w:p>
       <w:pPr>
-        <w:pStyle w:val="Heading1"/>
-        <w:ind w:left="720" w:hanging="720"/>
+        <w:pStyle w:val="Heading2"/>
       </w:pPr>
       <w:r>
         <w:t>Statistics Page</w:t>
@@ -1245,7 +1276,7 @@
     </w:p>
     <w:p>
       <w:pPr>
-        <w:pStyle w:val="Heading1"/>
+        <w:pStyle w:val="Heading2"/>
       </w:pPr>
       <w:r>
         <w:t>Advanced Page</w:t>
@@ -1267,7 +1298,13 @@
       </w:r>
       <w:r>
         <w:br/>
-        <w:t>A note is considered correct if it is within this range.</w:t>
+        <w:t xml:space="preserve">A note is considered correct if it is within </w:t>
+      </w:r>
+      <w:r>
+        <w:t>the range of +/- the value selected.</w:t>
+      </w:r>
+      <w:r>
+        <w:t>.</w:t>
       </w:r>
     </w:p>
     <w:p>
@@ -1301,11 +1338,31 @@
           <w:b/>
           <w:bCs/>
         </w:rPr>
-        <w:t>Cooldown (ms)</w:t>
-      </w:r>
-      <w:r>
-        <w:br/>
-        <w:t>Prevents repeated detection of the same note.</w:t>
+        <w:t>Cooldown (m</w:t>
+      </w:r>
+      <w:r>
+        <w:rPr>
+          <w:b/>
+          <w:bCs/>
+        </w:rPr>
+        <w:t>illiseconds</w:t>
+      </w:r>
+      <w:r>
+        <w:rPr>
+          <w:b/>
+          <w:bCs/>
+        </w:rPr>
+        <w:t>)</w:t>
+      </w:r>
+      <w:r>
+        <w:br/>
+        <w:t xml:space="preserve">Prevents </w:t>
+      </w:r>
+      <w:r>
+        <w:t xml:space="preserve">accidental </w:t>
+      </w:r>
+      <w:r>
+        <w:t>repeated detection of the same note.</w:t>
       </w:r>
     </w:p>
     <w:p>
@@ -1324,7 +1381,19 @@
       </w:r>
       <w:r>
         <w:br/>
-        <w:t>Adjusts for systematic pitch detection error.</w:t>
+        <w:t xml:space="preserve">Adjusts for </w:t>
+      </w:r>
+      <w:r>
+        <w:t xml:space="preserve">any </w:t>
+      </w:r>
+      <w:r>
+        <w:t>systematic pitch detection error</w:t>
+      </w:r>
+      <w:r>
+        <w:t xml:space="preserve"> </w:t>
+      </w:r>
+      <w:r>
+        <w:t>.</w:t>
       </w:r>
     </w:p>
     <w:p>
@@ -1349,15 +1418,133 @@
         <w:t xml:space="preserve"> </w:t>
       </w:r>
       <w:r>
-        <w:t>This delay time is so you can glance at the session summary in the title bar. It is common for the number of notes in the random tune to become smaller and smaller with each repeat because you have mastered more of them.</w:t>
-      </w:r>
-      <w:r>
-        <w:t>.</w:t>
-      </w:r>
-    </w:p>
-    <w:p>
-      <w:pPr>
-        <w:pStyle w:val="Heading1"/>
+        <w:t xml:space="preserve">This delay time is so you can glance at the session summary in the title bar. </w:t>
+      </w:r>
+    </w:p>
+    <w:p>
+      <w:pPr>
+        <w:pStyle w:val="ListParagraph"/>
+        <w:numPr>
+          <w:ilvl w:val="0"/>
+          <w:numId w:val="17"/>
+        </w:numPr>
+        <w:rPr>
+          <w:b/>
+          <w:bCs/>
+        </w:rPr>
+      </w:pPr>
+      <w:r>
+        <w:rPr>
+          <w:b/>
+          <w:bCs/>
+        </w:rPr>
+        <w:t>Wrong Debounce (miliseconds)</w:t>
+      </w:r>
+      <w:r>
+        <w:br/>
+      </w:r>
+      <w:r>
+        <w:t>Prevents rapid repeated ‘wrong’ increments for the same expected note by ignoring subsequent wrong detections until the debounce interval elapses (default 300 ms). Increase the value to avoid noise or transient detections being counted as multiple mistakes; decrease it for more sensitive scoring</w:t>
+      </w:r>
+      <w:r>
+        <w:br/>
+      </w:r>
+    </w:p>
+    <w:p>
+      <w:pPr>
+        <w:pStyle w:val="ListParagraph"/>
+        <w:numPr>
+          <w:ilvl w:val="0"/>
+          <w:numId w:val="17"/>
+        </w:numPr>
+        <w:rPr>
+          <w:b/>
+          <w:bCs/>
+        </w:rPr>
+      </w:pPr>
+      <w:r>
+        <w:rPr>
+          <w:b/>
+          <w:bCs/>
+        </w:rPr>
+        <w:t xml:space="preserve"> </w:t>
+      </w:r>
+      <w:r>
+        <w:rPr>
+          <w:b/>
+          <w:bCs/>
+        </w:rPr>
+        <w:t>Pitch Window Size</w:t>
+      </w:r>
+      <w:r>
+        <w:br/>
+      </w:r>
+      <w:r>
+        <w:t xml:space="preserve">This is </w:t>
+      </w:r>
+      <w:r>
+        <w:t xml:space="preserve">the maximum number of audio samples the detector may use when measuring pitch. A larger window improves frequency resolution and stability (important for low notes), but increases detection latency and CPU work; a smaller window gives faster updates but can cause octave/instability errors and less accurate cents </w:t>
+      </w:r>
+      <w:r>
+        <w:t>values.</w:t>
+      </w:r>
+      <w:r>
+        <w:br/>
+      </w:r>
+    </w:p>
+    <w:p>
+      <w:pPr>
+        <w:pStyle w:val="ListParagraph"/>
+        <w:numPr>
+          <w:ilvl w:val="0"/>
+          <w:numId w:val="17"/>
+        </w:numPr>
+        <w:rPr>
+          <w:b/>
+          <w:bCs/>
+        </w:rPr>
+      </w:pPr>
+      <w:r>
+        <w:rPr>
+          <w:b/>
+          <w:bCs/>
+        </w:rPr>
+        <w:t>Smoothing Window</w:t>
+      </w:r>
+      <w:r>
+        <w:br/>
+      </w:r>
+      <w:r>
+        <w:t>The smoothing window controls how many recent pitch detections the app keeps and takes the median of (see SmoothPitch(double)). A larger window reduces jitter and filters out transient outliers, at the cost of slower reaction to real pitch changes; a smaller window gives faster updates but is more noisy.</w:t>
+      </w:r>
+      <w:r>
+        <w:br/>
+      </w:r>
+      <w:r>
+        <w:br/>
+      </w:r>
+      <w:r>
+        <w:rPr>
+          <w:rStyle w:val="Heading5Char"/>
+        </w:rPr>
+        <w:t>Reset Button</w:t>
+      </w:r>
+      <w:r>
+        <w:br/>
+        <w:t>A tap will make all settings revert to the factory default values.</w:t>
+      </w:r>
+    </w:p>
+    <w:p>
+      <w:pPr>
+        <w:numPr>
+          <w:ilvl w:val="0"/>
+          <w:numId w:val="17"/>
+        </w:numPr>
+      </w:pPr>
+    </w:p>
+    <w:p>
+      <w:pPr>
+        <w:pStyle w:val="Heading2"/>
       </w:pPr>
       <w:r>
         <w:t>About Page</w:t>
@@ -1370,20 +1557,51 @@
     </w:p>
     <w:p>
       <w:pPr>
-        <w:pStyle w:val="Heading1"/>
-      </w:pPr>
-      <w:r>
-        <w:t>Tuner Page</w:t>
-      </w:r>
-    </w:p>
-    <w:p>
-      <w:r>
-        <w:t>This simply opens the Home page with the Tuner “tune” selected.</w:t>
-      </w:r>
-    </w:p>
-    <w:p>
-      <w:pPr>
-        <w:pStyle w:val="Heading1"/>
+        <w:pStyle w:val="Heading2"/>
+      </w:pPr>
+      <w:r>
+        <w:t>Premium Version</w:t>
+      </w:r>
+    </w:p>
+    <w:p>
+      <w:r>
+        <w:t>Certain items such as Accidentals and keys with more that 3 sharps or flats are available only in the paid Premium version.</w:t>
+      </w:r>
+    </w:p>
+    <w:p>
+      <w:pPr>
+        <w:pStyle w:val="Heading3"/>
+      </w:pPr>
+      <w:r>
+        <w:t>Popup</w:t>
+      </w:r>
+    </w:p>
+    <w:p>
+      <w:r>
+        <w:t xml:space="preserve">If you try to set </w:t>
+      </w:r>
+      <w:r>
+        <w:t>something that is available only in the Premium version</w:t>
+      </w:r>
+      <w:r>
+        <w:t xml:space="preserve"> then a window will pop up</w:t>
+      </w:r>
+      <w:r>
+        <w:t xml:space="preserve">. The window has </w:t>
+      </w:r>
+      <w:r>
+        <w:t>two buttons. One is to buy a lifetime Premium version with free automatic updates</w:t>
+      </w:r>
+      <w:r>
+        <w:t xml:space="preserve"> for ever</w:t>
+      </w:r>
+      <w:r>
+        <w:t>. The other is to skip and use the default value of whatever you were trying to change.</w:t>
+      </w:r>
+    </w:p>
+    <w:p>
+      <w:pPr>
+        <w:pStyle w:val="Heading2"/>
       </w:pPr>
       <w:r>
         <w:t>L</w:t>
@@ -1490,7 +1708,7 @@
 <w:numbering xmlns:wpc="http://schemas.microsoft.com/office/word/2010/wordprocessingCanvas" xmlns:cx="http://schemas.microsoft.com/office/drawing/2014/chartex" xmlns:cx1="http://schemas.microsoft.com/office/drawing/2015/9/8/chartex" xmlns:cx2="http://schemas.microsoft.com/office/drawing/2015/10/21/chartex" xmlns:cx3="http://schemas.microsoft.com/office/drawing/2016/5/9/chartex" xmlns:cx4="http://schemas.microsoft.com/office/drawing/2016/5/10/chartex" xmlns:cx5="http://schemas.microsoft.com/office/drawing/2016/5/11/chartex" xmlns:cx6="http://schemas.microsoft.com/office/drawing/2016/5/12/chartex" xmlns:cx7="http://schemas.microsoft.com/office/drawing/2016/5/13/chartex" xmlns:cx8="http://schemas.microsoft.com/office/drawing/2016/5/14/chartex" xmlns:mc="http://schemas.openxmlformats.org/markup-compatibility/2006" xmlns:aink="http://schemas.microsoft.com/office/drawing/2016/ink" xmlns:am3d="http://schemas.microsoft.com/office/drawing/2017/model3d" xmlns:o="urn:schemas-microsoft-com:office:office" xmlns:oel="http://schemas.microsoft.com/office/2019/extlst" xmlns:r="http://schemas.openxmlformats.org/officeDocument/2006/relationships" xmlns:m="http://schemas.openxmlformats.org/officeDocument/2006/math" xmlns:v="urn:schemas-microsoft-com:vml" xmlns:wp14="http://schemas.microsoft.com/office/word/2010/wordprocessingDrawing" xmlns:wp="http://schemas.openxmlformats.org/drawingml/2006/wordprocessingDrawing" xmlns:w10="urn:schemas-microsoft-com:office:word" xmlns:w="http://schemas.openxmlformats.org/wordprocessingml/2006/main" xmlns:w14="http://schemas.microsoft.com/office/word/2010/wordml" xmlns:w15="http://schemas.microsoft.com/office/word/2012/wordml" xmlns:w16cex="http://schemas.microsoft.com/office/word/2018/wordml/cex" xmlns:w16cid="http://schemas.microsoft.com/office/word/2016/wordml/cid" xmlns:w16="http://schemas.microsoft.com/office/word/2018/wordml" xmlns:w16du="http://schemas.microsoft.com/office/word/2023/wordml/word16du" xmlns:w16sdtdh="http://schemas.microsoft.com/office/word/2020/wordml/sdtdatahash" xmlns:w16sdtfl="http://schemas.microsoft.com/office/word/2024/wordml/sdtformatlock" xmlns:w16se="http://schemas.microsoft.com/office/word/2015/wordml/symex" xmlns:wpg="http://schemas.microsoft.com/office/word/2010/wordprocessingGroup" xmlns:wpi="http://schemas.microsoft.com/office/word/2010/wordprocessingInk" xmlns:wne="http://schemas.microsoft.com/office/word/2006/wordml" xmlns:wps="http://schemas.microsoft.com/office/word/2010/wordprocessingShape" mc:Ignorable="w14 w15 w16se w16cid w16 w16cex w16sdtdh w16sdtfl w16du wp14">
   <w:numPicBullet w:numPicBulletId="0">
     <w:pict>
-      <v:rect id="_x0000_i1034" style="width:0;height:1.5pt" o:hralign="center" o:bullet="t" o:hrstd="t" o:hr="t" fillcolor="#a0a0a0" stroked="f"/>
+      <v:rect id="_x0000_i1238" style="width:0;height:1.5pt" o:hralign="center" o:bullet="t" o:hrstd="t" o:hr="t" fillcolor="#a0a0a0" stroked="f"/>
     </w:pict>
   </w:numPicBullet>
   <w:abstractNum w:abstractNumId="0" w15:restartNumberingAfterBreak="0">
@@ -1779,6 +1997,98 @@
     </w:lvl>
   </w:abstractNum>
   <w:abstractNum w:abstractNumId="3" w15:restartNumberingAfterBreak="0">
+    <w:nsid w:val="0E9B1465"/>
+    <w:multiLevelType w:val="hybridMultilevel"/>
+    <w:tmpl w:val="1B946D9C"/>
+    <w:lvl w:ilvl="0" w:tplc="A5C85542">
+      <w:start w:val="1"/>
+      <w:numFmt w:val="decimal"/>
+      <w:lvlText w:val="%1."/>
+      <w:lvlJc w:val="left"/>
+      <w:pPr>
+        <w:ind w:left="720" w:hanging="360"/>
+      </w:pPr>
+      <w:rPr>
+        <w:rFonts w:eastAsiaTheme="majorEastAsia" w:cstheme="majorBidi" w:hint="default"/>
+        <w:b/>
+        <w:i/>
+        <w:color w:val="595959" w:themeColor="text1" w:themeTint="A6"/>
+      </w:rPr>
+    </w:lvl>
+    <w:lvl w:ilvl="1" w:tplc="04090019">
+      <w:start w:val="1"/>
+      <w:numFmt w:val="lowerLetter"/>
+      <w:lvlText w:val="%2."/>
+      <w:lvlJc w:val="left"/>
+      <w:pPr>
+        <w:ind w:left="1440" w:hanging="360"/>
+      </w:pPr>
+    </w:lvl>
+    <w:lvl w:ilvl="2" w:tplc="0409001B" w:tentative="1">
+      <w:start w:val="1"/>
+      <w:numFmt w:val="lowerRoman"/>
+      <w:lvlText w:val="%3."/>
+      <w:lvlJc w:val="right"/>
+      <w:pPr>
+        <w:ind w:left="2160" w:hanging="180"/>
+      </w:pPr>
+    </w:lvl>
+    <w:lvl w:ilvl="3" w:tplc="0409000F" w:tentative="1">
+      <w:start w:val="1"/>
+      <w:numFmt w:val="decimal"/>
+      <w:lvlText w:val="%4."/>
+      <w:lvlJc w:val="left"/>
+      <w:pPr>
+        <w:ind w:left="2880" w:hanging="360"/>
+      </w:pPr>
+    </w:lvl>
+    <w:lvl w:ilvl="4" w:tplc="04090019" w:tentative="1">
+      <w:start w:val="1"/>
+      <w:numFmt w:val="lowerLetter"/>
+      <w:lvlText w:val="%5."/>
+      <w:lvlJc w:val="left"/>
+      <w:pPr>
+        <w:ind w:left="3600" w:hanging="360"/>
+      </w:pPr>
+    </w:lvl>
+    <w:lvl w:ilvl="5" w:tplc="0409001B" w:tentative="1">
+      <w:start w:val="1"/>
+      <w:numFmt w:val="lowerRoman"/>
+      <w:lvlText w:val="%6."/>
+      <w:lvlJc w:val="right"/>
+      <w:pPr>
+        <w:ind w:left="4320" w:hanging="180"/>
+      </w:pPr>
+    </w:lvl>
+    <w:lvl w:ilvl="6" w:tplc="0409000F" w:tentative="1">
+      <w:start w:val="1"/>
+      <w:numFmt w:val="decimal"/>
+      <w:lvlText w:val="%7."/>
+      <w:lvlJc w:val="left"/>
+      <w:pPr>
+        <w:ind w:left="5040" w:hanging="360"/>
+      </w:pPr>
+    </w:lvl>
+    <w:lvl w:ilvl="7" w:tplc="04090019" w:tentative="1">
+      <w:start w:val="1"/>
+      <w:numFmt w:val="lowerLetter"/>
+      <w:lvlText w:val="%8."/>
+      <w:lvlJc w:val="left"/>
+      <w:pPr>
+        <w:ind w:left="5760" w:hanging="360"/>
+      </w:pPr>
+    </w:lvl>
+    <w:lvl w:ilvl="8" w:tplc="0409001B" w:tentative="1">
+      <w:start w:val="1"/>
+      <w:numFmt w:val="lowerRoman"/>
+      <w:lvlText w:val="%9."/>
+      <w:lvlJc w:val="right"/>
+      <w:pPr>
+        <w:ind w:left="6480" w:hanging="180"/>
+      </w:pPr>
+    </w:lvl>
+  </w:abstractNum>
+  <w:abstractNum w:abstractNumId="4" w15:restartNumberingAfterBreak="0">
     <w:nsid w:val="131A0397"/>
     <w:multiLevelType w:val="hybridMultilevel"/>
     <w:tmpl w:val="4EC66576"/>
@@ -1867,7 +2177,7 @@
       </w:pPr>
     </w:lvl>
   </w:abstractNum>
-  <w:abstractNum w:abstractNumId="4" w15:restartNumberingAfterBreak="0">
+  <w:abstractNum w:abstractNumId="5" w15:restartNumberingAfterBreak="0">
     <w:nsid w:val="1D480B7A"/>
     <w:multiLevelType w:val="hybridMultilevel"/>
     <w:tmpl w:val="2DDCB92C"/>
@@ -1956,7 +2266,7 @@
       </w:pPr>
     </w:lvl>
   </w:abstractNum>
-  <w:abstractNum w:abstractNumId="5" w15:restartNumberingAfterBreak="0">
+  <w:abstractNum w:abstractNumId="6" w15:restartNumberingAfterBreak="0">
     <w:nsid w:val="256247E6"/>
     <w:multiLevelType w:val="multilevel"/>
     <w:tmpl w:val="23607832"/>
@@ -2105,7 +2415,7 @@
       </w:rPr>
     </w:lvl>
   </w:abstractNum>
-  <w:abstractNum w:abstractNumId="6" w15:restartNumberingAfterBreak="0">
+  <w:abstractNum w:abstractNumId="7" w15:restartNumberingAfterBreak="0">
     <w:nsid w:val="2C817F10"/>
     <w:multiLevelType w:val="hybridMultilevel"/>
     <w:tmpl w:val="9F3A057E"/>
@@ -2218,7 +2528,7 @@
       </w:rPr>
     </w:lvl>
   </w:abstractNum>
-  <w:abstractNum w:abstractNumId="7" w15:restartNumberingAfterBreak="0">
+  <w:abstractNum w:abstractNumId="8" w15:restartNumberingAfterBreak="0">
     <w:nsid w:val="352F1942"/>
     <w:multiLevelType w:val="multilevel"/>
     <w:tmpl w:val="04090029"/>
@@ -2313,7 +2623,7 @@
       </w:pPr>
     </w:lvl>
   </w:abstractNum>
-  <w:abstractNum w:abstractNumId="8" w15:restartNumberingAfterBreak="0">
+  <w:abstractNum w:abstractNumId="9" w15:restartNumberingAfterBreak="0">
     <w:nsid w:val="38BD5EEB"/>
     <w:multiLevelType w:val="hybridMultilevel"/>
     <w:tmpl w:val="6D2CB15C"/>
@@ -2426,7 +2736,7 @@
       </w:rPr>
     </w:lvl>
   </w:abstractNum>
-  <w:abstractNum w:abstractNumId="9" w15:restartNumberingAfterBreak="0">
+  <w:abstractNum w:abstractNumId="10" w15:restartNumberingAfterBreak="0">
     <w:nsid w:val="3E0875A5"/>
     <w:multiLevelType w:val="hybridMultilevel"/>
     <w:tmpl w:val="FD4609E4"/>
@@ -2539,7 +2849,7 @@
       </w:rPr>
     </w:lvl>
   </w:abstractNum>
-  <w:abstractNum w:abstractNumId="10" w15:restartNumberingAfterBreak="0">
+  <w:abstractNum w:abstractNumId="11" w15:restartNumberingAfterBreak="0">
     <w:nsid w:val="45BC0D7B"/>
     <w:multiLevelType w:val="multilevel"/>
     <w:tmpl w:val="CF6E252E"/>
@@ -2688,7 +2998,7 @@
       </w:rPr>
     </w:lvl>
   </w:abstractNum>
-  <w:abstractNum w:abstractNumId="11" w15:restartNumberingAfterBreak="0">
+  <w:abstractNum w:abstractNumId="12" w15:restartNumberingAfterBreak="0">
     <w:nsid w:val="47A66E76"/>
     <w:multiLevelType w:val="hybridMultilevel"/>
     <w:tmpl w:val="C8E48CD4"/>
@@ -2774,7 +3084,7 @@
       </w:pPr>
     </w:lvl>
   </w:abstractNum>
-  <w:abstractNum w:abstractNumId="12" w15:restartNumberingAfterBreak="0">
+  <w:abstractNum w:abstractNumId="13" w15:restartNumberingAfterBreak="0">
     <w:nsid w:val="4D283443"/>
     <w:multiLevelType w:val="hybridMultilevel"/>
     <w:tmpl w:val="452884C4"/>
@@ -2860,7 +3170,7 @@
       </w:pPr>
     </w:lvl>
   </w:abstractNum>
-  <w:abstractNum w:abstractNumId="13" w15:restartNumberingAfterBreak="0">
+  <w:abstractNum w:abstractNumId="14" w15:restartNumberingAfterBreak="0">
     <w:nsid w:val="50BB63CB"/>
     <w:multiLevelType w:val="multilevel"/>
     <w:tmpl w:val="4CD61E78"/>
@@ -3009,7 +3319,7 @@
       </w:rPr>
     </w:lvl>
   </w:abstractNum>
-  <w:abstractNum w:abstractNumId="14" w15:restartNumberingAfterBreak="0">
+  <w:abstractNum w:abstractNumId="15" w15:restartNumberingAfterBreak="0">
     <w:nsid w:val="59F83880"/>
     <w:multiLevelType w:val="multilevel"/>
     <w:tmpl w:val="4A14771A"/>
@@ -3122,7 +3432,7 @@
       </w:rPr>
     </w:lvl>
   </w:abstractNum>
-  <w:abstractNum w:abstractNumId="15" w15:restartNumberingAfterBreak="0">
+  <w:abstractNum w:abstractNumId="16" w15:restartNumberingAfterBreak="0">
     <w:nsid w:val="5ACD3B66"/>
     <w:multiLevelType w:val="multilevel"/>
     <w:tmpl w:val="EF5C2BE4"/>
@@ -3271,7 +3581,7 @@
       </w:rPr>
     </w:lvl>
   </w:abstractNum>
-  <w:abstractNum w:abstractNumId="16" w15:restartNumberingAfterBreak="0">
+  <w:abstractNum w:abstractNumId="17" w15:restartNumberingAfterBreak="0">
     <w:nsid w:val="71EA71CB"/>
     <w:multiLevelType w:val="multilevel"/>
     <w:tmpl w:val="04090025"/>
@@ -3361,7 +3671,7 @@
       </w:pPr>
     </w:lvl>
   </w:abstractNum>
-  <w:abstractNum w:abstractNumId="17" w15:restartNumberingAfterBreak="0">
+  <w:abstractNum w:abstractNumId="18" w15:restartNumberingAfterBreak="0">
     <w:nsid w:val="7D6F578B"/>
     <w:multiLevelType w:val="multilevel"/>
     <w:tmpl w:val="6CB82E4A"/>
@@ -3511,58 +3821,61 @@
     </w:lvl>
   </w:abstractNum>
   <w:num w:numId="1" w16cid:durableId="560022226">
-    <w:abstractNumId w:val="11"/>
+    <w:abstractNumId w:val="12"/>
   </w:num>
   <w:num w:numId="2" w16cid:durableId="1338583267">
-    <w:abstractNumId w:val="12"/>
+    <w:abstractNumId w:val="13"/>
   </w:num>
   <w:num w:numId="3" w16cid:durableId="388922589">
     <w:abstractNumId w:val="2"/>
   </w:num>
   <w:num w:numId="4" w16cid:durableId="37245864">
-    <w:abstractNumId w:val="3"/>
+    <w:abstractNumId w:val="4"/>
   </w:num>
   <w:num w:numId="5" w16cid:durableId="1714962856">
-    <w:abstractNumId w:val="4"/>
+    <w:abstractNumId w:val="5"/>
   </w:num>
   <w:num w:numId="6" w16cid:durableId="1235704933">
-    <w:abstractNumId w:val="14"/>
+    <w:abstractNumId w:val="15"/>
   </w:num>
   <w:num w:numId="7" w16cid:durableId="1363558530">
-    <w:abstractNumId w:val="16"/>
+    <w:abstractNumId w:val="17"/>
   </w:num>
   <w:num w:numId="8" w16cid:durableId="1144270835">
-    <w:abstractNumId w:val="7"/>
+    <w:abstractNumId w:val="8"/>
   </w:num>
   <w:num w:numId="9" w16cid:durableId="1199663871">
     <w:abstractNumId w:val="1"/>
   </w:num>
   <w:num w:numId="10" w16cid:durableId="615018184">
-    <w:abstractNumId w:val="8"/>
+    <w:abstractNumId w:val="9"/>
   </w:num>
   <w:num w:numId="11" w16cid:durableId="1381516884">
-    <w:abstractNumId w:val="9"/>
+    <w:abstractNumId w:val="10"/>
   </w:num>
   <w:num w:numId="12" w16cid:durableId="1231577332">
-    <w:abstractNumId w:val="6"/>
+    <w:abstractNumId w:val="7"/>
   </w:num>
   <w:num w:numId="13" w16cid:durableId="1893345192">
     <w:abstractNumId w:val="0"/>
   </w:num>
   <w:num w:numId="14" w16cid:durableId="294877085">
-    <w:abstractNumId w:val="17"/>
+    <w:abstractNumId w:val="18"/>
   </w:num>
   <w:num w:numId="15" w16cid:durableId="1284069764">
-    <w:abstractNumId w:val="10"/>
+    <w:abstractNumId w:val="11"/>
   </w:num>
   <w:num w:numId="16" w16cid:durableId="1210915484">
-    <w:abstractNumId w:val="5"/>
+    <w:abstractNumId w:val="6"/>
   </w:num>
   <w:num w:numId="17" w16cid:durableId="387806322">
-    <w:abstractNumId w:val="13"/>
+    <w:abstractNumId w:val="14"/>
   </w:num>
   <w:num w:numId="18" w16cid:durableId="230040111">
-    <w:abstractNumId w:val="15"/>
+    <w:abstractNumId w:val="16"/>
+  </w:num>
+  <w:num w:numId="19" w16cid:durableId="466627318">
+    <w:abstractNumId w:val="3"/>
   </w:num>
 </w:numbering>
 </file>
@@ -3967,7 +4280,7 @@
   <w:style w:type="paragraph" w:default="1" w:styleId="Normal">
     <w:name w:val="Normal"/>
     <w:qFormat/>
-    <w:rsid w:val="00D5786E"/>
+    <w:rsid w:val="004A2CCA"/>
     <w:pPr>
       <w:spacing w:line="240" w:lineRule="auto"/>
     </w:pPr>
@@ -3982,11 +4295,11 @@
     <w:link w:val="Heading1Char"/>
     <w:uiPriority w:val="9"/>
     <w:qFormat/>
-    <w:rsid w:val="00AA55A1"/>
+    <w:rsid w:val="004A2CCA"/>
     <w:pPr>
       <w:keepNext/>
       <w:keepLines/>
-      <w:spacing w:before="240" w:after="120"/>
+      <w:spacing w:before="240" w:after="120" w:line="240" w:lineRule="auto"/>
       <w:outlineLvl w:val="0"/>
     </w:pPr>
     <w:rPr>
@@ -4004,19 +4317,19 @@
     <w:uiPriority w:val="9"/>
     <w:unhideWhenUsed/>
     <w:qFormat/>
-    <w:rsid w:val="00AA55A1"/>
+    <w:rsid w:val="00B20643"/>
     <w:pPr>
       <w:numPr>
         <w:ilvl w:val="1"/>
       </w:numPr>
-      <w:spacing w:before="200" w:after="80"/>
+      <w:spacing w:before="200" w:after="80" w:line="240" w:lineRule="auto"/>
       <w:outlineLvl w:val="1"/>
     </w:pPr>
     <w:rPr>
       <w:rFonts w:ascii="Calibri" w:eastAsiaTheme="majorEastAsia" w:hAnsi="Calibri" w:cstheme="majorBidi"/>
       <w:b/>
       <w:color w:val="2F5496" w:themeColor="accent1" w:themeShade="BF"/>
-      <w:sz w:val="44"/>
+      <w:sz w:val="40"/>
       <w:szCs w:val="32"/>
     </w:rPr>
   </w:style>
@@ -4027,7 +4340,7 @@
     <w:uiPriority w:val="9"/>
     <w:unhideWhenUsed/>
     <w:qFormat/>
-    <w:rsid w:val="00D5786E"/>
+    <w:rsid w:val="00E1525C"/>
     <w:pPr>
       <w:numPr>
         <w:ilvl w:val="2"/>
@@ -4039,9 +4352,8 @@
       <w:rFonts w:ascii="Calibri" w:eastAsiaTheme="majorEastAsia" w:hAnsi="Calibri" w:cstheme="majorBidi"/>
       <w:b/>
       <w:color w:val="2F5496" w:themeColor="accent1" w:themeShade="BF"/>
-      <w:sz w:val="40"/>
+      <w:sz w:val="32"/>
       <w:szCs w:val="28"/>
-      <w:u w:val="single"/>
     </w:rPr>
   </w:style>
   <w:style w:type="paragraph" w:styleId="Heading4">
@@ -4062,7 +4374,6 @@
     </w:pPr>
     <w:rPr>
       <w:iCs/>
-      <w:sz w:val="32"/>
     </w:rPr>
   </w:style>
   <w:style w:type="paragraph" w:styleId="Heading5">
@@ -4195,7 +4506,6 @@
   <w:style w:type="character" w:default="1" w:styleId="DefaultParagraphFont">
     <w:name w:val="Default Paragraph Font"/>
     <w:uiPriority w:val="1"/>
-    <w:semiHidden/>
     <w:unhideWhenUsed/>
   </w:style>
   <w:style w:type="table" w:default="1" w:styleId="TableNormal">
@@ -4224,7 +4534,7 @@
     <w:basedOn w:val="DefaultParagraphFont"/>
     <w:link w:val="Heading1"/>
     <w:uiPriority w:val="9"/>
-    <w:rsid w:val="00AA55A1"/>
+    <w:rsid w:val="004A2CCA"/>
     <w:rPr>
       <w:rFonts w:eastAsiaTheme="majorEastAsia" w:cstheme="majorBidi"/>
       <w:b/>
@@ -4238,12 +4548,12 @@
     <w:basedOn w:val="DefaultParagraphFont"/>
     <w:link w:val="Heading2"/>
     <w:uiPriority w:val="9"/>
-    <w:rsid w:val="00AA55A1"/>
+    <w:rsid w:val="00B20643"/>
     <w:rPr>
       <w:rFonts w:ascii="Calibri" w:eastAsiaTheme="majorEastAsia" w:hAnsi="Calibri" w:cstheme="majorBidi"/>
       <w:b/>
       <w:color w:val="2F5496" w:themeColor="accent1" w:themeShade="BF"/>
-      <w:sz w:val="44"/>
+      <w:sz w:val="40"/>
       <w:szCs w:val="32"/>
     </w:rPr>
   </w:style>
@@ -4252,14 +4562,13 @@
     <w:basedOn w:val="DefaultParagraphFont"/>
     <w:link w:val="Heading3"/>
     <w:uiPriority w:val="9"/>
-    <w:rsid w:val="00D5786E"/>
+    <w:rsid w:val="00E1525C"/>
     <w:rPr>
       <w:rFonts w:ascii="Calibri" w:eastAsiaTheme="majorEastAsia" w:hAnsi="Calibri" w:cstheme="majorBidi"/>
       <w:b/>
       <w:color w:val="2F5496" w:themeColor="accent1" w:themeShade="BF"/>
-      <w:sz w:val="40"/>
+      <w:sz w:val="32"/>
       <w:szCs w:val="28"/>
-      <w:u w:val="single"/>
     </w:rPr>
   </w:style>
   <w:style w:type="character" w:customStyle="1" w:styleId="Heading4Char">

</xml_diff>

<commit_message>
Before using combined scale and tune in session database.
</commit_message>
<xml_diff>
--- a/About.docx
+++ b/About.docx
@@ -422,6 +422,11 @@
       </w:r>
     </w:p>
     <w:p>
+      <w:r>
+        <w:t>Some of the pickers have long lists. Flick to scroll quickly.</w:t>
+      </w:r>
+    </w:p>
+    <w:p>
       <w:pPr>
         <w:pStyle w:val="Heading5"/>
       </w:pPr>
@@ -447,13 +452,7 @@
     </w:p>
     <w:p>
       <w:r>
-        <w:t xml:space="preserve">Select </w:t>
-      </w:r>
-      <w:r>
-        <w:t xml:space="preserve"> the key signature (transposed for your instrument)</w:t>
-      </w:r>
-      <w:r>
-        <w:t xml:space="preserve"> in which you want the music </w:t>
+        <w:t xml:space="preserve">Select  the key signature (transposed for your instrument) in which you want the music </w:t>
       </w:r>
       <w:r>
         <w:t>to be written.</w:t>
@@ -461,31 +460,24 @@
       <w:r>
         <w:t xml:space="preserve"> This picker is not always visible.</w:t>
       </w:r>
+      <w:r>
+        <w:t xml:space="preserve"> (Flick to scroll quickly).</w:t>
+      </w:r>
     </w:p>
     <w:p>
       <w:pPr>
         <w:pStyle w:val="Heading5"/>
       </w:pPr>
       <w:r>
-        <w:t>Name of selected Scale</w:t>
-      </w:r>
-    </w:p>
-    <w:p>
-      <w:r>
-        <w:t>This could be Major, Minor and etc.</w:t>
-      </w:r>
-    </w:p>
-    <w:p>
-      <w:pPr>
-        <w:pStyle w:val="Heading5"/>
-      </w:pPr>
-      <w:r>
         <w:t>Concert Key</w:t>
       </w:r>
     </w:p>
     <w:p>
       <w:r>
-        <w:t>This is automatically displayed when you pick a key.</w:t>
+        <w:t>This is automatically displayed when you pick a key</w:t>
+      </w:r>
+      <w:r>
+        <w:t xml:space="preserve"> (other than C).</w:t>
       </w:r>
     </w:p>
     <w:p>
@@ -496,8 +488,16 @@
         <w:t>Tune</w:t>
       </w:r>
       <w:r>
-        <w:br/>
-        <w:t>Pick one of three “tunes”</w:t>
+        <w:rPr>
+          <w:rStyle w:val="Heading5Char"/>
+        </w:rPr>
+        <w:t xml:space="preserve"> and Scale</w:t>
+      </w:r>
+      <w:r>
+        <w:rPr>
+          <w:rStyle w:val="Heading5Char"/>
+        </w:rPr>
+        <w:t>s</w:t>
       </w:r>
     </w:p>
     <w:p>
@@ -507,6 +507,11 @@
           <w:ilvl w:val="0"/>
           <w:numId w:val="19"/>
         </w:numPr>
+        <w:rPr>
+          <w:rStyle w:val="Heading6Char"/>
+          <w:i w:val="0"/>
+          <w:iCs w:val="0"/>
+        </w:rPr>
       </w:pPr>
       <w:r>
         <w:rPr>
@@ -514,7 +519,7 @@
           <w:b/>
           <w:bCs/>
         </w:rPr>
-        <w:t>Selected Scale</w:t>
+        <w:t>Tuner</w:t>
       </w:r>
       <w:r>
         <w:rPr>
@@ -530,7 +535,86 @@
           <w:i w:val="0"/>
           <w:iCs w:val="0"/>
         </w:rPr>
-        <w:t>Use the picker on the Settings page to select the scale.</w:t>
+        <w:t xml:space="preserve">Listens to whatever you </w:t>
+      </w:r>
+      <w:r>
+        <w:rPr>
+          <w:rStyle w:val="Heading6Char"/>
+          <w:i w:val="0"/>
+          <w:iCs w:val="0"/>
+        </w:rPr>
+        <w:t>play</w:t>
+      </w:r>
+      <w:r>
+        <w:rPr>
+          <w:rStyle w:val="Heading6Char"/>
+          <w:i w:val="0"/>
+          <w:iCs w:val="0"/>
+        </w:rPr>
+        <w:t xml:space="preserve">. </w:t>
+      </w:r>
+      <w:r>
+        <w:rPr>
+          <w:rStyle w:val="Heading6Char"/>
+          <w:i w:val="0"/>
+          <w:iCs w:val="0"/>
+        </w:rPr>
+        <w:t xml:space="preserve"> </w:t>
+      </w:r>
+      <w:r>
+        <w:rPr>
+          <w:rStyle w:val="Heading6Char"/>
+          <w:i w:val="0"/>
+          <w:iCs w:val="0"/>
+        </w:rPr>
+        <w:t>The</w:t>
+      </w:r>
+      <w:r>
+        <w:rPr>
+          <w:rStyle w:val="Heading6Char"/>
+          <w:i w:val="0"/>
+          <w:iCs w:val="0"/>
+        </w:rPr>
+        <w:t xml:space="preserve"> note it is drawn on the staff and its name is displayed on the right. For example if you play middle  C it will display C4. It will also display the deviation from the standard frequency in cents (100 cents = 1 semitone). </w:t>
+      </w:r>
+    </w:p>
+    <w:p>
+      <w:pPr>
+        <w:pStyle w:val="ListParagraph"/>
+        <w:numPr>
+          <w:ilvl w:val="1"/>
+          <w:numId w:val="19"/>
+        </w:numPr>
+        <w:rPr>
+          <w:rStyle w:val="Heading6Char"/>
+          <w:i w:val="0"/>
+          <w:iCs w:val="0"/>
+        </w:rPr>
+      </w:pPr>
+      <w:r>
+        <w:rPr>
+          <w:rStyle w:val="Heading6Char"/>
+          <w:i w:val="0"/>
+          <w:iCs w:val="0"/>
+        </w:rPr>
+        <w:t>The frequency of the note that was heard and the frequency of the nearest standard note are shown.</w:t>
+      </w:r>
+    </w:p>
+    <w:p>
+      <w:pPr>
+        <w:pStyle w:val="ListParagraph"/>
+        <w:numPr>
+          <w:ilvl w:val="1"/>
+          <w:numId w:val="19"/>
+        </w:numPr>
+      </w:pPr>
+      <w:r>
+        <w:rPr>
+          <w:rStyle w:val="Heading6Char"/>
+          <w:i w:val="0"/>
+          <w:iCs w:val="0"/>
+        </w:rPr>
+        <w:t>The Key picker is not shown: the notes are written in the key of C.</w:t>
       </w:r>
       <w:r>
         <w:rPr>
@@ -730,6 +814,13 @@
           <w:ilvl w:val="0"/>
           <w:numId w:val="19"/>
         </w:numPr>
+        <w:rPr>
+          <w:rStyle w:val="Heading6Char"/>
+          <w:rFonts w:eastAsiaTheme="minorHAnsi" w:cstheme="minorBidi"/>
+          <w:i w:val="0"/>
+          <w:iCs w:val="0"/>
+          <w:color w:val="auto"/>
+        </w:rPr>
       </w:pPr>
       <w:r>
         <w:rPr>
@@ -737,39 +828,106 @@
           <w:b/>
           <w:bCs/>
         </w:rPr>
-        <w:t>Tuner</w:t>
-      </w:r>
-      <w:r>
-        <w:rPr>
+        <w:t>Scales</w:t>
+      </w:r>
+      <w:r>
+        <w:rPr>
+          <w:rStyle w:val="Heading6Char"/>
           <w:b/>
           <w:bCs/>
         </w:rPr>
         <w:br/>
       </w:r>
       <w:r>
-        <w:t>This page displays a staff on he left and a tuner on the right. When you play a note it is drawn on the staff and its name is displayed on the right. For example if you play middle  C it will display C4. It will also display the deviation from the standard frequency in cents (100 cents = 1 semitone).</w:t>
-      </w:r>
-      <w:r>
-        <w:t xml:space="preserve"> </w:t>
-      </w:r>
-      <w:r>
+        <w:rPr>
+          <w:rStyle w:val="Heading6Char"/>
+          <w:i w:val="0"/>
+          <w:iCs w:val="0"/>
+        </w:rPr>
+        <w:t>All the remaining</w:t>
+      </w:r>
+      <w:r>
+        <w:rPr>
+          <w:rStyle w:val="Heading6Char"/>
+          <w:i w:val="0"/>
+          <w:iCs w:val="0"/>
+        </w:rPr>
+        <w:t xml:space="preserve"> items are scales.</w:t>
+      </w:r>
+      <w:r>
+        <w:rPr>
+          <w:rStyle w:val="Heading6Char"/>
+          <w:i w:val="0"/>
+          <w:iCs w:val="0"/>
+        </w:rPr>
         <w:br/>
-        <w:t>The frequency of the note that was heard and the frequency of the nearest standard note are shown.</w:t>
-      </w:r>
-      <w:r>
-        <w:br/>
-      </w:r>
-      <w:r>
-        <w:t>The Key picker is not shown</w:t>
-      </w:r>
-      <w:r>
-        <w:t>: the notes are written in the key of C.</w:t>
-      </w:r>
-    </w:p>
-    <w:p>
-      <w:pPr>
-        <w:ind w:left="360"/>
-      </w:pPr>
+        <w:t>Pick any one and MusicMate displays</w:t>
+      </w:r>
+    </w:p>
+    <w:p>
+      <w:pPr>
+        <w:pStyle w:val="ListParagraph"/>
+        <w:numPr>
+          <w:ilvl w:val="1"/>
+          <w:numId w:val="19"/>
+        </w:numPr>
+        <w:rPr>
+          <w:rStyle w:val="Heading6Char"/>
+          <w:rFonts w:eastAsiaTheme="minorHAnsi" w:cstheme="minorBidi"/>
+          <w:i w:val="0"/>
+          <w:iCs w:val="0"/>
+          <w:color w:val="auto"/>
+        </w:rPr>
+      </w:pPr>
+      <w:r>
+        <w:rPr>
+          <w:rStyle w:val="Heading6Char"/>
+          <w:i w:val="0"/>
+          <w:iCs w:val="0"/>
+        </w:rPr>
+        <w:t>The key signature</w:t>
+      </w:r>
+    </w:p>
+    <w:p>
+      <w:pPr>
+        <w:pStyle w:val="ListParagraph"/>
+        <w:numPr>
+          <w:ilvl w:val="1"/>
+          <w:numId w:val="19"/>
+        </w:numPr>
+        <w:rPr>
+          <w:rStyle w:val="Heading6Char"/>
+          <w:rFonts w:eastAsiaTheme="minorHAnsi" w:cstheme="minorBidi"/>
+          <w:i w:val="0"/>
+          <w:iCs w:val="0"/>
+          <w:color w:val="auto"/>
+        </w:rPr>
+      </w:pPr>
+      <w:r>
+        <w:rPr>
+          <w:rStyle w:val="Heading6Char"/>
+          <w:i w:val="0"/>
+          <w:iCs w:val="0"/>
+        </w:rPr>
+        <w:t>One octave of ascending notes</w:t>
+      </w:r>
+    </w:p>
+    <w:p>
+      <w:pPr>
+        <w:pStyle w:val="ListParagraph"/>
+        <w:numPr>
+          <w:ilvl w:val="1"/>
+          <w:numId w:val="19"/>
+        </w:numPr>
+      </w:pPr>
+      <w:r>
+        <w:rPr>
+          <w:rStyle w:val="Heading6Char"/>
+          <w:i w:val="0"/>
+          <w:iCs w:val="0"/>
+        </w:rPr>
+        <w:t>The descending notes.</w:t>
+      </w:r>
     </w:p>
     <w:p>
       <w:pPr>
@@ -875,10 +1033,10 @@
           <w:b/>
           <w:bCs/>
         </w:rPr>
-        <w:t>Scale</w:t>
-      </w:r>
-      <w:r>
-        <w:t xml:space="preserve"> – Select one of 12 scales</w:t>
+        <w:t>Lowest / Highest</w:t>
+      </w:r>
+      <w:r>
+        <w:t xml:space="preserve"> – Define the note range</w:t>
       </w:r>
     </w:p>
     <w:p>
@@ -893,10 +1051,10 @@
           <w:b/>
           <w:bCs/>
         </w:rPr>
-        <w:t>Lowest / Highest</w:t>
-      </w:r>
-      <w:r>
-        <w:t xml:space="preserve"> – Define the note range</w:t>
+        <w:t>Playback BPM</w:t>
+      </w:r>
+      <w:r>
+        <w:t xml:space="preserve"> – Tempo for Auto Play</w:t>
       </w:r>
     </w:p>
     <w:p>
@@ -911,10 +1069,108 @@
           <w:b/>
           <w:bCs/>
         </w:rPr>
-        <w:t>Playback BPM</w:t>
-      </w:r>
-      <w:r>
-        <w:t xml:space="preserve"> – Tempo for Auto Play</w:t>
+        <w:t>Random Mode</w:t>
+      </w:r>
+    </w:p>
+    <w:p>
+      <w:pPr>
+        <w:numPr>
+          <w:ilvl w:val="1"/>
+          <w:numId w:val="16"/>
+        </w:numPr>
+      </w:pPr>
+      <w:r>
+        <w:rPr>
+          <w:b/>
+          <w:bCs/>
+        </w:rPr>
+        <w:t xml:space="preserve"> </w:t>
+      </w:r>
+      <w:r>
+        <w:rPr>
+          <w:b/>
+          <w:bCs/>
+        </w:rPr>
+        <w:t xml:space="preserve">Accidental % </w:t>
+      </w:r>
+      <w:r>
+        <w:t xml:space="preserve">- </w:t>
+      </w:r>
+      <w:r>
+        <w:t>Percentage of accidentals in Random mode</w:t>
+      </w:r>
+    </w:p>
+    <w:p>
+      <w:pPr>
+        <w:pStyle w:val="ListParagraph"/>
+        <w:numPr>
+          <w:ilvl w:val="1"/>
+          <w:numId w:val="16"/>
+        </w:numPr>
+      </w:pPr>
+      <w:r>
+        <w:rPr>
+          <w:b/>
+          <w:bCs/>
+        </w:rPr>
+        <w:t>Omit notes at/above % correct</w:t>
+      </w:r>
+      <w:r>
+        <w:t xml:space="preserve"> – Excludes well-mastered notes</w:t>
+      </w:r>
+      <w:r>
+        <w:br/>
+      </w:r>
+    </w:p>
+    <w:p>
+      <w:pPr>
+        <w:pStyle w:val="ListParagraph"/>
+        <w:numPr>
+          <w:ilvl w:val="1"/>
+          <w:numId w:val="16"/>
+        </w:numPr>
+      </w:pPr>
+      <w:r>
+        <w:rPr>
+          <w:b/>
+          <w:bCs/>
+        </w:rPr>
+        <w:t xml:space="preserve">Minimum </w:t>
+      </w:r>
+      <w:r>
+        <w:rPr>
+          <w:b/>
+          <w:bCs/>
+        </w:rPr>
+        <w:t>Correct Count</w:t>
+      </w:r>
+      <w:r>
+        <w:t xml:space="preserve"> – </w:t>
+      </w:r>
+      <w:r>
+        <w:t>A note will not be added untill it has been played correctly this number of times.</w:t>
+      </w:r>
+      <w:r>
+        <w:br/>
+      </w:r>
+    </w:p>
+    <w:p>
+      <w:pPr>
+        <w:pStyle w:val="ListParagraph"/>
+        <w:numPr>
+          <w:ilvl w:val="1"/>
+          <w:numId w:val="16"/>
+        </w:numPr>
+      </w:pPr>
+      <w:r>
+        <w:rPr>
+          <w:b/>
+          <w:bCs/>
+        </w:rPr>
+        <w:t xml:space="preserve">Omit notes below MsAvg </w:t>
+      </w:r>
+      <w:r>
+        <w:t>– This will make it include notes that you have been slow to play correctly. It is based on the average time in milliseconds that you have taken to get it right.</w:t>
       </w:r>
     </w:p>
     <w:p>
@@ -929,17 +1185,348 @@
           <w:b/>
           <w:bCs/>
         </w:rPr>
-        <w:t>Accidental %</w:t>
-      </w:r>
-      <w:r>
-        <w:t xml:space="preserve"> – Percentage of accidentals in Random mode</w:t>
-      </w:r>
-    </w:p>
-    <w:p>
-      <w:pPr>
+        <w:t>Auto start on appear</w:t>
+      </w:r>
+      <w:r>
+        <w:t xml:space="preserve"> – Automatically begin listening when the app opens</w:t>
+      </w:r>
+    </w:p>
+    <w:p>
+      <w:pPr>
+        <w:pStyle w:val="Heading2"/>
+      </w:pPr>
+      <w:r>
+        <w:t>Statistics Page</w:t>
+      </w:r>
+    </w:p>
+    <w:p>
+      <w:r>
+        <w:rPr>
+          <w:rStyle w:val="Heading5Char"/>
+        </w:rPr>
+        <w:t>Database</w:t>
+      </w:r>
+      <w:r>
+        <w:br/>
+        <w:t>Pick either Note or Session</w:t>
+      </w:r>
+      <w:r>
+        <w:t xml:space="preserve"> data.</w:t>
+      </w:r>
+    </w:p>
+    <w:p>
+      <w:r>
+        <w:rPr>
+          <w:rStyle w:val="Heading5Char"/>
+        </w:rPr>
+        <w:t>Clear All</w:t>
+      </w:r>
+      <w:r>
+        <w:br/>
+      </w:r>
+      <w:r>
+        <w:t>Clears</w:t>
+      </w:r>
+      <w:r>
+        <w:t xml:space="preserve"> the selected database</w:t>
+      </w:r>
+    </w:p>
+    <w:p>
+      <w:r>
+        <w:rPr>
+          <w:rStyle w:val="Heading5Char"/>
+        </w:rPr>
+        <w:t>Note data</w:t>
+      </w:r>
+      <w:r>
+        <w:rPr>
+          <w:rStyle w:val="Heading5Char"/>
+        </w:rPr>
+        <w:br/>
+      </w:r>
+      <w:r>
+        <w:t>Each row shows the</w:t>
+      </w:r>
+    </w:p>
+    <w:p>
+      <w:pPr>
+        <w:pStyle w:val="ListParagraph"/>
         <w:numPr>
           <w:ilvl w:val="0"/>
-          <w:numId w:val="16"/>
+          <w:numId w:val="10"/>
+        </w:numPr>
+      </w:pPr>
+      <w:r>
+        <w:t xml:space="preserve">name of the note </w:t>
+      </w:r>
+    </w:p>
+    <w:p>
+      <w:pPr>
+        <w:pStyle w:val="ListParagraph"/>
+        <w:numPr>
+          <w:ilvl w:val="0"/>
+          <w:numId w:val="10"/>
+        </w:numPr>
+      </w:pPr>
+      <w:r>
+        <w:t>octave number</w:t>
+      </w:r>
+    </w:p>
+    <w:p>
+      <w:pPr>
+        <w:pStyle w:val="ListParagraph"/>
+        <w:numPr>
+          <w:ilvl w:val="0"/>
+          <w:numId w:val="10"/>
+        </w:numPr>
+      </w:pPr>
+      <w:r>
+        <w:t>number of times the note was heard to have been played correctly (c)</w:t>
+      </w:r>
+    </w:p>
+    <w:p>
+      <w:pPr>
+        <w:pStyle w:val="ListParagraph"/>
+        <w:numPr>
+          <w:ilvl w:val="0"/>
+          <w:numId w:val="10"/>
+        </w:numPr>
+      </w:pPr>
+      <w:r>
+        <w:t>number of times the note was heard to have been played incorrectly (w)</w:t>
+      </w:r>
+    </w:p>
+    <w:p>
+      <w:pPr>
+        <w:pStyle w:val="ListParagraph"/>
+        <w:numPr>
+          <w:ilvl w:val="0"/>
+          <w:numId w:val="10"/>
+        </w:numPr>
+      </w:pPr>
+      <w:r>
+        <w:t>percentage of times it was heard to be correct (100 * c / (c + w)).</w:t>
+      </w:r>
+    </w:p>
+    <w:p>
+      <w:pPr>
+        <w:pStyle w:val="ListParagraph"/>
+        <w:numPr>
+          <w:ilvl w:val="0"/>
+          <w:numId w:val="10"/>
+        </w:numPr>
+      </w:pPr>
+      <w:r>
+        <w:t>The average time in milliseconds between correct playing of the note and its predecessor.</w:t>
+      </w:r>
+    </w:p>
+    <w:p>
+      <w:r>
+        <w:t>The average  of the wrong values is shown.</w:t>
+      </w:r>
+    </w:p>
+    <w:p>
+      <w:r>
+        <w:rPr>
+          <w:rStyle w:val="Heading5Char"/>
+        </w:rPr>
+        <w:t>Session data</w:t>
+      </w:r>
+      <w:r>
+        <w:br/>
+        <w:t xml:space="preserve">A session is completed when all the notes on the staff have been played correctly, in order from left to right. When a session is completed information about it is stored in </w:t>
+      </w:r>
+      <w:r>
+        <w:t>a new top</w:t>
+      </w:r>
+      <w:r>
+        <w:t xml:space="preserve"> row of this table. </w:t>
+      </w:r>
+      <w:r>
+        <w:t>Each row shows</w:t>
+      </w:r>
+      <w:r>
+        <w:t xml:space="preserve"> the </w:t>
+      </w:r>
+    </w:p>
+    <w:p>
+      <w:pPr>
+        <w:pStyle w:val="ListParagraph"/>
+        <w:numPr>
+          <w:ilvl w:val="0"/>
+          <w:numId w:val="11"/>
+        </w:numPr>
+      </w:pPr>
+      <w:r>
+        <w:t>d</w:t>
+      </w:r>
+      <w:r>
+        <w:t>ate and time when the session was completed</w:t>
+      </w:r>
+    </w:p>
+    <w:p>
+      <w:pPr>
+        <w:pStyle w:val="ListParagraph"/>
+        <w:numPr>
+          <w:ilvl w:val="0"/>
+          <w:numId w:val="11"/>
+        </w:numPr>
+      </w:pPr>
+      <w:r>
+        <w:t>k</w:t>
+      </w:r>
+      <w:r>
+        <w:t>ey of the music (transposed for the instrument)</w:t>
+      </w:r>
+    </w:p>
+    <w:p>
+      <w:pPr>
+        <w:pStyle w:val="ListParagraph"/>
+        <w:numPr>
+          <w:ilvl w:val="0"/>
+          <w:numId w:val="11"/>
+        </w:numPr>
+      </w:pPr>
+      <w:r>
+        <w:t>“tune”</w:t>
+      </w:r>
+    </w:p>
+    <w:p>
+      <w:pPr>
+        <w:pStyle w:val="ListParagraph"/>
+        <w:numPr>
+          <w:ilvl w:val="0"/>
+          <w:numId w:val="11"/>
+        </w:numPr>
+      </w:pPr>
+      <w:r>
+        <w:t>key of the instrument</w:t>
+      </w:r>
+    </w:p>
+    <w:p>
+      <w:pPr>
+        <w:pStyle w:val="ListParagraph"/>
+        <w:numPr>
+          <w:ilvl w:val="0"/>
+          <w:numId w:val="11"/>
+        </w:numPr>
+      </w:pPr>
+      <w:r>
+        <w:t xml:space="preserve">percent of notes heard that were correct. </w:t>
+      </w:r>
+    </w:p>
+    <w:p>
+      <w:pPr>
+        <w:pStyle w:val="ListParagraph"/>
+        <w:numPr>
+          <w:ilvl w:val="0"/>
+          <w:numId w:val="11"/>
+        </w:numPr>
+      </w:pPr>
+      <w:r>
+        <w:t>tempo in beats per minute (average)</w:t>
+      </w:r>
+    </w:p>
+    <w:p>
+      <w:pPr>
+        <w:pStyle w:val="ListParagraph"/>
+        <w:numPr>
+          <w:ilvl w:val="0"/>
+          <w:numId w:val="11"/>
+        </w:numPr>
+      </w:pPr>
+    </w:p>
+    <w:p>
+      <w:pPr>
+        <w:pStyle w:val="ListParagraph"/>
+        <w:numPr>
+          <w:ilvl w:val="0"/>
+          <w:numId w:val="11"/>
+        </w:numPr>
+      </w:pPr>
+    </w:p>
+    <w:p>
+      <w:pPr>
+        <w:pStyle w:val="ListParagraph"/>
+        <w:numPr>
+          <w:ilvl w:val="0"/>
+          <w:numId w:val="11"/>
+        </w:numPr>
+      </w:pPr>
+      <w:r>
+        <w:t>scale (</w:t>
+      </w:r>
+      <w:r>
+        <w:t>blank for random)</w:t>
+      </w:r>
+    </w:p>
+    <w:p>
+      <w:pPr>
+        <w:pStyle w:val="ListParagraph"/>
+        <w:numPr>
+          <w:ilvl w:val="0"/>
+          <w:numId w:val="11"/>
+        </w:numPr>
+      </w:pPr>
+      <w:r>
+        <w:t>highest note allowed</w:t>
+      </w:r>
+    </w:p>
+    <w:p>
+      <w:pPr>
+        <w:pStyle w:val="ListParagraph"/>
+        <w:numPr>
+          <w:ilvl w:val="0"/>
+          <w:numId w:val="11"/>
+        </w:numPr>
+      </w:pPr>
+      <w:r>
+        <w:t>lowest note allowed</w:t>
+      </w:r>
+    </w:p>
+    <w:p>
+      <w:pPr>
+        <w:pStyle w:val="ListParagraph"/>
+        <w:numPr>
+          <w:ilvl w:val="0"/>
+          <w:numId w:val="11"/>
+        </w:numPr>
+      </w:pPr>
+      <w:r>
+        <w:t>tempo consistency (</w:t>
+      </w:r>
+      <w:r>
+        <w:t>standard deviation  (zero for perfect time)</w:t>
+      </w:r>
+      <w:r>
+        <w:t xml:space="preserve"> </w:t>
+      </w:r>
+    </w:p>
+    <w:p>
+      <w:pPr>
+        <w:pStyle w:val="ListParagraph"/>
+        <w:numPr>
+          <w:ilvl w:val="0"/>
+          <w:numId w:val="11"/>
+        </w:numPr>
+      </w:pPr>
+      <w:r>
+        <w:t>button to delete this single session</w:t>
+      </w:r>
+    </w:p>
+    <w:p>
+      <w:pPr>
+        <w:pStyle w:val="Heading2"/>
+      </w:pPr>
+      <w:r>
+        <w:t>Advanced Page</w:t>
+      </w:r>
+    </w:p>
+    <w:p>
+      <w:pPr>
+        <w:numPr>
+          <w:ilvl w:val="0"/>
+          <w:numId w:val="17"/>
         </w:numPr>
       </w:pPr>
       <w:r>
@@ -947,17 +1534,24 @@
           <w:b/>
           <w:bCs/>
         </w:rPr>
-        <w:t>Omit notes at/above % correct</w:t>
-      </w:r>
-      <w:r>
-        <w:t xml:space="preserve"> – Excludes well-mastered notes</w:t>
+        <w:t>Pitch Tolerance (cents)</w:t>
+      </w:r>
+      <w:r>
+        <w:br/>
+        <w:t xml:space="preserve">A note is considered correct if it is within </w:t>
+      </w:r>
+      <w:r>
+        <w:t>the range of +/- the value selected.</w:t>
+      </w:r>
+      <w:r>
+        <w:t>.</w:t>
       </w:r>
     </w:p>
     <w:p>
       <w:pPr>
         <w:numPr>
           <w:ilvl w:val="0"/>
-          <w:numId w:val="16"/>
+          <w:numId w:val="17"/>
         </w:numPr>
       </w:pPr>
       <w:r>
@@ -965,17 +1559,18 @@
           <w:b/>
           <w:bCs/>
         </w:rPr>
-        <w:t>Minimum Correct Count</w:t>
-      </w:r>
-      <w:r>
-        <w:t xml:space="preserve"> – Minimum attempts before a note is evaluated</w:t>
+        <w:t>RMS Threshold</w:t>
+      </w:r>
+      <w:r>
+        <w:br/>
+        <w:t>Filters out background noise below a certain level.</w:t>
       </w:r>
     </w:p>
     <w:p>
       <w:pPr>
         <w:numPr>
           <w:ilvl w:val="0"/>
-          <w:numId w:val="16"/>
+          <w:numId w:val="17"/>
         </w:numPr>
       </w:pPr>
       <w:r>
@@ -983,303 +1578,31 @@
           <w:b/>
           <w:bCs/>
         </w:rPr>
-        <w:t>Auto start on appear</w:t>
-      </w:r>
-      <w:r>
-        <w:t xml:space="preserve"> – Automatically begin listening when the app opens</w:t>
-      </w:r>
-    </w:p>
-    <w:p>
-      <w:pPr>
-        <w:pStyle w:val="Heading2"/>
-      </w:pPr>
-      <w:r>
-        <w:t>Statistics Page</w:t>
-      </w:r>
-    </w:p>
-    <w:p>
-      <w:r>
-        <w:rPr>
-          <w:rStyle w:val="Heading5Char"/>
-        </w:rPr>
-        <w:t>Database</w:t>
+        <w:t>Cooldown (m</w:t>
+      </w:r>
+      <w:r>
+        <w:rPr>
+          <w:b/>
+          <w:bCs/>
+        </w:rPr>
+        <w:t>illiseconds</w:t>
+      </w:r>
+      <w:r>
+        <w:rPr>
+          <w:b/>
+          <w:bCs/>
+        </w:rPr>
+        <w:t>)</w:t>
       </w:r>
       <w:r>
         <w:br/>
-        <w:t>Pick either Note or Session</w:t>
-      </w:r>
-      <w:r>
-        <w:t xml:space="preserve"> data.</w:t>
-      </w:r>
-    </w:p>
-    <w:p>
-      <w:r>
-        <w:rPr>
-          <w:rStyle w:val="Heading5Char"/>
-        </w:rPr>
-        <w:t>Clear All</w:t>
-      </w:r>
-      <w:r>
-        <w:br/>
-      </w:r>
-      <w:r>
-        <w:t>Clears</w:t>
-      </w:r>
-      <w:r>
-        <w:t xml:space="preserve"> the selected database</w:t>
-      </w:r>
-    </w:p>
-    <w:p>
-      <w:r>
-        <w:rPr>
-          <w:rStyle w:val="Heading5Char"/>
-        </w:rPr>
-        <w:t>Note data</w:t>
-      </w:r>
-      <w:r>
-        <w:rPr>
-          <w:rStyle w:val="Heading5Char"/>
-        </w:rPr>
-        <w:br/>
-      </w:r>
-      <w:r>
-        <w:t>Each row shows the</w:t>
-      </w:r>
-    </w:p>
-    <w:p>
-      <w:pPr>
-        <w:pStyle w:val="ListParagraph"/>
-        <w:numPr>
-          <w:ilvl w:val="0"/>
-          <w:numId w:val="10"/>
-        </w:numPr>
-      </w:pPr>
-      <w:r>
-        <w:t xml:space="preserve">name of the note </w:t>
-      </w:r>
-    </w:p>
-    <w:p>
-      <w:pPr>
-        <w:pStyle w:val="ListParagraph"/>
-        <w:numPr>
-          <w:ilvl w:val="0"/>
-          <w:numId w:val="10"/>
-        </w:numPr>
-      </w:pPr>
-      <w:r>
-        <w:t>octave number</w:t>
-      </w:r>
-    </w:p>
-    <w:p>
-      <w:pPr>
-        <w:pStyle w:val="ListParagraph"/>
-        <w:numPr>
-          <w:ilvl w:val="0"/>
-          <w:numId w:val="10"/>
-        </w:numPr>
-      </w:pPr>
-      <w:r>
-        <w:t>number of times the note was heard to have been played correctly (c)</w:t>
-      </w:r>
-    </w:p>
-    <w:p>
-      <w:pPr>
-        <w:pStyle w:val="ListParagraph"/>
-        <w:numPr>
-          <w:ilvl w:val="0"/>
-          <w:numId w:val="10"/>
-        </w:numPr>
-      </w:pPr>
-      <w:r>
-        <w:t>number of times the note was heard to have been played incorrectly (w)</w:t>
-      </w:r>
-    </w:p>
-    <w:p>
-      <w:pPr>
-        <w:pStyle w:val="ListParagraph"/>
-        <w:numPr>
-          <w:ilvl w:val="0"/>
-          <w:numId w:val="10"/>
-        </w:numPr>
-      </w:pPr>
-      <w:r>
-        <w:t>percentage of times it was heard to be correct (100 * c / (c + w)).</w:t>
-      </w:r>
-    </w:p>
-    <w:p>
-      <w:r>
-        <w:rPr>
-          <w:rStyle w:val="Heading5Char"/>
-        </w:rPr>
-        <w:t>Session data</w:t>
-      </w:r>
-      <w:r>
-        <w:br/>
-        <w:t xml:space="preserve">A session is completed when all the notes on the staff have been played correctly, in order from left to right. When a session is completed information about it is stored in the next row of this table. </w:t>
-      </w:r>
-      <w:r>
-        <w:t>Each row shows</w:t>
-      </w:r>
-      <w:r>
-        <w:t xml:space="preserve"> the </w:t>
-      </w:r>
-    </w:p>
-    <w:p>
-      <w:pPr>
-        <w:pStyle w:val="ListParagraph"/>
-        <w:numPr>
-          <w:ilvl w:val="0"/>
-          <w:numId w:val="11"/>
-        </w:numPr>
-      </w:pPr>
-      <w:r>
-        <w:t>d</w:t>
-      </w:r>
-      <w:r>
-        <w:t>ate and time when the session was completed</w:t>
-      </w:r>
-    </w:p>
-    <w:p>
-      <w:pPr>
-        <w:pStyle w:val="ListParagraph"/>
-        <w:numPr>
-          <w:ilvl w:val="0"/>
-          <w:numId w:val="11"/>
-        </w:numPr>
-      </w:pPr>
-      <w:r>
-        <w:t>k</w:t>
-      </w:r>
-      <w:r>
-        <w:t>ey of the music (transposed for the instrument)</w:t>
-      </w:r>
-    </w:p>
-    <w:p>
-      <w:pPr>
-        <w:pStyle w:val="ListParagraph"/>
-        <w:numPr>
-          <w:ilvl w:val="0"/>
-          <w:numId w:val="11"/>
-        </w:numPr>
-      </w:pPr>
-      <w:r>
-        <w:t>“tune”</w:t>
-      </w:r>
-    </w:p>
-    <w:p>
-      <w:pPr>
-        <w:pStyle w:val="ListParagraph"/>
-        <w:numPr>
-          <w:ilvl w:val="0"/>
-          <w:numId w:val="11"/>
-        </w:numPr>
-      </w:pPr>
-      <w:r>
-        <w:t>key of the instrument</w:t>
-      </w:r>
-    </w:p>
-    <w:p>
-      <w:pPr>
-        <w:pStyle w:val="ListParagraph"/>
-        <w:numPr>
-          <w:ilvl w:val="0"/>
-          <w:numId w:val="11"/>
-        </w:numPr>
-      </w:pPr>
-      <w:r>
-        <w:t>scale (</w:t>
-      </w:r>
-      <w:r>
-        <w:t>blank for random)</w:t>
-      </w:r>
-    </w:p>
-    <w:p>
-      <w:pPr>
-        <w:pStyle w:val="ListParagraph"/>
-        <w:numPr>
-          <w:ilvl w:val="0"/>
-          <w:numId w:val="11"/>
-        </w:numPr>
-      </w:pPr>
-      <w:r>
-        <w:t>highest note allowed</w:t>
-      </w:r>
-    </w:p>
-    <w:p>
-      <w:pPr>
-        <w:pStyle w:val="ListParagraph"/>
-        <w:numPr>
-          <w:ilvl w:val="0"/>
-          <w:numId w:val="11"/>
-        </w:numPr>
-      </w:pPr>
-      <w:r>
-        <w:t>lowest note allowed</w:t>
-      </w:r>
-    </w:p>
-    <w:p>
-      <w:pPr>
-        <w:pStyle w:val="ListParagraph"/>
-        <w:numPr>
-          <w:ilvl w:val="0"/>
-          <w:numId w:val="11"/>
-        </w:numPr>
-      </w:pPr>
-      <w:r>
-        <w:t>tempo in beats per minute (average)</w:t>
-      </w:r>
-    </w:p>
-    <w:p>
-      <w:pPr>
-        <w:pStyle w:val="ListParagraph"/>
-        <w:numPr>
-          <w:ilvl w:val="0"/>
-          <w:numId w:val="11"/>
-        </w:numPr>
-      </w:pPr>
-      <w:r>
-        <w:t>tempo consistency (</w:t>
-      </w:r>
-      <w:r>
-        <w:t>standard deviation  (zero for perfect time)</w:t>
-      </w:r>
-    </w:p>
-    <w:p>
-      <w:pPr>
-        <w:pStyle w:val="ListParagraph"/>
-        <w:numPr>
-          <w:ilvl w:val="0"/>
-          <w:numId w:val="11"/>
-        </w:numPr>
-      </w:pPr>
-      <w:r>
-        <w:t>p</w:t>
-      </w:r>
-      <w:r>
-        <w:t>ercent of notes heard that were correct.</w:t>
-      </w:r>
-      <w:r>
-        <w:t xml:space="preserve"> </w:t>
-      </w:r>
-    </w:p>
-    <w:p>
-      <w:pPr>
-        <w:pStyle w:val="ListParagraph"/>
-        <w:numPr>
-          <w:ilvl w:val="0"/>
-          <w:numId w:val="11"/>
-        </w:numPr>
-      </w:pPr>
-      <w:r>
-        <w:t>button to delete this single session</w:t>
-      </w:r>
-    </w:p>
-    <w:p>
-      <w:pPr>
-        <w:pStyle w:val="Heading2"/>
-      </w:pPr>
-      <w:r>
-        <w:t>Advanced Page</w:t>
+        <w:t xml:space="preserve">Prevents </w:t>
+      </w:r>
+      <w:r>
+        <w:t xml:space="preserve">accidental </w:t>
+      </w:r>
+      <w:r>
+        <w:t>repeated detection of the same note.</w:t>
       </w:r>
     </w:p>
     <w:p>
@@ -1294,14 +1617,20 @@
           <w:b/>
           <w:bCs/>
         </w:rPr>
-        <w:t>Pitch Tolerance (cents)</w:t>
+        <w:t>Pitch Offset (cents)</w:t>
       </w:r>
       <w:r>
         <w:br/>
-        <w:t xml:space="preserve">A note is considered correct if it is within </w:t>
-      </w:r>
-      <w:r>
-        <w:t>the range of +/- the value selected.</w:t>
+        <w:t xml:space="preserve">Adjusts for </w:t>
+      </w:r>
+      <w:r>
+        <w:t xml:space="preserve">any </w:t>
+      </w:r>
+      <w:r>
+        <w:t>systematic pitch detection error</w:t>
+      </w:r>
+      <w:r>
+        <w:t xml:space="preserve"> </w:t>
       </w:r>
       <w:r>
         <w:t>.</w:t>
@@ -1319,85 +1648,115 @@
           <w:b/>
           <w:bCs/>
         </w:rPr>
-        <w:t>RMS Threshold</w:t>
+        <w:t>Delay Between Repeats (secs)</w:t>
       </w:r>
       <w:r>
         <w:br/>
-        <w:t>Filters out background noise below a certain level.</w:t>
-      </w:r>
-    </w:p>
-    <w:p>
-      <w:pPr>
+        <w:t>Pause between repeated Random sequences.</w:t>
+      </w:r>
+      <w:r>
+        <w:t xml:space="preserve"> </w:t>
+      </w:r>
+      <w:r>
+        <w:t xml:space="preserve">This delay time is so you can glance at the session summary in the title bar. </w:t>
+      </w:r>
+    </w:p>
+    <w:p>
+      <w:pPr>
+        <w:pStyle w:val="ListParagraph"/>
         <w:numPr>
           <w:ilvl w:val="0"/>
           <w:numId w:val="17"/>
         </w:numPr>
-      </w:pPr>
-      <w:r>
         <w:rPr>
           <w:b/>
           <w:bCs/>
         </w:rPr>
-        <w:t>Cooldown (m</w:t>
-      </w:r>
+      </w:pPr>
       <w:r>
         <w:rPr>
           <w:b/>
           <w:bCs/>
         </w:rPr>
-        <w:t>illiseconds</w:t>
-      </w:r>
-      <w:r>
+        <w:t>Wrong Debounce (miliseconds)</w:t>
+      </w:r>
+      <w:r>
+        <w:br/>
+        <w:t>Prevents rapid repeated ‘wrong’ increments for the same expected note by ignoring subsequent wrong detections until the debounce interval elapses (default 300 ms). Increase the value to avoid noise or transient detections being counted as multiple mistakes; decrease it for more sensitive scoring</w:t>
+      </w:r>
+      <w:r>
+        <w:br/>
+      </w:r>
+    </w:p>
+    <w:p>
+      <w:pPr>
+        <w:pStyle w:val="ListParagraph"/>
+        <w:numPr>
+          <w:ilvl w:val="0"/>
+          <w:numId w:val="17"/>
+        </w:numPr>
         <w:rPr>
           <w:b/>
           <w:bCs/>
         </w:rPr>
-        <w:t>)</w:t>
+      </w:pPr>
+      <w:r>
+        <w:rPr>
+          <w:b/>
+          <w:bCs/>
+        </w:rPr>
+        <w:t xml:space="preserve"> </w:t>
+      </w:r>
+      <w:r>
+        <w:rPr>
+          <w:b/>
+          <w:bCs/>
+        </w:rPr>
+        <w:t>Pitch Window Size</w:t>
       </w:r>
       <w:r>
         <w:br/>
-        <w:t xml:space="preserve">Prevents </w:t>
-      </w:r>
-      <w:r>
-        <w:t xml:space="preserve">accidental </w:t>
-      </w:r>
-      <w:r>
-        <w:t>repeated detection of the same note.</w:t>
-      </w:r>
-    </w:p>
-    <w:p>
-      <w:pPr>
+      </w:r>
+      <w:r>
+        <w:t xml:space="preserve">This is the maximum number of audio samples the detector may use when measuring pitch. A larger window improves frequency resolution and stability (important for low notes), but increases detection latency and CPU work; a smaller window gives faster updates but can cause octave/instability errors and less accurate cents </w:t>
+      </w:r>
+      <w:r>
+        <w:t>values.</w:t>
+      </w:r>
+      <w:r>
+        <w:br/>
+      </w:r>
+    </w:p>
+    <w:p>
+      <w:pPr>
+        <w:pStyle w:val="ListParagraph"/>
         <w:numPr>
           <w:ilvl w:val="0"/>
           <w:numId w:val="17"/>
         </w:numPr>
-      </w:pPr>
-      <w:r>
         <w:rPr>
           <w:b/>
           <w:bCs/>
         </w:rPr>
-        <w:t>Pitch Offset (cents)</w:t>
+      </w:pPr>
+      <w:r>
+        <w:rPr>
+          <w:b/>
+          <w:bCs/>
+        </w:rPr>
+        <w:t>Smoothing Window</w:t>
       </w:r>
       <w:r>
         <w:br/>
-        <w:t xml:space="preserve">Adjusts for </w:t>
-      </w:r>
-      <w:r>
-        <w:t xml:space="preserve">any </w:t>
-      </w:r>
-      <w:r>
-        <w:t>systematic pitch detection error</w:t>
-      </w:r>
-      <w:r>
-        <w:t xml:space="preserve"> </w:t>
-      </w:r>
-      <w:r>
-        <w:t>.</w:t>
-      </w:r>
-    </w:p>
-    <w:p>
-      <w:pPr>
+        <w:t>The smoothing window controls how many recent pitch detections the app keeps and takes the median of (see SmoothPitch(double)). A larger window reduces jitter and filters out transient outliers, at the cost of slower reaction to real pitch changes; a smaller window gives faster updates but is more noisy.</w:t>
+      </w:r>
+      <w:r>
+        <w:br/>
+      </w:r>
+    </w:p>
+    <w:p>
+      <w:pPr>
+        <w:pStyle w:val="ListParagraph"/>
         <w:numPr>
           <w:ilvl w:val="0"/>
           <w:numId w:val="17"/>
@@ -1408,139 +1767,21 @@
           <w:b/>
           <w:bCs/>
         </w:rPr>
-        <w:t>Delay Between Repeats (secs)</w:t>
+        <w:t>ResetButton</w:t>
       </w:r>
       <w:r>
         <w:br/>
-        <w:t>Pause between repeated Random sequences.</w:t>
-      </w:r>
-      <w:r>
-        <w:t xml:space="preserve"> </w:t>
-      </w:r>
-      <w:r>
-        <w:t xml:space="preserve">This delay time is so you can glance at the session summary in the title bar. </w:t>
-      </w:r>
-    </w:p>
-    <w:p>
-      <w:pPr>
-        <w:pStyle w:val="ListParagraph"/>
-        <w:numPr>
-          <w:ilvl w:val="0"/>
-          <w:numId w:val="17"/>
-        </w:numPr>
-        <w:rPr>
-          <w:b/>
-          <w:bCs/>
-        </w:rPr>
-      </w:pPr>
-      <w:r>
-        <w:rPr>
-          <w:b/>
-          <w:bCs/>
-        </w:rPr>
-        <w:t>Wrong Debounce (miliseconds)</w:t>
-      </w:r>
-      <w:r>
-        <w:br/>
-      </w:r>
-      <w:r>
-        <w:t>Prevents rapid repeated ‘wrong’ increments for the same expected note by ignoring subsequent wrong detections until the debounce interval elapses (default 300 ms). Increase the value to avoid noise or transient detections being counted as multiple mistakes; decrease it for more sensitive scoring</w:t>
-      </w:r>
-      <w:r>
-        <w:br/>
-      </w:r>
-    </w:p>
-    <w:p>
-      <w:pPr>
-        <w:pStyle w:val="ListParagraph"/>
-        <w:numPr>
-          <w:ilvl w:val="0"/>
-          <w:numId w:val="17"/>
-        </w:numPr>
-        <w:rPr>
-          <w:b/>
-          <w:bCs/>
-        </w:rPr>
-      </w:pPr>
-      <w:r>
-        <w:rPr>
-          <w:b/>
-          <w:bCs/>
-        </w:rPr>
-        <w:t xml:space="preserve"> </w:t>
-      </w:r>
-      <w:r>
-        <w:rPr>
-          <w:b/>
-          <w:bCs/>
-        </w:rPr>
-        <w:t>Pitch Window Size</w:t>
-      </w:r>
-      <w:r>
-        <w:br/>
-      </w:r>
-      <w:r>
-        <w:t xml:space="preserve">This is </w:t>
-      </w:r>
-      <w:r>
-        <w:t xml:space="preserve">the maximum number of audio samples the detector may use when measuring pitch. A larger window improves frequency resolution and stability (important for low notes), but increases detection latency and CPU work; a smaller window gives faster updates but can cause octave/instability errors and less accurate cents </w:t>
-      </w:r>
-      <w:r>
-        <w:t>values.</w:t>
-      </w:r>
-      <w:r>
-        <w:br/>
-      </w:r>
-    </w:p>
-    <w:p>
-      <w:pPr>
-        <w:pStyle w:val="ListParagraph"/>
-        <w:numPr>
-          <w:ilvl w:val="0"/>
-          <w:numId w:val="17"/>
-        </w:numPr>
-        <w:rPr>
-          <w:b/>
-          <w:bCs/>
-        </w:rPr>
-      </w:pPr>
-      <w:r>
-        <w:rPr>
-          <w:b/>
-          <w:bCs/>
-        </w:rPr>
-        <w:t>Smoothing Window</w:t>
-      </w:r>
-      <w:r>
-        <w:br/>
-      </w:r>
-      <w:r>
-        <w:t>The smoothing window controls how many recent pitch detections the app keeps and takes the median of (see SmoothPitch(double)). A larger window reduces jitter and filters out transient outliers, at the cost of slower reaction to real pitch changes; a smaller window gives faster updates but is more noisy.</w:t>
-      </w:r>
-      <w:r>
-        <w:br/>
-      </w:r>
-      <w:r>
-        <w:br/>
-      </w:r>
-      <w:r>
-        <w:rPr>
-          <w:rStyle w:val="Heading5Char"/>
-        </w:rPr>
-        <w:t>Reset Button</w:t>
-      </w:r>
-      <w:r>
-        <w:br/>
-        <w:t>A tap will make all settings revert to the factory default values.</w:t>
-      </w:r>
-    </w:p>
-    <w:p>
-      <w:pPr>
-        <w:numPr>
-          <w:ilvl w:val="0"/>
-          <w:numId w:val="17"/>
-        </w:numPr>
-      </w:pPr>
+        <w:t>T</w:t>
+      </w:r>
+      <w:r>
+        <w:t xml:space="preserve">ap </w:t>
+      </w:r>
+      <w:r>
+        <w:t>to change all</w:t>
+      </w:r>
+      <w:r>
+        <w:t xml:space="preserve"> settings to the factory default values.</w:t>
+      </w:r>
     </w:p>
     <w:p>
       <w:pPr>
@@ -1567,6 +1808,9 @@
       <w:r>
         <w:t>Certain items such as Accidentals and keys with more that 3 sharps or flats are available only in the paid Premium version.</w:t>
       </w:r>
+      <w:r>
+        <w:t xml:space="preserve"> There is a button to get Premium at the top of the About page.</w:t>
+      </w:r>
     </w:p>
     <w:p>
       <w:pPr>
@@ -1578,10 +1822,22 @@
     </w:p>
     <w:p>
       <w:r>
-        <w:t xml:space="preserve">If you try to set </w:t>
-      </w:r>
-      <w:r>
-        <w:t>something that is available only in the Premium version</w:t>
+        <w:t xml:space="preserve">If you </w:t>
+      </w:r>
+      <w:r>
+        <w:t xml:space="preserve">are not a premium user and </w:t>
+      </w:r>
+      <w:r>
+        <w:t xml:space="preserve">try to set </w:t>
+      </w:r>
+      <w:r>
+        <w:t xml:space="preserve">something that is available only in the </w:t>
+      </w:r>
+      <w:r>
+        <w:t>p</w:t>
+      </w:r>
+      <w:r>
+        <w:t>remium version</w:t>
       </w:r>
       <w:r>
         <w:t xml:space="preserve"> then a window will pop up</w:t>
@@ -1590,7 +1846,13 @@
         <w:t xml:space="preserve">. The window has </w:t>
       </w:r>
       <w:r>
-        <w:t>two buttons. One is to buy a lifetime Premium version with free automatic updates</w:t>
+        <w:t xml:space="preserve">two buttons. One is to buy a lifetime </w:t>
+      </w:r>
+      <w:r>
+        <w:t>p</w:t>
+      </w:r>
+      <w:r>
+        <w:t>remium version with free automatic updates</w:t>
       </w:r>
       <w:r>
         <w:t xml:space="preserve"> for ever</w:t>
@@ -1634,7 +1896,13 @@
         </w:numPr>
       </w:pPr>
       <w:r>
-        <w:t>Very low or very high notes (outside E2–E7) may not be detected</w:t>
+        <w:t xml:space="preserve">Very low or very high notes (outside </w:t>
+      </w:r>
+      <w:r>
+        <w:t>F</w:t>
+      </w:r>
+      <w:r>
+        <w:t>2–E7) may not be detected</w:t>
       </w:r>
     </w:p>
     <w:p>
@@ -1671,7 +1939,10 @@
       </w:r>
       <w:r>
         <w:br/>
-        <w:t>Please email: support@bkdaniels.com</w:t>
+        <w:t xml:space="preserve">Please email: </w:t>
+      </w:r>
+      <w:r>
+        <w:t>brian_k_daniels@yahoo.com</w:t>
       </w:r>
     </w:p>
     <w:p>
@@ -1708,7 +1979,7 @@
 <w:numbering xmlns:wpc="http://schemas.microsoft.com/office/word/2010/wordprocessingCanvas" xmlns:cx="http://schemas.microsoft.com/office/drawing/2014/chartex" xmlns:cx1="http://schemas.microsoft.com/office/drawing/2015/9/8/chartex" xmlns:cx2="http://schemas.microsoft.com/office/drawing/2015/10/21/chartex" xmlns:cx3="http://schemas.microsoft.com/office/drawing/2016/5/9/chartex" xmlns:cx4="http://schemas.microsoft.com/office/drawing/2016/5/10/chartex" xmlns:cx5="http://schemas.microsoft.com/office/drawing/2016/5/11/chartex" xmlns:cx6="http://schemas.microsoft.com/office/drawing/2016/5/12/chartex" xmlns:cx7="http://schemas.microsoft.com/office/drawing/2016/5/13/chartex" xmlns:cx8="http://schemas.microsoft.com/office/drawing/2016/5/14/chartex" xmlns:mc="http://schemas.openxmlformats.org/markup-compatibility/2006" xmlns:aink="http://schemas.microsoft.com/office/drawing/2016/ink" xmlns:am3d="http://schemas.microsoft.com/office/drawing/2017/model3d" xmlns:o="urn:schemas-microsoft-com:office:office" xmlns:oel="http://schemas.microsoft.com/office/2019/extlst" xmlns:r="http://schemas.openxmlformats.org/officeDocument/2006/relationships" xmlns:m="http://schemas.openxmlformats.org/officeDocument/2006/math" xmlns:v="urn:schemas-microsoft-com:vml" xmlns:wp14="http://schemas.microsoft.com/office/word/2010/wordprocessingDrawing" xmlns:wp="http://schemas.openxmlformats.org/drawingml/2006/wordprocessingDrawing" xmlns:w10="urn:schemas-microsoft-com:office:word" xmlns:w="http://schemas.openxmlformats.org/wordprocessingml/2006/main" xmlns:w14="http://schemas.microsoft.com/office/word/2010/wordml" xmlns:w15="http://schemas.microsoft.com/office/word/2012/wordml" xmlns:w16cex="http://schemas.microsoft.com/office/word/2018/wordml/cex" xmlns:w16cid="http://schemas.microsoft.com/office/word/2016/wordml/cid" xmlns:w16="http://schemas.microsoft.com/office/word/2018/wordml" xmlns:w16du="http://schemas.microsoft.com/office/word/2023/wordml/word16du" xmlns:w16sdtdh="http://schemas.microsoft.com/office/word/2020/wordml/sdtdatahash" xmlns:w16sdtfl="http://schemas.microsoft.com/office/word/2024/wordml/sdtformatlock" xmlns:w16se="http://schemas.microsoft.com/office/word/2015/wordml/symex" xmlns:wpg="http://schemas.microsoft.com/office/word/2010/wordprocessingGroup" xmlns:wpi="http://schemas.microsoft.com/office/word/2010/wordprocessingInk" xmlns:wne="http://schemas.microsoft.com/office/word/2006/wordml" xmlns:wps="http://schemas.microsoft.com/office/word/2010/wordprocessingShape" mc:Ignorable="w14 w15 w16se w16cid w16 w16cex w16sdtdh w16sdtfl w16du wp14">
   <w:numPicBullet w:numPicBulletId="0">
     <w:pict>
-      <v:rect id="_x0000_i1238" style="width:0;height:1.5pt" o:hralign="center" o:bullet="t" o:hrstd="t" o:hr="t" fillcolor="#a0a0a0" stroked="f"/>
+      <v:rect id="_x0000_i1062" style="width:0;height:1.5pt" o:hralign="center" o:bullet="t" o:hrstd="t" o:hr="t" fillcolor="#a0a0a0" stroked="f"/>
     </w:pict>
   </w:numPicBullet>
   <w:abstractNum w:abstractNumId="0" w15:restartNumberingAfterBreak="0">
@@ -2286,7 +2557,7 @@
         <w:sz w:val="20"/>
       </w:rPr>
     </w:lvl>
-    <w:lvl w:ilvl="1" w:tentative="1">
+    <w:lvl w:ilvl="1">
       <w:start w:val="1"/>
       <w:numFmt w:val="bullet"/>
       <w:lvlText w:val="o"/>

</xml_diff>

<commit_message>
Chromaitic scale, buttons on bottom row in better order.
</commit_message>
<xml_diff>
--- a/About.docx
+++ b/About.docx
@@ -5,9 +5,71 @@
     <w:p>
       <w:pPr>
         <w:pStyle w:val="Title"/>
+        <w:tabs>
+          <w:tab w:val="right" w:leader="dot" w:pos="5760"/>
+          <w:tab w:val="right" w:leader="dot" w:pos="6480"/>
+        </w:tabs>
       </w:pPr>
       <w:r>
         <w:t>Music Mate</w:t>
+      </w:r>
+      <w:r>
+        <w:rPr>
+          <w:b w:val="0"/>
+          <w:bCs/>
+          <w:sz w:val="18"/>
+          <w:szCs w:val="18"/>
+        </w:rPr>
+        <w:t xml:space="preserve"> </w:t>
+      </w:r>
+      <w:r>
+        <w:rPr>
+          <w:b w:val="0"/>
+          <w:bCs/>
+          <w:sz w:val="18"/>
+          <w:szCs w:val="18"/>
+        </w:rPr>
+        <w:tab/>
+      </w:r>
+      <w:r>
+        <w:rPr>
+          <w:b w:val="0"/>
+          <w:bCs/>
+          <w:sz w:val="18"/>
+          <w:szCs w:val="18"/>
+        </w:rPr>
+        <w:t>April</w:t>
+      </w:r>
+      <w:r>
+        <w:rPr>
+          <w:b w:val="0"/>
+          <w:bCs/>
+          <w:sz w:val="18"/>
+          <w:szCs w:val="18"/>
+        </w:rPr>
+        <w:t xml:space="preserve"> 29</w:t>
+      </w:r>
+      <w:r>
+        <w:rPr>
+          <w:b w:val="0"/>
+          <w:bCs/>
+          <w:sz w:val="18"/>
+          <w:szCs w:val="18"/>
+          <w:vertAlign w:val="superscript"/>
+        </w:rPr>
+        <w:t>th</w:t>
+      </w:r>
+      <w:r>
+        <w:rPr>
+          <w:b w:val="0"/>
+          <w:bCs/>
+          <w:sz w:val="18"/>
+          <w:szCs w:val="18"/>
+        </w:rPr>
+        <w:t xml:space="preserve"> 2026</w:t>
+      </w:r>
+      <w:r>
+        <w:t xml:space="preserve"> </w:t>
       </w:r>
       <w:r>
         <w:br/>
@@ -324,6 +386,19 @@
         <w:pStyle w:val="Heading2"/>
       </w:pPr>
       <w:r>
+        <w:t>Major</w:t>
+      </w:r>
+    </w:p>
+    <w:p>
+      <w:r>
+        <w:t>The Major scale is the default value of the many practice modes in this picker.</w:t>
+      </w:r>
+    </w:p>
+    <w:p>
+      <w:pPr>
+        <w:pStyle w:val="Heading2"/>
+      </w:pPr>
+      <w:r>
         <w:t>Start / Stop Listening</w:t>
       </w:r>
     </w:p>
@@ -333,7 +408,16 @@
         <w:spacing w:after="0"/>
       </w:pPr>
       <w:r>
-        <w:t>Tap the green round button to start listening.</w:t>
+        <w:t xml:space="preserve">Tap the green round button to </w:t>
+      </w:r>
+      <w:r>
+        <w:t>make the ‘phone start to</w:t>
+      </w:r>
+      <w:r>
+        <w:t xml:space="preserve"> listen</w:t>
+      </w:r>
+      <w:r>
+        <w:t xml:space="preserve"> to your play.</w:t>
       </w:r>
     </w:p>
     <w:p>
@@ -342,7 +426,7 @@
         <w:spacing w:after="0"/>
       </w:pPr>
       <w:r>
-        <w:t>When listening is on, the button changes to a red square.</w:t>
+        <w:t>When listening the button changes to a red square.</w:t>
       </w:r>
     </w:p>
     <w:p>
@@ -364,7 +448,13 @@
     </w:p>
     <w:p>
       <w:r>
-        <w:t>Tap the green triangle button to hear the notes played by the phone. This can help you learn how a scale or exercise should sound. While the notes are playing, the button turns red.</w:t>
+        <w:t xml:space="preserve">Tap the green triangle button to </w:t>
+      </w:r>
+      <w:r>
+        <w:t>make the ‘phone play the notes.</w:t>
+      </w:r>
+      <w:r>
+        <w:t xml:space="preserve"> This can help you learn how a scale or exercise should sound. While the notes are playing, the button turns red.</w:t>
       </w:r>
     </w:p>
     <w:p>
@@ -379,6 +469,35 @@
       <w:r>
         <w:t>You can change the background color of the staff area. Choose a color you like, then tap OK.</w:t>
       </w:r>
+      <w:r>
+        <w:t xml:space="preserve"> Other pages use the chosen color for their background</w:t>
+      </w:r>
+    </w:p>
+    <w:p>
+      <w:pPr>
+        <w:pStyle w:val="Heading2"/>
+      </w:pPr>
+      <w:r>
+        <w:t>Repeat New</w:t>
+      </w:r>
+    </w:p>
+    <w:p>
+      <w:r>
+        <w:t>Toggle to green to make it automatically generate a new random patern after a few seconds.</w:t>
+      </w:r>
+    </w:p>
+    <w:p>
+      <w:pPr>
+        <w:pStyle w:val="Heading2"/>
+      </w:pPr>
+      <w:r>
+        <w:t>Repeat</w:t>
+      </w:r>
+    </w:p>
+    <w:p>
+      <w:r>
+        <w:t>Toggle to green to make it start listening from the beginning after a few seconds.</w:t>
+      </w:r>
     </w:p>
     <w:p>
       <w:pPr>
@@ -398,7 +517,10 @@
     </w:p>
     <w:p>
       <w:r>
-        <w:t>In Tuner mode, Music Mate listens to any note you play.</w:t>
+        <w:t>In Tuner mode, Music Mate listens to any note you play</w:t>
+      </w:r>
+      <w:r>
+        <w:t xml:space="preserve"> and displays:</w:t>
       </w:r>
     </w:p>
     <w:p>
@@ -452,7 +574,10 @@
     </w:p>
     <w:p>
       <w:r>
-        <w:t>In Random mode, Music Mate makes a note pattern for you to play.</w:t>
+        <w:t>In Random mode, Music Mate makes a note pattern for you to play</w:t>
+      </w:r>
+      <w:r>
+        <w:t xml:space="preserve"> using:</w:t>
       </w:r>
     </w:p>
     <w:p>
@@ -492,8 +617,52 @@
       </w:r>
     </w:p>
     <w:p>
-      <w:r>
-        <w:t>As you improve, notes you already know well can be left out, so you spend more time practicing notes that need more work. You can also turn on Repeat so a new random pattern appears automatically after you finish one.</w:t>
+      <w:pPr>
+        <w:pStyle w:val="ListBullet"/>
+        <w:numPr>
+          <w:ilvl w:val="0"/>
+          <w:numId w:val="0"/>
+        </w:numPr>
+        <w:spacing w:after="0"/>
+        <w:ind w:left="360"/>
+      </w:pPr>
+    </w:p>
+    <w:p>
+      <w:r>
+        <w:t xml:space="preserve">As you improve, notes you already know well can be left out, so you spend more time practicing notes that need more work. You can also turn on </w:t>
+      </w:r>
+      <w:r>
+        <w:rPr>
+          <w:b/>
+          <w:bCs/>
+        </w:rPr>
+        <w:t xml:space="preserve">Repeat </w:t>
+      </w:r>
+      <w:r>
+        <w:rPr>
+          <w:b/>
+          <w:bCs/>
+        </w:rPr>
+        <w:t>New</w:t>
+      </w:r>
+      <w:r>
+        <w:t xml:space="preserve"> </w:t>
+      </w:r>
+      <w:r>
+        <w:t>so a new random pattern appears automatically after you finish one</w:t>
+      </w:r>
+      <w:r>
+        <w:t xml:space="preserve">. Or </w:t>
+      </w:r>
+      <w:r>
+        <w:rPr>
+          <w:b/>
+          <w:bCs/>
+        </w:rPr>
+        <w:t>Repeat</w:t>
+      </w:r>
+      <w:r>
+        <w:t xml:space="preserve"> will make it repeat the same pattern of notes after a few seconds.</w:t>
       </w:r>
     </w:p>
     <w:p>
@@ -528,7 +697,13 @@
         <w:spacing w:after="0"/>
       </w:pPr>
       <w:r>
-        <w:t>Lowest / Highest Note - choose your note range</w:t>
+        <w:t>Low / High Note - choose your note range</w:t>
+      </w:r>
+      <w:r>
+        <w:br/>
+      </w:r>
+      <w:r>
+        <w:t>A good note range to begin with is something moderate, such as C4 to C5. As you get better, you can make the range bigger.</w:t>
       </w:r>
     </w:p>
     <w:p>
@@ -546,7 +721,22 @@
         <w:spacing w:after="0"/>
       </w:pPr>
       <w:r>
-        <w:t>Accidental % - choose how many accidentals Random mode may use</w:t>
+        <w:t>Accidental % - choose how many</w:t>
+      </w:r>
+      <w:r>
+        <w:t xml:space="preserve"> notes are converted to random</w:t>
+      </w:r>
+      <w:r>
+        <w:t xml:space="preserve"> accidentals </w:t>
+      </w:r>
+      <w:r>
+        <w:t xml:space="preserve">in a </w:t>
+      </w:r>
+      <w:r>
+        <w:t xml:space="preserve">Random </w:t>
+      </w:r>
+      <w:r>
+        <w:t>practice mode.</w:t>
       </w:r>
     </w:p>
     <w:p>
@@ -573,7 +763,22 @@
         <w:spacing w:after="0"/>
       </w:pPr>
       <w:r>
-        <w:t>Omit notes below MsAvg - include notes that you are slow to play correctly</w:t>
+        <w:t>Include</w:t>
+      </w:r>
+      <w:r>
+        <w:t xml:space="preserve"> notes </w:t>
+      </w:r>
+      <w:r>
+        <w:t>with</w:t>
+      </w:r>
+      <w:r>
+        <w:t xml:space="preserve"> MsAvg </w:t>
+      </w:r>
+      <w:r>
+        <w:t xml:space="preserve"> above this value</w:t>
+      </w:r>
+      <w:r>
+        <w:t>.</w:t>
       </w:r>
     </w:p>
     <w:p>
@@ -586,38 +791,12 @@
       </w:r>
     </w:p>
     <w:p>
-      <w:r>
-        <w:t>A good note range to begin with is something moderate, such as C4 to C5. As you get better, you can make the range bigger.</w:t>
-      </w:r>
-    </w:p>
-    <w:p>
-      <w:pPr>
-        <w:pStyle w:val="Heading1"/>
-      </w:pPr>
-      <w:r>
-        <w:t>Statistics Page</w:t>
-      </w:r>
-    </w:p>
-    <w:p>
-      <w:r>
-        <w:t>The Statistics page shows how you have been doing.</w:t>
-      </w:r>
-    </w:p>
-    <w:p>
-      <w:pPr>
-        <w:pStyle w:val="Heading2"/>
-      </w:pPr>
-      <w:r>
-        <w:t>Note Data</w:t>
-      </w:r>
-    </w:p>
-    <w:p>
       <w:pPr>
         <w:pStyle w:val="ListBullet"/>
         <w:spacing w:after="0"/>
       </w:pPr>
       <w:r>
-        <w:t>the note name</w:t>
+        <w:t>Turn note statistics on or off.</w:t>
       </w:r>
     </w:p>
     <w:p>
@@ -626,7 +805,10 @@
         <w:spacing w:after="0"/>
       </w:pPr>
       <w:r>
-        <w:t>the octave</w:t>
+        <w:t>Turn session statistics on or off</w:t>
+      </w:r>
+      <w:r>
+        <w:t>.</w:t>
       </w:r>
     </w:p>
     <w:p>
@@ -635,7 +817,31 @@
         <w:spacing w:after="0"/>
       </w:pPr>
       <w:r>
-        <w:t>how many times it was correct</w:t>
+        <w:t>Reset  all settings on this, Home, and Advanced pages</w:t>
+      </w:r>
+      <w:r>
+        <w:t xml:space="preserve"> to defaults.</w:t>
+      </w:r>
+    </w:p>
+    <w:p>
+      <w:pPr>
+        <w:pStyle w:val="Heading1"/>
+      </w:pPr>
+      <w:r>
+        <w:t>Statistics Page</w:t>
+      </w:r>
+    </w:p>
+    <w:p>
+      <w:r>
+        <w:t>The Statistics page shows how you have been doing.</w:t>
+      </w:r>
+    </w:p>
+    <w:p>
+      <w:pPr>
+        <w:pStyle w:val="Heading2"/>
+      </w:pPr>
+      <w:r>
+        <w:t>Note Data</w:t>
       </w:r>
     </w:p>
     <w:p>
@@ -644,7 +850,10 @@
         <w:spacing w:after="0"/>
       </w:pPr>
       <w:r>
-        <w:t>how many times it was wrong</w:t>
+        <w:t>the note name</w:t>
+      </w:r>
+      <w:r>
+        <w:t xml:space="preserve"> and octave number</w:t>
       </w:r>
     </w:p>
     <w:p>
@@ -653,7 +862,10 @@
         <w:spacing w:after="0"/>
       </w:pPr>
       <w:r>
-        <w:t>the percent correct</w:t>
+        <w:t>how many times it was correct</w:t>
+      </w:r>
+      <w:r>
+        <w:t xml:space="preserve"> </w:t>
       </w:r>
     </w:p>
     <w:p>
@@ -662,20 +874,7 @@
         <w:spacing w:after="0"/>
       </w:pPr>
       <w:r>
-        <w:t>timing information</w:t>
-      </w:r>
-    </w:p>
-    <w:p>
-      <w:pPr>
-        <w:pStyle w:val="Heading2"/>
-      </w:pPr>
-      <w:r>
-        <w:t>Session Data</w:t>
-      </w:r>
-    </w:p>
-    <w:p>
-      <w:r>
-        <w:t>A session is completed when you play all the notes on the staff correctly, in order.</w:t>
+        <w:t>how many times it was wrong</w:t>
       </w:r>
     </w:p>
     <w:p>
@@ -684,7 +883,7 @@
         <w:spacing w:after="0"/>
       </w:pPr>
       <w:r>
-        <w:t>the date and time</w:t>
+        <w:t>the percent correct</w:t>
       </w:r>
     </w:p>
     <w:p>
@@ -693,7 +892,20 @@
         <w:spacing w:after="0"/>
       </w:pPr>
       <w:r>
-        <w:t>the tune or scale used</w:t>
+        <w:t xml:space="preserve"> the average number of milliseconds to play correctly.</w:t>
+      </w:r>
+    </w:p>
+    <w:p>
+      <w:pPr>
+        <w:pStyle w:val="Heading2"/>
+      </w:pPr>
+      <w:r>
+        <w:t>Session Data</w:t>
+      </w:r>
+    </w:p>
+    <w:p>
+      <w:r>
+        <w:t>A session is completed when you play all the notes on the staff correctly, in order.</w:t>
       </w:r>
     </w:p>
     <w:p>
@@ -702,7 +914,7 @@
         <w:spacing w:after="0"/>
       </w:pPr>
       <w:r>
-        <w:t>the key</w:t>
+        <w:t>the date and time</w:t>
       </w:r>
     </w:p>
     <w:p>
@@ -711,7 +923,7 @@
         <w:spacing w:after="0"/>
       </w:pPr>
       <w:r>
-        <w:t>your percent correct</w:t>
+        <w:t>the tune or scale used</w:t>
       </w:r>
     </w:p>
     <w:p>
@@ -720,7 +932,7 @@
         <w:spacing w:after="0"/>
       </w:pPr>
       <w:r>
-        <w:t>the note range used</w:t>
+        <w:t>the key</w:t>
       </w:r>
     </w:p>
     <w:p>
@@ -729,7 +941,13 @@
         <w:spacing w:after="0"/>
       </w:pPr>
       <w:r>
-        <w:t>the tempo</w:t>
+        <w:t xml:space="preserve">percent </w:t>
+      </w:r>
+      <w:r>
+        <w:t xml:space="preserve">of notes heard that were </w:t>
+      </w:r>
+      <w:r>
+        <w:t>correct</w:t>
       </w:r>
     </w:p>
     <w:p>
@@ -738,25 +956,7 @@
         <w:spacing w:after="0"/>
       </w:pPr>
       <w:r>
-        <w:t>timing consistency</w:t>
-      </w:r>
-    </w:p>
-    <w:p>
-      <w:r>
-        <w:t>This helps you see your progress over time.</w:t>
-      </w:r>
-    </w:p>
-    <w:p>
-      <w:pPr>
-        <w:pStyle w:val="Heading1"/>
-      </w:pPr>
-      <w:r>
-        <w:t>Advanced Page</w:t>
-      </w:r>
-    </w:p>
-    <w:p>
-      <w:r>
-        <w:t>The Advanced page has extra settings. These are mainly for adults, teachers, or experienced users.</w:t>
+        <w:t>the note range used</w:t>
       </w:r>
     </w:p>
     <w:p>
@@ -765,7 +965,7 @@
         <w:spacing w:after="0"/>
       </w:pPr>
       <w:r>
-        <w:t>Pitch Tolerance</w:t>
+        <w:t>the tempo</w:t>
       </w:r>
     </w:p>
     <w:p>
@@ -774,7 +974,42 @@
         <w:spacing w:after="0"/>
       </w:pPr>
       <w:r>
-        <w:t>RMS Threshold</w:t>
+        <w:t>timing consistency</w:t>
+      </w:r>
+    </w:p>
+    <w:p>
+      <w:r>
+        <w:t>This helps you see your progress over time.</w:t>
+      </w:r>
+    </w:p>
+    <w:p>
+      <w:r>
+        <w:t xml:space="preserve">The data can be sorted </w:t>
+      </w:r>
+      <w:r>
+        <w:t xml:space="preserve">by a long touch on the </w:t>
+      </w:r>
+      <w:r>
+        <w:t xml:space="preserve">heading of any </w:t>
+      </w:r>
+      <w:r>
+        <w:t>colum</w:t>
+      </w:r>
+      <w:r>
+        <w:t>.</w:t>
+      </w:r>
+    </w:p>
+    <w:p>
+      <w:pPr>
+        <w:pStyle w:val="Heading1"/>
+      </w:pPr>
+      <w:r>
+        <w:t>Advanced Page</w:t>
+      </w:r>
+    </w:p>
+    <w:p>
+      <w:r>
+        <w:t>The Advanced page has extra settings. These are mainly for adults, teachers, or experienced users.</w:t>
       </w:r>
     </w:p>
     <w:p>
@@ -783,7 +1018,7 @@
         <w:spacing w:after="0"/>
       </w:pPr>
       <w:r>
-        <w:t>Cooldown</w:t>
+        <w:t>Pitch Tolerance</w:t>
       </w:r>
     </w:p>
     <w:p>
@@ -792,7 +1027,31 @@
         <w:spacing w:after="0"/>
       </w:pPr>
       <w:r>
+        <w:t>RMS Threshold</w:t>
+      </w:r>
+      <w:r>
+        <w:t xml:space="preserve"> – eliminates background noise.</w:t>
+      </w:r>
+    </w:p>
+    <w:p>
+      <w:pPr>
+        <w:pStyle w:val="ListBullet"/>
+        <w:spacing w:after="0"/>
+      </w:pPr>
+      <w:r>
+        <w:t>Cooldown</w:t>
+      </w:r>
+    </w:p>
+    <w:p>
+      <w:pPr>
+        <w:pStyle w:val="ListBullet"/>
+        <w:spacing w:after="0"/>
+      </w:pPr>
+      <w:r>
         <w:t>Pitch Offset</w:t>
+      </w:r>
+      <w:r>
+        <w:t xml:space="preserve"> – to correct the pitch measurement if it should be off.</w:t>
       </w:r>
     </w:p>
     <w:p>
@@ -852,7 +1111,17 @@
         <w:t xml:space="preserve">Reset </w:t>
       </w:r>
       <w:r>
-        <w:t>button to return all settings to the starting values.</w:t>
+        <w:t xml:space="preserve">button to return all settings to the </w:t>
+      </w:r>
+      <w:r>
+        <w:rPr>
+          <w:sz w:val="22"/>
+          <w:szCs w:val="24"/>
+        </w:rPr>
+        <w:t>starting</w:t>
+      </w:r>
+      <w:r>
+        <w:t xml:space="preserve"> values.</w:t>
       </w:r>
     </w:p>
     <w:p>
@@ -1184,18 +1453,33 @@
     </w:p>
     <w:p>
       <w:r>
-        <w:t>If we do, it may skip (exclude) the note when building the random list in two cases:</w:t>
-      </w:r>
-    </w:p>
-    <w:p>
-      <w:r>
-        <w:t xml:space="preserve">The note is already </w:t>
-      </w:r>
-      <w:r>
-        <w:t>mastered</w:t>
-      </w:r>
-      <w:r>
-        <w:t xml:space="preserve">: its accuracy percentage is at or above </w:t>
+        <w:t xml:space="preserve">If we do, </w:t>
+      </w:r>
+      <w:r>
+        <w:t>we</w:t>
+      </w:r>
+      <w:r>
+        <w:t xml:space="preserve"> </w:t>
+      </w:r>
+      <w:r>
+        <w:t>will</w:t>
+      </w:r>
+      <w:r>
+        <w:t xml:space="preserve"> skip (exclude) the note when building the random list </w:t>
+      </w:r>
+      <w:r>
+        <w:t xml:space="preserve">if it is already mastered. </w:t>
+      </w:r>
+    </w:p>
+    <w:p>
+      <w:pPr>
+        <w:ind w:firstLine="720"/>
+      </w:pPr>
+      <w:r>
+        <w:t>i.e.</w:t>
+      </w:r>
+      <w:r>
+        <w:t xml:space="preserve"> its accuracy percentage is at or above </w:t>
       </w:r>
       <w:r>
         <w:rPr>
@@ -1204,7 +1488,15 @@
         <w:t>CorrectThreshold</w:t>
       </w:r>
       <w:r>
-        <w:t xml:space="preserve"> AND it has been answered correctly at least </w:t>
+        <w:t xml:space="preserve"> AND </w:t>
+      </w:r>
+    </w:p>
+    <w:p>
+      <w:pPr>
+        <w:ind w:firstLine="720"/>
+      </w:pPr>
+      <w:r>
+        <w:t xml:space="preserve">it has been answered correctly at least </w:t>
       </w:r>
       <w:r>
         <w:rPr>
@@ -1213,26 +1505,21 @@
         <w:t>MinCorrectCount</w:t>
       </w:r>
       <w:r>
-        <w:t xml:space="preserve"> times. In other words, “we’ve practiced this enough and you’re accurate, so don’t include it.”</w:t>
-      </w:r>
-    </w:p>
-    <w:p>
-      <w:r>
-        <w:t xml:space="preserve">The note is fast enough to treat as mastered: </w:t>
-      </w:r>
-      <w:r>
-        <w:rPr>
-          <w:u w:val="single"/>
-        </w:rPr>
-        <w:t>OmitMsAvgThreshold</w:t>
-      </w:r>
-      <w:r>
-        <w:t xml:space="preserve"> is set, the note has been played at least once, and the note’s average response time is less than that threshold (in milliseconds). In other words, “you play this quickly on average, so skip it.”</w:t>
-      </w:r>
-    </w:p>
-    <w:p>
-      <w:r>
-        <w:t>If neither case applies, the note stays in the pool.</w:t>
+        <w:t xml:space="preserve"> times</w:t>
+      </w:r>
+      <w:r>
+        <w:t xml:space="preserve"> AND </w:t>
+      </w:r>
+    </w:p>
+    <w:p>
+      <w:pPr>
+        <w:ind w:left="720"/>
+      </w:pPr>
+      <w:r>
+        <w:t>its average milliseconds is less that the threshold</w:t>
+      </w:r>
+      <w:r>
+        <w:t>. In other words, “we’ve practiced this enough and you’re accurate, so don’t include it.”</w:t>
       </w:r>
     </w:p>
     <w:p>
@@ -1590,7 +1877,7 @@
   <w:abstractNum w:abstractNumId="8" w15:restartNumberingAfterBreak="0">
     <w:nsid w:val="FFFFFF89"/>
     <w:multiLevelType w:val="singleLevel"/>
-    <w:tmpl w:val="29761A62"/>
+    <w:tmpl w:val="62109DBE"/>
     <w:lvl w:ilvl="0">
       <w:start w:val="1"/>
       <w:numFmt w:val="bullet"/>

</xml_diff>

<commit_message>
Improved the color dialog.
</commit_message>
<xml_diff>
--- a/About.docx
+++ b/About.docx
@@ -38,16 +38,7 @@
           <w:sz w:val="18"/>
           <w:szCs w:val="18"/>
         </w:rPr>
-        <w:t>April</w:t>
-      </w:r>
-      <w:r>
-        <w:rPr>
-          <w:b w:val="0"/>
-          <w:bCs/>
-          <w:sz w:val="18"/>
-          <w:szCs w:val="18"/>
-        </w:rPr>
-        <w:t xml:space="preserve"> 29</w:t>
+        <w:t>May 5</w:t>
       </w:r>
       <w:r>
         <w:rPr>
@@ -145,6 +136,15 @@
               <w:spacing w:after="0"/>
             </w:pPr>
             <w:r>
+              <w:t>2. Pick the key for the scale</w:t>
+            </w:r>
+          </w:p>
+          <w:p>
+            <w:pPr>
+              <w:pStyle w:val="ListBullet"/>
+              <w:spacing w:after="0"/>
+            </w:pPr>
+            <w:r>
               <w:t>2. Choose a tune or scale.</w:t>
             </w:r>
           </w:p>
@@ -154,7 +154,13 @@
               <w:spacing w:after="0"/>
             </w:pPr>
             <w:r>
-              <w:t>3. Tap Listen.</w:t>
+              <w:t xml:space="preserve">3. Tap </w:t>
+            </w:r>
+            <w:r>
+              <w:t>the green button</w:t>
+            </w:r>
+            <w:r>
+              <w:t>.</w:t>
             </w:r>
           </w:p>
           <w:p>
@@ -286,6 +292,64 @@
         <w:pStyle w:val="Heading2"/>
       </w:pPr>
       <w:r>
+        <w:t>Instrument</w:t>
+      </w:r>
+    </w:p>
+    <w:p>
+      <w:r>
+        <w:t>Choose the instrument you play. Music Mate remembers your choice for next time.</w:t>
+      </w:r>
+    </w:p>
+    <w:p>
+      <w:pPr>
+        <w:pStyle w:val="Heading2"/>
+      </w:pPr>
+      <w:r>
+        <w:t>Key</w:t>
+      </w:r>
+    </w:p>
+    <w:p>
+      <w:r>
+        <w:t xml:space="preserve">Choose the key signature </w:t>
+      </w:r>
+      <w:r>
+        <w:t xml:space="preserve">in which </w:t>
+      </w:r>
+      <w:r>
+        <w:t>you want to practice. For transposing instruments, the app shows the music in the right key for your instrument.</w:t>
+      </w:r>
+    </w:p>
+    <w:p>
+      <w:pPr>
+        <w:pStyle w:val="Heading2"/>
+      </w:pPr>
+      <w:r>
+        <w:t>Concert Key</w:t>
+      </w:r>
+    </w:p>
+    <w:p>
+      <w:r>
+        <w:t>The concert key is also shown in case it is needed.</w:t>
+      </w:r>
+    </w:p>
+    <w:p>
+      <w:pPr>
+        <w:pStyle w:val="Heading2"/>
+      </w:pPr>
+      <w:r>
+        <w:t>Major</w:t>
+      </w:r>
+    </w:p>
+    <w:p>
+      <w:r>
+        <w:t>The Major scale is the default value of the many practice modes in this picker.</w:t>
+      </w:r>
+    </w:p>
+    <w:p>
+      <w:pPr>
+        <w:pStyle w:val="Heading2"/>
+      </w:pPr>
+      <w:r>
         <w:t>Notes on the staff</w:t>
       </w:r>
     </w:p>
@@ -336,62 +400,15 @@
     </w:p>
     <w:p>
       <w:pPr>
-        <w:pStyle w:val="Heading1"/>
-      </w:pPr>
-      <w:r>
-        <w:t>Main Controls</w:t>
-      </w:r>
-    </w:p>
-    <w:p>
-      <w:pPr>
         <w:pStyle w:val="Heading2"/>
       </w:pPr>
       <w:r>
-        <w:t>Instrument</w:t>
-      </w:r>
-    </w:p>
-    <w:p>
-      <w:r>
-        <w:t>Choose the instrument you play. Music Mate remembers your choice for next time.</w:t>
-      </w:r>
-    </w:p>
-    <w:p>
-      <w:pPr>
-        <w:pStyle w:val="Heading2"/>
-      </w:pPr>
-      <w:r>
-        <w:t>Key</w:t>
-      </w:r>
-    </w:p>
-    <w:p>
-      <w:r>
-        <w:t>Choose the key signature you want to practice in. For transposing instruments, the app shows the music in the right key for your instrument.</w:t>
-      </w:r>
-    </w:p>
-    <w:p>
-      <w:pPr>
-        <w:pStyle w:val="Heading2"/>
-      </w:pPr>
-      <w:r>
-        <w:t>Concert Key</w:t>
-      </w:r>
-    </w:p>
-    <w:p>
-      <w:r>
-        <w:t>If needed, the concert key is also shown.</w:t>
-      </w:r>
-    </w:p>
-    <w:p>
-      <w:pPr>
-        <w:pStyle w:val="Heading2"/>
-      </w:pPr>
-      <w:r>
-        <w:t>Major</w:t>
-      </w:r>
-    </w:p>
-    <w:p>
-      <w:r>
-        <w:t>The Major scale is the default value of the many practice modes in this picker.</w:t>
+        <w:t>Auto Play</w:t>
+      </w:r>
+    </w:p>
+    <w:p>
+      <w:r>
+        <w:t>Tap the green triangle button to make the ‘phone play the notes. This can help you learn how a scale or exercise should sound. While the notes are playing, the button turns red.</w:t>
       </w:r>
     </w:p>
     <w:p>
@@ -443,18 +460,33 @@
         <w:pStyle w:val="Heading2"/>
       </w:pPr>
       <w:r>
-        <w:t>Auto Play</w:t>
-      </w:r>
-    </w:p>
-    <w:p>
-      <w:r>
-        <w:t xml:space="preserve">Tap the green triangle button to </w:t>
-      </w:r>
-      <w:r>
-        <w:t>make the ‘phone play the notes.</w:t>
-      </w:r>
-      <w:r>
-        <w:t xml:space="preserve"> This can help you learn how a scale or exercise should sound. While the notes are playing, the button turns red.</w:t>
+        <w:t>Repeat New</w:t>
+      </w:r>
+      <w:r>
+        <w:t xml:space="preserve"> – this is visible only in Random mode</w:t>
+      </w:r>
+    </w:p>
+    <w:p>
+      <w:r>
+        <w:t>Toggle to green to make it automatically generate a new random pat</w:t>
+      </w:r>
+      <w:r>
+        <w:t>t</w:t>
+      </w:r>
+      <w:r>
+        <w:t>ern  a few seconds</w:t>
+      </w:r>
+      <w:r>
+        <w:t xml:space="preserve"> after </w:t>
+      </w:r>
+      <w:r>
+        <w:t>reaching the end</w:t>
+      </w:r>
+      <w:r>
+        <w:t>.</w:t>
+      </w:r>
+      <w:r>
+        <w:t xml:space="preserve"> It will automatically start listening again at the beginning.</w:t>
       </w:r>
     </w:p>
     <w:p>
@@ -462,41 +494,28 @@
         <w:pStyle w:val="Heading2"/>
       </w:pPr>
       <w:r>
+        <w:t>Repeat</w:t>
+      </w:r>
+    </w:p>
+    <w:p>
+      <w:r>
+        <w:t>Toggle to green to make it start listening from the beginning  a few seconds</w:t>
+      </w:r>
+      <w:r>
+        <w:t xml:space="preserve"> after reaching the end.</w:t>
+      </w:r>
+    </w:p>
+    <w:p>
+      <w:pPr>
+        <w:pStyle w:val="Heading2"/>
+      </w:pPr>
+      <w:r>
         <w:t>Background Color</w:t>
       </w:r>
     </w:p>
     <w:p>
       <w:r>
-        <w:t>You can change the background color of the staff area. Choose a color you like, then tap OK.</w:t>
-      </w:r>
-      <w:r>
-        <w:t xml:space="preserve"> Other pages use the chosen color for their background</w:t>
-      </w:r>
-    </w:p>
-    <w:p>
-      <w:pPr>
-        <w:pStyle w:val="Heading2"/>
-      </w:pPr>
-      <w:r>
-        <w:t>Repeat New</w:t>
-      </w:r>
-    </w:p>
-    <w:p>
-      <w:r>
-        <w:t>Toggle to green to make it automatically generate a new random patern after a few seconds.</w:t>
-      </w:r>
-    </w:p>
-    <w:p>
-      <w:pPr>
-        <w:pStyle w:val="Heading2"/>
-      </w:pPr>
-      <w:r>
-        <w:t>Repeat</w:t>
-      </w:r>
-    </w:p>
-    <w:p>
-      <w:r>
-        <w:t>Toggle to green to make it start listening from the beginning after a few seconds.</w:t>
+        <w:t>You can change the background color of the staff area. Choose a color you like, then tap OK. Other pages use the chosen color for their background</w:t>
       </w:r>
     </w:p>
     <w:p>
@@ -667,6 +686,85 @@
     </w:p>
     <w:p>
       <w:pPr>
+        <w:pStyle w:val="Heading3"/>
+      </w:pPr>
+      <w:r>
+        <w:t>How does it know how well you know the notes?</w:t>
+      </w:r>
+    </w:p>
+    <w:p>
+      <w:r>
+        <w:t>You can choose one of two methods</w:t>
+      </w:r>
+      <w:r>
+        <w:t xml:space="preserve"> in the picker at the top right of the Settings page</w:t>
+      </w:r>
+    </w:p>
+    <w:p>
+      <w:pPr>
+        <w:pStyle w:val="Heading4"/>
+        <w:ind w:left="720"/>
+      </w:pPr>
+      <w:r>
+        <w:t>%Correct</w:t>
+      </w:r>
+    </w:p>
+    <w:p>
+      <w:pPr>
+        <w:ind w:left="720"/>
+      </w:pPr>
+      <w:r>
+        <w:t>Of all the times you have played this note Music Mate knows what percentage were correct. If this is bigger that the threshold that you have set the note will not be included in the random tunes. This threshold is set by a slide</w:t>
+      </w:r>
+      <w:r>
+        <w:t>r</w:t>
+      </w:r>
+      <w:r>
+        <w:t xml:space="preserve"> called ‘Omit &gt;= % correct’ on the Settings page. </w:t>
+      </w:r>
+    </w:p>
+    <w:p>
+      <w:pPr>
+        <w:ind w:left="720"/>
+      </w:pPr>
+      <w:r>
+        <w:t>It also keeps track of the time you took to play the note. If the average of these times is greater than a threshold the note will be included regardless of the  %</w:t>
+      </w:r>
+      <w:r>
+        <w:t>C</w:t>
+      </w:r>
+      <w:r>
+        <w:t>orrect. This threshold is set by a slider labelled “Omit below MsAvg”</w:t>
+      </w:r>
+    </w:p>
+    <w:p>
+      <w:pPr>
+        <w:pStyle w:val="Heading4"/>
+        <w:ind w:left="720"/>
+      </w:pPr>
+      <w:r>
+        <w:t>Streak</w:t>
+      </w:r>
+    </w:p>
+    <w:p>
+      <w:pPr>
+        <w:ind w:left="720"/>
+      </w:pPr>
+      <w:r>
+        <w:t xml:space="preserve">Each note has a streak value. This is the number of </w:t>
+      </w:r>
+      <w:r>
+        <w:t xml:space="preserve">successive </w:t>
+      </w:r>
+      <w:r>
+        <w:t>time</w:t>
+      </w:r>
+      <w:r>
+        <w:t>s the note was played correctly. If the note is ever wrong then the streak value goes back to zero. There is a slider for streak on the settings page which sets the threshold. Notes with streak  at or above the threshold are not included in the random tune.</w:t>
+      </w:r>
+    </w:p>
+    <w:p>
+      <w:pPr>
         <w:pStyle w:val="Heading2"/>
       </w:pPr>
       <w:r>
@@ -712,7 +810,7 @@
         <w:spacing w:after="0"/>
       </w:pPr>
       <w:r>
-        <w:t>Playback BPM - change the speed of Auto Play</w:t>
+        <w:t>Mastered – choose the method for omitting notes from random tunes.</w:t>
       </w:r>
     </w:p>
     <w:p>
@@ -721,22 +819,7 @@
         <w:spacing w:after="0"/>
       </w:pPr>
       <w:r>
-        <w:t>Accidental % - choose how many</w:t>
-      </w:r>
-      <w:r>
-        <w:t xml:space="preserve"> notes are converted to random</w:t>
-      </w:r>
-      <w:r>
-        <w:t xml:space="preserve"> accidentals </w:t>
-      </w:r>
-      <w:r>
-        <w:t xml:space="preserve">in a </w:t>
-      </w:r>
-      <w:r>
-        <w:t xml:space="preserve">Random </w:t>
-      </w:r>
-      <w:r>
-        <w:t>practice mode.</w:t>
+        <w:t>Playback BPM - change the speed of Auto Play</w:t>
       </w:r>
     </w:p>
     <w:p>
@@ -745,7 +828,22 @@
         <w:spacing w:after="0"/>
       </w:pPr>
       <w:r>
-        <w:t>Omit notes at/above % correct - leave out notes you already know well</w:t>
+        <w:t>Accidental % - choose how many</w:t>
+      </w:r>
+      <w:r>
+        <w:t xml:space="preserve"> notes are converted to random</w:t>
+      </w:r>
+      <w:r>
+        <w:t xml:space="preserve"> accidentals </w:t>
+      </w:r>
+      <w:r>
+        <w:t xml:space="preserve">in a </w:t>
+      </w:r>
+      <w:r>
+        <w:t xml:space="preserve">Random </w:t>
+      </w:r>
+      <w:r>
+        <w:t>practice mode.</w:t>
       </w:r>
     </w:p>
     <w:p>
@@ -754,7 +852,78 @@
         <w:spacing w:after="0"/>
       </w:pPr>
       <w:r>
-        <w:t>Minimum Correct Count - require enough correct plays before a note counts as learned</w:t>
+        <w:t>Th</w:t>
+      </w:r>
+      <w:r>
+        <w:t xml:space="preserve">e next </w:t>
+      </w:r>
+      <w:r>
+        <w:t xml:space="preserve"> slider </w:t>
+      </w:r>
+      <w:r>
+        <w:t xml:space="preserve">is to </w:t>
+      </w:r>
+      <w:r>
+        <w:t>leave out notes you already know well</w:t>
+      </w:r>
+      <w:r>
+        <w:t>.</w:t>
+      </w:r>
+      <w:r>
+        <w:br/>
+        <w:t xml:space="preserve">It </w:t>
+      </w:r>
+      <w:r>
+        <w:t>will change according to the Master</w:t>
+      </w:r>
+      <w:r>
+        <w:t>ed</w:t>
+      </w:r>
+      <w:r>
+        <w:t xml:space="preserve"> choice</w:t>
+      </w:r>
+      <w:r>
+        <w:t>.</w:t>
+      </w:r>
+    </w:p>
+    <w:p>
+      <w:pPr>
+        <w:pStyle w:val="ListBullet"/>
+        <w:tabs>
+          <w:tab w:val="clear" w:pos="360"/>
+          <w:tab w:val="num" w:pos="720"/>
+        </w:tabs>
+        <w:spacing w:after="0"/>
+        <w:ind w:left="720"/>
+      </w:pPr>
+      <w:r>
+        <w:t xml:space="preserve">Omit notes at/above % correct </w:t>
+      </w:r>
+      <w:r>
+        <w:t>–</w:t>
+      </w:r>
+      <w:r>
+        <w:t xml:space="preserve"> </w:t>
+      </w:r>
+      <w:r>
+        <w:t>OR</w:t>
+      </w:r>
+    </w:p>
+    <w:p>
+      <w:pPr>
+        <w:pStyle w:val="ListBullet"/>
+        <w:tabs>
+          <w:tab w:val="clear" w:pos="360"/>
+          <w:tab w:val="num" w:pos="720"/>
+        </w:tabs>
+        <w:spacing w:after="0"/>
+        <w:ind w:left="720"/>
+      </w:pPr>
+      <w:r>
+        <w:t>Streak – Will omit notes with streaks at/above this value.</w:t>
+      </w:r>
+      <w:r>
+        <w:t xml:space="preserve"> </w:t>
       </w:r>
     </w:p>
     <w:p>
@@ -763,22 +932,38 @@
         <w:spacing w:after="0"/>
       </w:pPr>
       <w:r>
-        <w:t>Include</w:t>
-      </w:r>
-      <w:r>
-        <w:t xml:space="preserve"> notes </w:t>
-      </w:r>
-      <w:r>
-        <w:t>with</w:t>
-      </w:r>
-      <w:r>
-        <w:t xml:space="preserve"> MsAvg </w:t>
-      </w:r>
-      <w:r>
-        <w:t xml:space="preserve"> above this value</w:t>
-      </w:r>
-      <w:r>
-        <w:t>.</w:t>
+        <w:t>Two sliders visible only in Streak mode:</w:t>
+      </w:r>
+    </w:p>
+    <w:p>
+      <w:pPr>
+        <w:pStyle w:val="ListBullet"/>
+        <w:tabs>
+          <w:tab w:val="clear" w:pos="360"/>
+          <w:tab w:val="num" w:pos="720"/>
+        </w:tabs>
+        <w:spacing w:after="0"/>
+        <w:ind w:left="720"/>
+      </w:pPr>
+      <w:r>
+        <w:t>Minimum Correct Count - require enough correct plays before a note counts as learned</w:t>
+      </w:r>
+    </w:p>
+    <w:p>
+      <w:pPr>
+        <w:pStyle w:val="ListBullet"/>
+        <w:tabs>
+          <w:tab w:val="clear" w:pos="360"/>
+          <w:tab w:val="num" w:pos="720"/>
+        </w:tabs>
+        <w:spacing w:after="0"/>
+        <w:ind w:left="720"/>
+      </w:pPr>
+      <w:r>
+        <w:t>Include notes with MsAvg  above this value</w:t>
+      </w:r>
+      <w:r>
+        <w:t>, regardles of %Correct.</w:t>
       </w:r>
     </w:p>
     <w:p>
@@ -817,31 +1002,22 @@
         <w:spacing w:after="0"/>
       </w:pPr>
       <w:r>
-        <w:t>Reset  all settings on this, Home, and Advanced pages</w:t>
-      </w:r>
-      <w:r>
-        <w:t xml:space="preserve"> to defaults.</w:t>
-      </w:r>
-    </w:p>
-    <w:p>
-      <w:pPr>
-        <w:pStyle w:val="Heading1"/>
-      </w:pPr>
-      <w:r>
-        <w:t>Statistics Page</w:t>
-      </w:r>
-    </w:p>
-    <w:p>
-      <w:r>
-        <w:t>The Statistics page shows how you have been doing.</w:t>
-      </w:r>
-    </w:p>
-    <w:p>
-      <w:pPr>
-        <w:pStyle w:val="Heading2"/>
-      </w:pPr>
-      <w:r>
-        <w:t>Note Data</w:t>
+        <w:t>Max Session DataBase – here you can set a  limit on the amount memory</w:t>
+      </w:r>
+      <w:r>
+        <w:t xml:space="preserve"> used by </w:t>
+      </w:r>
+      <w:r>
+        <w:t xml:space="preserve">of </w:t>
+      </w:r>
+      <w:r>
+        <w:t>S</w:t>
+      </w:r>
+      <w:r>
+        <w:t>ession data</w:t>
+      </w:r>
+      <w:r>
+        <w:t>.</w:t>
       </w:r>
     </w:p>
     <w:p>
@@ -850,10 +1026,31 @@
         <w:spacing w:after="0"/>
       </w:pPr>
       <w:r>
-        <w:t>the note name</w:t>
-      </w:r>
-      <w:r>
-        <w:t xml:space="preserve"> and octave number</w:t>
+        <w:t>Reset  all settings on this, Home, and Advanced pages</w:t>
+      </w:r>
+      <w:r>
+        <w:t xml:space="preserve"> to defaults.</w:t>
+      </w:r>
+    </w:p>
+    <w:p>
+      <w:pPr>
+        <w:pStyle w:val="Heading1"/>
+      </w:pPr>
+      <w:r>
+        <w:t>Statistics Page</w:t>
+      </w:r>
+    </w:p>
+    <w:p>
+      <w:r>
+        <w:t>The Statistics page shows how you have been doing.</w:t>
+      </w:r>
+    </w:p>
+    <w:p>
+      <w:pPr>
+        <w:pStyle w:val="Heading2"/>
+      </w:pPr>
+      <w:r>
+        <w:t>Note Data</w:t>
       </w:r>
     </w:p>
     <w:p>
@@ -862,10 +1059,10 @@
         <w:spacing w:after="0"/>
       </w:pPr>
       <w:r>
-        <w:t>how many times it was correct</w:t>
-      </w:r>
-      <w:r>
-        <w:t xml:space="preserve"> </w:t>
+        <w:t>the note name</w:t>
+      </w:r>
+      <w:r>
+        <w:t xml:space="preserve"> and octave number</w:t>
       </w:r>
     </w:p>
     <w:p>
@@ -874,7 +1071,10 @@
         <w:spacing w:after="0"/>
       </w:pPr>
       <w:r>
-        <w:t>how many times it was wrong</w:t>
+        <w:t>how many times it was correct</w:t>
+      </w:r>
+      <w:r>
+        <w:t xml:space="preserve"> </w:t>
       </w:r>
     </w:p>
     <w:p>
@@ -883,7 +1083,7 @@
         <w:spacing w:after="0"/>
       </w:pPr>
       <w:r>
-        <w:t>the percent correct</w:t>
+        <w:t>how many times it was wrong</w:t>
       </w:r>
     </w:p>
     <w:p>
@@ -892,20 +1092,7 @@
         <w:spacing w:after="0"/>
       </w:pPr>
       <w:r>
-        <w:t xml:space="preserve"> the average number of milliseconds to play correctly.</w:t>
-      </w:r>
-    </w:p>
-    <w:p>
-      <w:pPr>
-        <w:pStyle w:val="Heading2"/>
-      </w:pPr>
-      <w:r>
-        <w:t>Session Data</w:t>
-      </w:r>
-    </w:p>
-    <w:p>
-      <w:r>
-        <w:t>A session is completed when you play all the notes on the staff correctly, in order.</w:t>
+        <w:t>the percent correct</w:t>
       </w:r>
     </w:p>
     <w:p>
@@ -914,7 +1101,7 @@
         <w:spacing w:after="0"/>
       </w:pPr>
       <w:r>
-        <w:t>the date and time</w:t>
+        <w:t xml:space="preserve"> the average number of milliseconds to play correctly</w:t>
       </w:r>
     </w:p>
     <w:p>
@@ -923,7 +1110,20 @@
         <w:spacing w:after="0"/>
       </w:pPr>
       <w:r>
-        <w:t>the tune or scale used</w:t>
+        <w:t>Streak – how many consecutive times the note was played correcly</w:t>
+      </w:r>
+    </w:p>
+    <w:p>
+      <w:pPr>
+        <w:pStyle w:val="Heading2"/>
+      </w:pPr>
+      <w:r>
+        <w:t>Session Data</w:t>
+      </w:r>
+    </w:p>
+    <w:p>
+      <w:r>
+        <w:t>A session is completed when you play all the notes on the staff correctly, in order.</w:t>
       </w:r>
     </w:p>
     <w:p>
@@ -932,7 +1132,7 @@
         <w:spacing w:after="0"/>
       </w:pPr>
       <w:r>
-        <w:t>the key</w:t>
+        <w:t>date and time</w:t>
       </w:r>
     </w:p>
     <w:p>
@@ -941,13 +1141,7 @@
         <w:spacing w:after="0"/>
       </w:pPr>
       <w:r>
-        <w:t xml:space="preserve">percent </w:t>
-      </w:r>
-      <w:r>
-        <w:t xml:space="preserve">of notes heard that were </w:t>
-      </w:r>
-      <w:r>
-        <w:t>correct</w:t>
+        <w:t>tune or scale used</w:t>
       </w:r>
     </w:p>
     <w:p>
@@ -956,7 +1150,10 @@
         <w:spacing w:after="0"/>
       </w:pPr>
       <w:r>
-        <w:t>the note range used</w:t>
+        <w:t>key</w:t>
+      </w:r>
+      <w:r>
+        <w:t xml:space="preserve"> in which the music is written</w:t>
       </w:r>
     </w:p>
     <w:p>
@@ -965,7 +1162,13 @@
         <w:spacing w:after="0"/>
       </w:pPr>
       <w:r>
-        <w:t>the tempo</w:t>
+        <w:t xml:space="preserve">percent </w:t>
+      </w:r>
+      <w:r>
+        <w:t xml:space="preserve">of notes heard that were </w:t>
+      </w:r>
+      <w:r>
+        <w:t>correct</w:t>
       </w:r>
     </w:p>
     <w:p>
@@ -974,12 +1177,71 @@
         <w:spacing w:after="0"/>
       </w:pPr>
       <w:r>
-        <w:t>timing consistency</w:t>
-      </w:r>
-    </w:p>
-    <w:p>
-      <w:r>
-        <w:t>This helps you see your progress over time.</w:t>
+        <w:t>tempo</w:t>
+      </w:r>
+      <w:r>
+        <w:t xml:space="preserve"> at which it was played</w:t>
+      </w:r>
+    </w:p>
+    <w:p>
+      <w:pPr>
+        <w:pStyle w:val="ListBullet"/>
+        <w:spacing w:after="0"/>
+      </w:pPr>
+      <w:r>
+        <w:t>t</w:t>
+      </w:r>
+      <w:r>
+        <w:t>empo</w:t>
+      </w:r>
+      <w:r>
+        <w:t xml:space="preserve"> consistency</w:t>
+      </w:r>
+      <w:r>
+        <w:t xml:space="preserve"> (%)</w:t>
+      </w:r>
+    </w:p>
+    <w:p>
+      <w:pPr>
+        <w:pStyle w:val="ListBullet"/>
+        <w:spacing w:after="0"/>
+      </w:pPr>
+      <w:r>
+        <w:t>key of the instrument</w:t>
+      </w:r>
+    </w:p>
+    <w:p>
+      <w:pPr>
+        <w:pStyle w:val="ListBullet"/>
+      </w:pPr>
+      <w:r>
+        <w:t xml:space="preserve">range </w:t>
+      </w:r>
+      <w:r>
+        <w:t>of notes</w:t>
+      </w:r>
+    </w:p>
+    <w:p>
+      <w:pPr>
+        <w:pStyle w:val="ListBullet"/>
+        <w:spacing w:after="0"/>
+      </w:pPr>
+      <w:r>
+        <w:t>tempo standard deviation (bpm)</w:t>
+      </w:r>
+      <w:r>
+        <w:br/>
+      </w:r>
+    </w:p>
+    <w:p>
+      <w:r>
+        <w:t>Th</w:t>
+      </w:r>
+      <w:r>
+        <w:t>ese data</w:t>
+      </w:r>
+      <w:r>
+        <w:t xml:space="preserve"> help you see your progress over time.</w:t>
       </w:r>
     </w:p>
     <w:p>
@@ -987,7 +1249,16 @@
         <w:t xml:space="preserve">The data can be sorted </w:t>
       </w:r>
       <w:r>
-        <w:t xml:space="preserve">by a long touch on the </w:t>
+        <w:t xml:space="preserve">(ascending or descending) </w:t>
+      </w:r>
+      <w:r>
+        <w:t>by  long touch</w:t>
+      </w:r>
+      <w:r>
+        <w:t>es</w:t>
+      </w:r>
+      <w:r>
+        <w:t xml:space="preserve"> on the </w:t>
       </w:r>
       <w:r>
         <w:t xml:space="preserve">heading of any </w:t>
@@ -1152,7 +1423,15 @@
         <w:spacing w:after="0"/>
       </w:pPr>
       <w:r>
-        <w:t>search for words in the About text</w:t>
+        <w:t>search the  text</w:t>
+      </w:r>
+    </w:p>
+    <w:p>
+      <w:pPr>
+        <w:pStyle w:val="ListBullet"/>
+      </w:pPr>
+      <w:r>
+        <w:t>go to the next search result</w:t>
       </w:r>
     </w:p>
     <w:p>
@@ -1161,7 +1440,19 @@
         <w:spacing w:after="0"/>
       </w:pPr>
       <w:r>
-        <w:t>go to the next search result</w:t>
+        <w:t>buy the Premium version</w:t>
+      </w:r>
+      <w:r>
+        <w:t xml:space="preserve"> or </w:t>
+      </w:r>
+      <w:r>
+        <w:t xml:space="preserve">see </w:t>
+      </w:r>
+      <w:r>
+        <w:t>that</w:t>
+      </w:r>
+      <w:r>
+        <w:t xml:space="preserve"> Premium is active</w:t>
       </w:r>
     </w:p>
     <w:p>
@@ -1170,7 +1461,7 @@
         <w:spacing w:after="0"/>
       </w:pPr>
       <w:r>
-        <w:t>learn what the app does</w:t>
+        <w:t>See brief quick start instructions</w:t>
       </w:r>
     </w:p>
     <w:p>
@@ -1179,7 +1470,7 @@
         <w:spacing w:after="0"/>
       </w:pPr>
       <w:r>
-        <w:t>read about features and limits</w:t>
+        <w:t>learn what the app does</w:t>
       </w:r>
     </w:p>
     <w:p>
@@ -1188,7 +1479,7 @@
         <w:spacing w:after="0"/>
       </w:pPr>
       <w:r>
-        <w:t>buy the Premium version</w:t>
+        <w:t>read about features and limits</w:t>
       </w:r>
     </w:p>
     <w:p>
@@ -1197,7 +1488,43 @@
         <w:spacing w:after="0"/>
       </w:pPr>
       <w:r>
-        <w:t>see whether Premium is active</w:t>
+        <w:t>find support information</w:t>
+      </w:r>
+    </w:p>
+    <w:p>
+      <w:pPr>
+        <w:pStyle w:val="Heading1"/>
+      </w:pPr>
+      <w:r>
+        <w:t>Premium Version</w:t>
+      </w:r>
+    </w:p>
+    <w:p>
+      <w:r>
+        <w:t>Some features are available only in the Premium version. Premium may include accidentals, keys with more than 3 sharps or flats, and other extra features.</w:t>
+      </w:r>
+    </w:p>
+    <w:p>
+      <w:r>
+        <w:t>If you choose a Premium-only feature while using the free version, a message may appear. An adult can decide whether to buy Premium or keep using the free setting.</w:t>
+      </w:r>
+    </w:p>
+    <w:p>
+      <w:r>
+        <w:t>Premium is a lifetime purchase and includes future app updates.</w:t>
+      </w:r>
+    </w:p>
+    <w:p>
+      <w:pPr>
+        <w:pStyle w:val="Heading1"/>
+      </w:pPr>
+      <w:r>
+        <w:t>Things to Know</w:t>
+      </w:r>
+    </w:p>
+    <w:p>
+      <w:r>
+        <w:t>Music Mate is always improving, but sound detection is not perfect yet.</w:t>
       </w:r>
     </w:p>
     <w:p>
@@ -1206,43 +1533,7 @@
         <w:spacing w:after="0"/>
       </w:pPr>
       <w:r>
-        <w:t>find support information</w:t>
-      </w:r>
-    </w:p>
-    <w:p>
-      <w:pPr>
-        <w:pStyle w:val="Heading1"/>
-      </w:pPr>
-      <w:r>
-        <w:t>Premium Version</w:t>
-      </w:r>
-    </w:p>
-    <w:p>
-      <w:r>
-        <w:t>Some features are available only in the Premium version. Premium may include accidentals, keys with more than 3 sharps or flats, and other extra features.</w:t>
-      </w:r>
-    </w:p>
-    <w:p>
-      <w:r>
-        <w:t>If you choose a Premium-only feature while using the free version, a message may appear. An adult can decide whether to buy Premium or keep using the free setting.</w:t>
-      </w:r>
-    </w:p>
-    <w:p>
-      <w:r>
-        <w:t>Premium is a lifetime purchase and includes future app updates.</w:t>
-      </w:r>
-    </w:p>
-    <w:p>
-      <w:pPr>
-        <w:pStyle w:val="Heading1"/>
-      </w:pPr>
-      <w:r>
-        <w:t>Things to Know</w:t>
-      </w:r>
-    </w:p>
-    <w:p>
-      <w:r>
-        <w:t>Music Mate is always improving, but sound detection is not perfect yet.</w:t>
+        <w:t>a note in the wrong octave may be accepted</w:t>
       </w:r>
     </w:p>
     <w:p>
@@ -1251,7 +1542,7 @@
         <w:spacing w:after="0"/>
       </w:pPr>
       <w:r>
-        <w:t>a note in the wrong octave may be accepted</w:t>
+        <w:t>very low or very high notes may be harder to detect</w:t>
       </w:r>
     </w:p>
     <w:p>
@@ -1260,7 +1551,20 @@
         <w:spacing w:after="0"/>
       </w:pPr>
       <w:r>
-        <w:t>very low or very high notes may be harder to detect</w:t>
+        <w:t>your % correct may look a little lower than expected</w:t>
+      </w:r>
+    </w:p>
+    <w:p>
+      <w:r>
+        <w:t>We are continuing to improve the app.</w:t>
+      </w:r>
+    </w:p>
+    <w:p>
+      <w:pPr>
+        <w:pStyle w:val="Heading1"/>
+      </w:pPr>
+      <w:r>
+        <w:t>Tips for Success</w:t>
       </w:r>
     </w:p>
     <w:p>
@@ -1269,20 +1573,7 @@
         <w:spacing w:after="0"/>
       </w:pPr>
       <w:r>
-        <w:t>your % correct may look a little lower than expected</w:t>
-      </w:r>
-    </w:p>
-    <w:p>
-      <w:r>
-        <w:t>We are continuing to improve the app.</w:t>
-      </w:r>
-    </w:p>
-    <w:p>
-      <w:pPr>
-        <w:pStyle w:val="Heading1"/>
-      </w:pPr>
-      <w:r>
-        <w:t>Tips for Success</w:t>
+        <w:t>Start with a comfortable note range.</w:t>
       </w:r>
     </w:p>
     <w:p>
@@ -1291,7 +1582,7 @@
         <w:spacing w:after="0"/>
       </w:pPr>
       <w:r>
-        <w:t>Start with a comfortable note range.</w:t>
+        <w:t>Practice slowly at first.</w:t>
       </w:r>
     </w:p>
     <w:p>
@@ -1300,7 +1591,7 @@
         <w:spacing w:after="0"/>
       </w:pPr>
       <w:r>
-        <w:t>Practice slowly at first.</w:t>
+        <w:t>Use Auto Play to hear how notes should sound.</w:t>
       </w:r>
     </w:p>
     <w:p>
@@ -1309,7 +1600,7 @@
         <w:spacing w:after="0"/>
       </w:pPr>
       <w:r>
-        <w:t>Use Auto Play to hear how notes should sound.</w:t>
+        <w:t>Watch for green boxes.</w:t>
       </w:r>
     </w:p>
     <w:p>
@@ -1318,7 +1609,7 @@
         <w:spacing w:after="0"/>
       </w:pPr>
       <w:r>
-        <w:t>Watch for green boxes.</w:t>
+        <w:t>Keep practicing notes that are still difficult.</w:t>
       </w:r>
     </w:p>
     <w:p>
@@ -1327,7 +1618,54 @@
         <w:spacing w:after="0"/>
       </w:pPr>
       <w:r>
-        <w:t>Keep practicing notes that are still difficult.</w:t>
+        <w:t>Try Random mode for extra challenge.</w:t>
+      </w:r>
+    </w:p>
+    <w:p>
+      <w:pPr>
+        <w:pStyle w:val="Heading1"/>
+      </w:pPr>
+      <w:r>
+        <w:t>Feedback and Support</w:t>
+      </w:r>
+    </w:p>
+    <w:p>
+      <w:r>
+        <w:t>If something is not working, or if you have an idea to make Music Mate better, I would love to hear from you.</w:t>
+      </w:r>
+    </w:p>
+    <w:p>
+      <w:r>
+        <w:t xml:space="preserve">Please email: </w:t>
+      </w:r>
+      <w:r>
+        <w:t>B</w:t>
+      </w:r>
+      <w:r>
+        <w:t>rian_</w:t>
+      </w:r>
+      <w:r>
+        <w:t>K</w:t>
+      </w:r>
+      <w:r>
+        <w:t>_</w:t>
+      </w:r>
+      <w:r>
+        <w:t>D</w:t>
+      </w:r>
+      <w:r>
+        <w:t>aniels@yahoo.com</w:t>
+      </w:r>
+    </w:p>
+    <w:p>
+      <w:r>
+        <w:t>When reporting a problem,</w:t>
+      </w:r>
+      <w:r>
+        <w:t xml:space="preserve"> </w:t>
+      </w:r>
+      <w:r>
+        <w:t xml:space="preserve"> it helps to include:</w:t>
       </w:r>
     </w:p>
     <w:p>
@@ -1336,54 +1674,7 @@
         <w:spacing w:after="0"/>
       </w:pPr>
       <w:r>
-        <w:t>Try Random mode for extra challenge.</w:t>
-      </w:r>
-    </w:p>
-    <w:p>
-      <w:pPr>
-        <w:pStyle w:val="Heading1"/>
-      </w:pPr>
-      <w:r>
-        <w:t>Feedback and Support</w:t>
-      </w:r>
-    </w:p>
-    <w:p>
-      <w:r>
-        <w:t>If something is not working, or if you have an idea to make Music Mate better, I would love to hear from you.</w:t>
-      </w:r>
-    </w:p>
-    <w:p>
-      <w:r>
-        <w:t xml:space="preserve">Please email: </w:t>
-      </w:r>
-      <w:r>
-        <w:t>B</w:t>
-      </w:r>
-      <w:r>
-        <w:t>rian_</w:t>
-      </w:r>
-      <w:r>
-        <w:t>K</w:t>
-      </w:r>
-      <w:r>
-        <w:t>_</w:t>
-      </w:r>
-      <w:r>
-        <w:t>D</w:t>
-      </w:r>
-      <w:r>
-        <w:t>aniels@yahoo.com</w:t>
-      </w:r>
-    </w:p>
-    <w:p>
-      <w:r>
-        <w:t>When reporting a problem,</w:t>
-      </w:r>
-      <w:r>
-        <w:t xml:space="preserve"> </w:t>
-      </w:r>
-      <w:r>
-        <w:t xml:space="preserve"> it helps to include:</w:t>
+        <w:t>your device</w:t>
       </w:r>
     </w:p>
     <w:p>
@@ -1392,7 +1683,7 @@
         <w:spacing w:after="0"/>
       </w:pPr>
       <w:r>
-        <w:t>your device</w:t>
+        <w:t>your Android version</w:t>
       </w:r>
     </w:p>
     <w:p>
@@ -1401,7 +1692,7 @@
         <w:spacing w:after="0"/>
       </w:pPr>
       <w:r>
-        <w:t>your Android version</w:t>
+        <w:t>your instrument</w:t>
       </w:r>
     </w:p>
     <w:p>
@@ -1429,7 +1720,7 @@
     </w:p>
     <w:p>
       <w:pPr>
-        <w:pStyle w:val="Heading4"/>
+        <w:pStyle w:val="Heading2"/>
       </w:pPr>
       <w:r>
         <w:t>Candidate note pool</w:t>
@@ -1437,7 +1728,62 @@
     </w:p>
     <w:p>
       <w:r>
-        <w:t xml:space="preserve">Candidate notes are chosen for he selected scale and key signature. </w:t>
+        <w:t>Candidate notes are chosen f</w:t>
+      </w:r>
+      <w:r>
+        <w:t>rom</w:t>
+      </w:r>
+      <w:r>
+        <w:t xml:space="preserve"> </w:t>
+      </w:r>
+      <w:r>
+        <w:t>t</w:t>
+      </w:r>
+      <w:r>
+        <w:t>he selected scale</w:t>
+      </w:r>
+      <w:r>
+        <w:t>,</w:t>
+      </w:r>
+      <w:r>
+        <w:t xml:space="preserve"> </w:t>
+      </w:r>
+      <w:r>
+        <w:t xml:space="preserve"> in accordance with the </w:t>
+      </w:r>
+      <w:r>
+        <w:t>key signature</w:t>
+      </w:r>
+      <w:r>
+        <w:t xml:space="preserve"> and Low to High range</w:t>
+      </w:r>
+      <w:r>
+        <w:t xml:space="preserve">. </w:t>
+      </w:r>
+      <w:r>
+        <w:t>The pertinant settings for these are:</w:t>
+      </w:r>
+    </w:p>
+    <w:p>
+      <w:r>
+        <w:rPr>
+          <w:rStyle w:val="Heading3Char"/>
+        </w:rPr>
+        <w:t>LowestNote / HighestNote</w:t>
+      </w:r>
+      <w:r>
+        <w:t xml:space="preserve"> — the note range to consider.</w:t>
+      </w:r>
+    </w:p>
+    <w:p>
+      <w:r>
+        <w:rPr>
+          <w:rStyle w:val="Heading3Char"/>
+        </w:rPr>
+        <w:t>Key and SelectedScale</w:t>
+      </w:r>
+      <w:r>
+        <w:t xml:space="preserve"> — which notes belong to the chosen scale.</w:t>
       </w:r>
     </w:p>
     <w:p>
@@ -1469,6 +1815,27 @@
       </w:r>
       <w:r>
         <w:t xml:space="preserve">if it is already mastered. </w:t>
+      </w:r>
+    </w:p>
+    <w:p/>
+    <w:p>
+      <w:r>
+        <w:rPr>
+          <w:rStyle w:val="Heading2Char"/>
+        </w:rPr>
+        <w:t>%Correct</w:t>
+      </w:r>
+      <w:r>
+        <w:rPr>
+          <w:rStyle w:val="Heading2Char"/>
+        </w:rPr>
+        <w:t xml:space="preserve"> </w:t>
+      </w:r>
+      <w:r>
+        <w:t>is the name of t</w:t>
+      </w:r>
+      <w:r>
+        <w:t>he default method for saying a note is mastered</w:t>
       </w:r>
     </w:p>
     <w:p>
@@ -1533,87 +1900,30 @@
         <w:t>hat contr</w:t>
       </w:r>
       <w:r>
-        <w:t>ol this behavior:</w:t>
+        <w:t>ol this behavior</w:t>
+      </w:r>
+      <w:r>
+        <w:t xml:space="preserve"> are</w:t>
+      </w:r>
+      <w:r>
+        <w:t>:</w:t>
       </w:r>
     </w:p>
     <w:p>
       <w:r>
         <w:rPr>
-          <w:b/>
-          <w:bCs/>
-          <w:u w:val="single"/>
+          <w:rStyle w:val="Heading3Char"/>
         </w:rPr>
-        <w:t>LowestNote</w:t>
-      </w:r>
+        <w:t xml:space="preserve">CorrectThreshold </w:t>
+      </w:r>
+      <w:r>
+        <w:t>— the accuracy percent needed to consider a note “accurate.”</w:t>
+      </w:r>
+    </w:p>
+    <w:p>
       <w:r>
         <w:rPr>
-          <w:b/>
-          <w:bCs/>
-        </w:rPr>
-        <w:t xml:space="preserve"> / </w:t>
-      </w:r>
-      <w:r>
-        <w:rPr>
-          <w:b/>
-          <w:bCs/>
-          <w:u w:val="single"/>
-        </w:rPr>
-        <w:t>HighestNote</w:t>
-      </w:r>
-      <w:r>
-        <w:t xml:space="preserve"> — the note range to consider.</w:t>
-      </w:r>
-    </w:p>
-    <w:p>
-      <w:r>
-        <w:rPr>
-          <w:b/>
-          <w:bCs/>
-          <w:u w:val="single"/>
-        </w:rPr>
-        <w:t>Key</w:t>
-      </w:r>
-      <w:r>
-        <w:t xml:space="preserve"> and </w:t>
-      </w:r>
-      <w:r>
-        <w:rPr>
-          <w:b/>
-          <w:bCs/>
-          <w:u w:val="single"/>
-        </w:rPr>
-        <w:t>SelectedScale</w:t>
-      </w:r>
-      <w:r>
-        <w:t xml:space="preserve"> — which notes belong to the chosen scale.</w:t>
-      </w:r>
-    </w:p>
-    <w:p>
-      <w:r>
-        <w:rPr>
-          <w:b/>
-          <w:bCs/>
-          <w:u w:val="single"/>
-        </w:rPr>
-        <w:t>CorrectThreshold</w:t>
-      </w:r>
-      <w:r>
-        <w:rPr>
-          <w:b/>
-          <w:bCs/>
-        </w:rPr>
-        <w:t xml:space="preserve"> </w:t>
-      </w:r>
-      <w:r>
-        <w:t>— the accuracy percent needed to consider a note “accurate.”</w:t>
-      </w:r>
-    </w:p>
-    <w:p>
-      <w:r>
-        <w:rPr>
-          <w:b/>
-          <w:bCs/>
-          <w:u w:val="single"/>
+          <w:rStyle w:val="Heading3Char"/>
         </w:rPr>
         <w:t>MinCorrectCount</w:t>
       </w:r>
@@ -1624,19 +1934,54 @@
     <w:p>
       <w:r>
         <w:rPr>
-          <w:b/>
-          <w:bCs/>
-          <w:u w:val="single"/>
+          <w:rStyle w:val="Heading3Char"/>
         </w:rPr>
-        <w:t>OmitMsAvgThreshold</w:t>
-      </w:r>
-      <w:r>
-        <w:t xml:space="preserve"> — the average response-time cutoff (ms) below which a note is skipped.</w:t>
-      </w:r>
-    </w:p>
-    <w:p>
-      <w:r>
-        <w:t xml:space="preserve">Premium users can also set </w:t>
+        <w:t xml:space="preserve">OmitMsAvgThreshold </w:t>
+      </w:r>
+      <w:r>
+        <w:t>—</w:t>
+      </w:r>
+      <w:r>
+        <w:t xml:space="preserve"> the average response-time cutoff (ms) below which a note is skipped.</w:t>
+      </w:r>
+      <w:r>
+        <w:br/>
+      </w:r>
+      <w:r>
+        <w:br/>
+      </w:r>
+      <w:r>
+        <w:rPr>
+          <w:rStyle w:val="Heading2Char"/>
+        </w:rPr>
+        <w:t>Streak</w:t>
+      </w:r>
+      <w:r>
+        <w:t xml:space="preserve">  is the name </w:t>
+      </w:r>
+      <w:r>
+        <w:t>of an</w:t>
+      </w:r>
+      <w:r>
+        <w:t xml:space="preserve"> alternative method for saying a note is mastered.</w:t>
+      </w:r>
+      <w:r>
+        <w:br/>
+        <w:t>Notes are exclude</w:t>
+      </w:r>
+      <w:r>
+        <w:t>d if their streak values are greater or equal to the value set by the Streak slider on the settings page. (It is visible only when the Mastered method picked at the top right of the Settings page is Streak).</w:t>
+      </w:r>
+      <w:r>
+        <w:br/>
+      </w:r>
+    </w:p>
+    <w:p>
+      <w:r>
+        <w:t>Premium users can also set</w:t>
+      </w:r>
+      <w:r>
+        <w:t xml:space="preserve"> </w:t>
       </w:r>
       <w:r>
         <w:rPr>
@@ -1650,26 +1995,35 @@
         <w:t xml:space="preserve">  which causes some notes to be randomly modified by the addition of a sharp, flat or natural symbol.</w:t>
       </w:r>
     </w:p>
+    <w:p/>
     <w:p>
       <w:r>
         <w:rPr>
           <w:rStyle w:val="IntenseEmphasis"/>
         </w:rPr>
-        <w:t>Ordering of the random notes</w:t>
-      </w:r>
-      <w:r>
-        <w:rPr>
-          <w:rStyle w:val="IntenseEmphasis"/>
-        </w:rPr>
-        <w:br/>
-      </w:r>
-      <w:r>
-        <w:t>Pick a random note to begin the list.</w:t>
-      </w:r>
-    </w:p>
-    <w:p>
-      <w:r>
-        <w:t>Repeatedly pick the next note from the remaining notes until none are left.</w:t>
+        <w:t>How Music Mate writes a random tune.</w:t>
+      </w:r>
+      <w:r>
+        <w:t>.</w:t>
+      </w:r>
+    </w:p>
+    <w:p>
+      <w:r>
+        <w:t>It starts with the list of candidate notes.</w:t>
+      </w:r>
+    </w:p>
+    <w:p>
+      <w:r>
+        <w:t>It r</w:t>
+      </w:r>
+      <w:r>
+        <w:t>epeatedly pick</w:t>
+      </w:r>
+      <w:r>
+        <w:t>s</w:t>
+      </w:r>
+      <w:r>
+        <w:t xml:space="preserve"> the next note from the remaining notes until none are left.</w:t>
       </w:r>
     </w:p>
     <w:p>
@@ -1695,6 +2049,11 @@
     <w:p>
       <w:r>
         <w:t>Result: the sequence tends to move in small steps most of the time, with occasional bigger jumps.</w:t>
+      </w:r>
+    </w:p>
+    <w:p>
+      <w:r>
+        <w:t>Finally the specified percentage of notes are randomly made sharp, flat or neutral. (This can result in  a few notes being repeated  - enharmonics).</w:t>
       </w:r>
     </w:p>
     <w:p>
@@ -1877,7 +2236,7 @@
   <w:abstractNum w:abstractNumId="8" w15:restartNumberingAfterBreak="0">
     <w:nsid w:val="FFFFFF89"/>
     <w:multiLevelType w:val="singleLevel"/>
-    <w:tmpl w:val="62109DBE"/>
+    <w:tmpl w:val="EFD202CE"/>
     <w:lvl w:ilvl="0">
       <w:start w:val="1"/>
       <w:numFmt w:val="bullet"/>
@@ -2563,7 +2922,6 @@
     <w:next w:val="Normal"/>
     <w:link w:val="Heading5Char"/>
     <w:uiPriority w:val="9"/>
-    <w:semiHidden/>
     <w:unhideWhenUsed/>
     <w:qFormat/>
     <w:rsid w:val="00FC693F"/>
@@ -2675,6 +3033,7 @@
   <w:style w:type="character" w:default="1" w:styleId="DefaultParagraphFont">
     <w:name w:val="Default Paragraph Font"/>
     <w:uiPriority w:val="1"/>
+    <w:semiHidden/>
     <w:unhideWhenUsed/>
   </w:style>
   <w:style w:type="table" w:default="1" w:styleId="TableNormal">
@@ -3174,7 +3533,6 @@
     <w:basedOn w:val="DefaultParagraphFont"/>
     <w:link w:val="Heading5"/>
     <w:uiPriority w:val="9"/>
-    <w:semiHidden/>
     <w:rsid w:val="00FC693F"/>
     <w:rPr>
       <w:rFonts w:asciiTheme="majorHAnsi" w:eastAsiaTheme="majorEastAsia" w:hAnsiTheme="majorHAnsi" w:cstheme="majorBidi"/>

</xml_diff>

<commit_message>
On nvaigating back to Home it scrolls highest note to top. I had to tell it how to do it.
</commit_message>
<xml_diff>
--- a/About.docx
+++ b/About.docx
@@ -648,7 +648,15 @@
     </w:p>
     <w:p>
       <w:r>
-        <w:t xml:space="preserve">As you improve, notes you already know well can be left out, so you spend more time practicing notes that need more work. You can also turn on </w:t>
+        <w:t>As you improve, notes you already know well can be left out, so you spend more time practicing notes that need more work.</w:t>
+      </w:r>
+      <w:r>
+        <w:t xml:space="preserve"> This is done only for Random tunes. It is not done for the scales or other tunes described below.</w:t>
+      </w:r>
+    </w:p>
+    <w:p>
+      <w:r>
+        <w:t xml:space="preserve"> You can also turn on </w:t>
       </w:r>
       <w:r>
         <w:rPr>
@@ -668,10 +676,19 @@
         <w:t xml:space="preserve"> </w:t>
       </w:r>
       <w:r>
-        <w:t>so a new random pattern appears automatically after you finish one</w:t>
-      </w:r>
-      <w:r>
-        <w:t xml:space="preserve">. Or </w:t>
+        <w:t xml:space="preserve">so a new random pattern appears automatically </w:t>
+      </w:r>
+      <w:r>
+        <w:t>when</w:t>
+      </w:r>
+      <w:r>
+        <w:t xml:space="preserve"> you finish</w:t>
+      </w:r>
+      <w:r>
+        <w:t xml:space="preserve">. </w:t>
+      </w:r>
+      <w:r>
+        <w:t xml:space="preserve"> Or </w:t>
       </w:r>
       <w:r>
         <w:rPr>
@@ -774,6 +791,31 @@
     <w:p>
       <w:r>
         <w:t>When you choose a scale, Music Mate shows the key signature, one octave going up, and the notes coming back down. This helps you practice reading, hearing, and playing scales.</w:t>
+      </w:r>
+    </w:p>
+    <w:p>
+      <w:pPr>
+        <w:pStyle w:val="Heading3"/>
+        <w:rPr>
+          <w:b w:val="0"/>
+          <w:bCs w:val="0"/>
+        </w:rPr>
+      </w:pPr>
+      <w:r>
+        <w:rPr>
+          <w:color w:val="1F497D" w:themeColor="text2"/>
+        </w:rPr>
+        <w:t>Other Tunes</w:t>
+      </w:r>
+      <w:r>
+        <w:br/>
+      </w:r>
+      <w:r>
+        <w:rPr>
+          <w:b w:val="0"/>
+          <w:bCs w:val="0"/>
+        </w:rPr>
+        <w:t>A few other well known tunes are available.</w:t>
       </w:r>
     </w:p>
     <w:p>
@@ -1440,19 +1482,7 @@
         <w:spacing w:after="0"/>
       </w:pPr>
       <w:r>
-        <w:t>buy the Premium version</w:t>
-      </w:r>
-      <w:r>
-        <w:t xml:space="preserve"> or </w:t>
-      </w:r>
-      <w:r>
-        <w:t xml:space="preserve">see </w:t>
-      </w:r>
-      <w:r>
-        <w:t>that</w:t>
-      </w:r>
-      <w:r>
-        <w:t xml:space="preserve"> Premium is active</w:t>
+        <w:t>buy the Premium version or see that Premium is active</w:t>
       </w:r>
     </w:p>
     <w:p>
@@ -1823,13 +1853,7 @@
         <w:rPr>
           <w:rStyle w:val="Heading2Char"/>
         </w:rPr>
-        <w:t>%Correct</w:t>
-      </w:r>
-      <w:r>
-        <w:rPr>
-          <w:rStyle w:val="Heading2Char"/>
-        </w:rPr>
-        <w:t xml:space="preserve"> </w:t>
+        <w:t xml:space="preserve">%Correct </w:t>
       </w:r>
       <w:r>
         <w:t>is the name of t</w:t>
@@ -3033,7 +3057,6 @@
   <w:style w:type="character" w:default="1" w:styleId="DefaultParagraphFont">
     <w:name w:val="Default Paragraph Font"/>
     <w:uiPriority w:val="1"/>
-    <w:semiHidden/>
     <w:unhideWhenUsed/>
   </w:style>
   <w:style w:type="table" w:default="1" w:styleId="TableNormal">

</xml_diff>

<commit_message>
after several failures I told it how to do it and it finally shrank it so the not notes were clipped at the toop nor at the bottom
</commit_message>
<xml_diff>
--- a/About.docx
+++ b/About.docx
@@ -178,7 +178,13 @@
               <w:spacing w:after="0"/>
             </w:pPr>
             <w:r>
-              <w:t>5. Watch for green boxes.</w:t>
+              <w:t xml:space="preserve">5. </w:t>
+            </w:r>
+            <w:r>
+              <w:t xml:space="preserve">At the end see the % that were correct and the </w:t>
+            </w:r>
+            <w:r>
+              <w:t>.</w:t>
             </w:r>
           </w:p>
           <w:p>
@@ -614,6 +620,15 @@
         <w:spacing w:after="0"/>
       </w:pPr>
       <w:r>
+        <w:t>the key you choose</w:t>
+      </w:r>
+    </w:p>
+    <w:p>
+      <w:pPr>
+        <w:pStyle w:val="ListBullet"/>
+        <w:spacing w:after="0"/>
+      </w:pPr>
+      <w:r>
         <w:t>note jumps that are common in melodies</w:t>
       </w:r>
     </w:p>
@@ -1582,6 +1597,71 @@
       </w:pPr>
       <w:r>
         <w:t>your % correct may look a little lower than expected</w:t>
+      </w:r>
+    </w:p>
+    <w:p>
+      <w:pPr>
+        <w:pStyle w:val="ListBullet"/>
+        <w:spacing w:after="0"/>
+      </w:pPr>
+      <w:r>
+        <w:t>Fully detectable range 5/21/2026</w:t>
+      </w:r>
+    </w:p>
+    <w:p>
+      <w:pPr>
+        <w:pStyle w:val="ListBullet"/>
+        <w:tabs>
+          <w:tab w:val="clear" w:pos="360"/>
+          <w:tab w:val="num" w:pos="720"/>
+        </w:tabs>
+        <w:spacing w:after="0"/>
+        <w:ind w:left="720"/>
+      </w:pPr>
+      <w:r>
+        <w:t>Piano</w:t>
+      </w:r>
+      <w:r>
+        <w:tab/>
+      </w:r>
+      <w:r>
+        <w:tab/>
+        <w:t>Eb3</w:t>
+      </w:r>
+      <w:r>
+        <w:tab/>
+        <w:t>E6</w:t>
+      </w:r>
+    </w:p>
+    <w:p>
+      <w:pPr>
+        <w:pStyle w:val="ListBullet"/>
+        <w:tabs>
+          <w:tab w:val="clear" w:pos="360"/>
+          <w:tab w:val="num" w:pos="720"/>
+        </w:tabs>
+        <w:spacing w:after="0"/>
+        <w:ind w:left="720"/>
+      </w:pPr>
+      <w:r>
+        <w:t>Bb Clarinet</w:t>
+      </w:r>
+      <w:r>
+        <w:tab/>
+        <w:t>E3</w:t>
+      </w:r>
+      <w:r>
+        <w:tab/>
+      </w:r>
+      <w:r>
+        <w:t>G</w:t>
+      </w:r>
+      <w:r>
+        <w:t>6</w:t>
+      </w:r>
+      <w:r>
+        <w:tab/>
+        <w:t>E3 is instrument limit</w:t>
       </w:r>
     </w:p>
     <w:p>
@@ -3057,6 +3137,7 @@
   <w:style w:type="character" w:default="1" w:styleId="DefaultParagraphFont">
     <w:name w:val="Default Paragraph Font"/>
     <w:uiPriority w:val="1"/>
+    <w:semiHidden/>
     <w:unhideWhenUsed/>
   </w:style>
   <w:style w:type="table" w:default="1" w:styleId="TableNormal">

</xml_diff>

<commit_message>
Before changing to a least squares based timing measure.
</commit_message>
<xml_diff>
--- a/About.docx
+++ b/About.docx
@@ -1560,6 +1560,1044 @@
       </w:r>
     </w:p>
     <w:p>
+      <w:r>
+        <w:rPr>
+          <w:b/>
+          <w:bCs/>
+        </w:rPr>
+        <w:t>How Level-Up Works</w:t>
+      </w:r>
+    </w:p>
+    <w:p>
+      <w:r>
+        <w:rPr>
+          <w:b/>
+        </w:rPr>
+        <w:t>Automatic Advancement</w:t>
+      </w:r>
+    </w:p>
+    <w:p>
+      <w:pPr>
+        <w:numPr>
+          <w:ilvl w:val="0"/>
+          <w:numId w:val="11"/>
+        </w:numPr>
+      </w:pPr>
+      <w:r>
+        <w:t>Your child practices at their current level (1–100)</w:t>
+      </w:r>
+    </w:p>
+    <w:p>
+      <w:pPr>
+        <w:numPr>
+          <w:ilvl w:val="0"/>
+          <w:numId w:val="11"/>
+        </w:numPr>
+      </w:pPr>
+      <w:r>
+        <w:t>The app tracks performance across multiple practice sessions</w:t>
+      </w:r>
+    </w:p>
+    <w:p>
+      <w:pPr>
+        <w:numPr>
+          <w:ilvl w:val="0"/>
+          <w:numId w:val="11"/>
+        </w:numPr>
+      </w:pPr>
+      <w:r>
+        <w:t>When criteria are met, they automatically advance to the next level</w:t>
+      </w:r>
+    </w:p>
+    <w:p>
+      <w:pPr>
+        <w:numPr>
+          <w:ilvl w:val="0"/>
+          <w:numId w:val="11"/>
+        </w:numPr>
+      </w:pPr>
+      <w:r>
+        <w:t xml:space="preserve">A celebration banner appears: </w:t>
+      </w:r>
+      <w:r>
+        <w:rPr>
+          <w:b/>
+        </w:rPr>
+        <w:t>"</w:t>
+      </w:r>
+      <w:r>
+        <w:rPr>
+          <w:rFonts w:ascii="Segoe UI Emoji" w:hAnsi="Segoe UI Emoji" w:cs="Segoe UI Emoji"/>
+          <w:b/>
+        </w:rPr>
+        <w:t>🎉</w:t>
+      </w:r>
+      <w:r>
+        <w:rPr>
+          <w:b/>
+        </w:rPr>
+        <w:t xml:space="preserve"> Great job! You advanced to Level [X]!"</w:t>
+      </w:r>
+    </w:p>
+    <w:p>
+      <w:r>
+        <w:rPr>
+          <w:b/>
+        </w:rPr>
+        <w:t>Advancement Criteria</w:t>
+      </w:r>
+    </w:p>
+    <w:p>
+      <w:r>
+        <w:t xml:space="preserve">To advance, your child must complete </w:t>
+      </w:r>
+      <w:r>
+        <w:rPr>
+          <w:b/>
+        </w:rPr>
+        <w:t>3 qualifying practice sessions</w:t>
+      </w:r>
+      <w:r>
+        <w:t xml:space="preserve"> that meet these standards:</w:t>
+      </w:r>
+    </w:p>
+    <w:p>
+      <w:pPr>
+        <w:numPr>
+          <w:ilvl w:val="0"/>
+          <w:numId w:val="13"/>
+        </w:numPr>
+      </w:pPr>
+      <w:r>
+        <w:rPr>
+          <w:b/>
+        </w:rPr>
+        <w:t>Session Length</w:t>
+      </w:r>
+      <w:r>
+        <w:t xml:space="preserve">: At least </w:t>
+      </w:r>
+      <w:r>
+        <w:rPr>
+          <w:b/>
+        </w:rPr>
+        <w:t>4 notes</w:t>
+      </w:r>
+      <w:r>
+        <w:t xml:space="preserve"> per session</w:t>
+      </w:r>
+    </w:p>
+    <w:p>
+      <w:pPr>
+        <w:numPr>
+          <w:ilvl w:val="0"/>
+          <w:numId w:val="13"/>
+        </w:numPr>
+      </w:pPr>
+      <w:r>
+        <w:rPr>
+          <w:b/>
+        </w:rPr>
+        <w:t>Pitch Accuracy</w:t>
+      </w:r>
+      <w:r>
+        <w:t xml:space="preserve">: Rolling average </w:t>
+      </w:r>
+      <w:r>
+        <w:rPr>
+          <w:b/>
+        </w:rPr>
+        <w:t>85%</w:t>
+      </w:r>
+      <w:r>
+        <w:t xml:space="preserve"> or higher across all 3 sessions</w:t>
+      </w:r>
+    </w:p>
+    <w:p>
+      <w:pPr>
+        <w:numPr>
+          <w:ilvl w:val="0"/>
+          <w:numId w:val="13"/>
+        </w:numPr>
+      </w:pPr>
+      <w:r>
+        <w:rPr>
+          <w:b/>
+        </w:rPr>
+        <w:t>Overall Accuracy</w:t>
+      </w:r>
+      <w:r>
+        <w:t xml:space="preserve">: Rolling average </w:t>
+      </w:r>
+      <w:r>
+        <w:rPr>
+          <w:b/>
+        </w:rPr>
+        <w:t>80%</w:t>
+      </w:r>
+      <w:r>
+        <w:t xml:space="preserve"> or higher across all 3 sessions</w:t>
+      </w:r>
+    </w:p>
+    <w:p>
+      <w:pPr>
+        <w:numPr>
+          <w:ilvl w:val="0"/>
+          <w:numId w:val="13"/>
+        </w:numPr>
+      </w:pPr>
+      <w:r>
+        <w:rPr>
+          <w:b/>
+        </w:rPr>
+        <w:t>Timing Consistency</w:t>
+      </w:r>
+      <w:r>
+        <w:t xml:space="preserve">: Rolling average </w:t>
+      </w:r>
+      <w:r>
+        <w:rPr>
+          <w:b/>
+        </w:rPr>
+        <w:t>75%</w:t>
+      </w:r>
+      <w:r>
+        <w:t xml:space="preserve"> or higher (when timing data is available)</w:t>
+      </w:r>
+    </w:p>
+    <w:p>
+      <w:pPr>
+        <w:numPr>
+          <w:ilvl w:val="0"/>
+          <w:numId w:val="13"/>
+        </w:numPr>
+      </w:pPr>
+      <w:r>
+        <w:rPr>
+          <w:b/>
+        </w:rPr>
+        <w:t>Minimum Performance Floor</w:t>
+      </w:r>
+      <w:r>
+        <w:t xml:space="preserve">: No single session below </w:t>
+      </w:r>
+      <w:r>
+        <w:rPr>
+          <w:b/>
+        </w:rPr>
+        <w:t>60%</w:t>
+      </w:r>
+      <w:r>
+        <w:t xml:space="preserve"> overall accuracy</w:t>
+      </w:r>
+    </w:p>
+    <w:p>
+      <w:r>
+        <w:rPr>
+          <w:b/>
+        </w:rPr>
+        <w:t>What Counts as "Qualifying"</w:t>
+      </w:r>
+    </w:p>
+    <w:p>
+      <w:pPr>
+        <w:numPr>
+          <w:ilvl w:val="0"/>
+          <w:numId w:val="11"/>
+        </w:numPr>
+      </w:pPr>
+      <w:r>
+        <w:t xml:space="preserve">Sessions must be at the </w:t>
+      </w:r>
+      <w:r>
+        <w:rPr>
+          <w:b/>
+        </w:rPr>
+        <w:t>same level</w:t>
+      </w:r>
+      <w:r>
+        <w:t xml:space="preserve"> and </w:t>
+      </w:r>
+      <w:r>
+        <w:rPr>
+          <w:b/>
+        </w:rPr>
+        <w:t>same instrument</w:t>
+      </w:r>
+    </w:p>
+    <w:p>
+      <w:pPr>
+        <w:numPr>
+          <w:ilvl w:val="0"/>
+          <w:numId w:val="11"/>
+        </w:numPr>
+      </w:pPr>
+      <w:r>
+        <w:t>Very short sessions (fewer than 4 notes) are excluded</w:t>
+      </w:r>
+    </w:p>
+    <w:p>
+      <w:pPr>
+        <w:numPr>
+          <w:ilvl w:val="0"/>
+          <w:numId w:val="11"/>
+        </w:numPr>
+      </w:pPr>
+      <w:r>
+        <w:t>Each session builds on the previous one—</w:t>
+      </w:r>
+      <w:r>
+        <w:rPr>
+          <w:b/>
+        </w:rPr>
+        <w:t>no need to start over!</w:t>
+      </w:r>
+    </w:p>
+    <w:p>
+      <w:pPr>
+        <w:numPr>
+          <w:ilvl w:val="0"/>
+          <w:numId w:val="11"/>
+        </w:numPr>
+      </w:pPr>
+      <w:r>
+        <w:t>Sessions with obvious data errors (0% accuracy with notes played) are excluded</w:t>
+      </w:r>
+    </w:p>
+    <w:p>
+      <w:r>
+        <w:t>---</w:t>
+      </w:r>
+    </w:p>
+    <w:p>
+      <w:r>
+        <w:rPr>
+          <w:b/>
+        </w:rPr>
+        <w:t>Progress Tracking</w:t>
+      </w:r>
+    </w:p>
+    <w:p>
+      <w:r>
+        <w:t xml:space="preserve">During practice, the </w:t>
+      </w:r>
+      <w:r>
+        <w:rPr>
+          <w:b/>
+        </w:rPr>
+        <w:t>status bar</w:t>
+      </w:r>
+      <w:r>
+        <w:t xml:space="preserve"> shows your child's progress toward the next level:</w:t>
+      </w:r>
+    </w:p>
+    <w:p>
+      <w:pPr>
+        <w:numPr>
+          <w:ilvl w:val="0"/>
+          <w:numId w:val="11"/>
+        </w:numPr>
+      </w:pPr>
+      <w:r>
+        <w:rPr>
+          <w:b/>
+        </w:rPr>
+        <w:t>ssns</w:t>
+      </w:r>
+      <w:r>
+        <w:t xml:space="preserve">: Current qualifying sessions out of 3 needed (e.g., </w:t>
+      </w:r>
+      <w:r>
+        <w:rPr>
+          <w:b/>
+        </w:rPr>
+        <w:t>2/3</w:t>
+      </w:r>
+      <w:r>
+        <w:t>)</w:t>
+      </w:r>
+    </w:p>
+    <w:p>
+      <w:pPr>
+        <w:numPr>
+          <w:ilvl w:val="0"/>
+          <w:numId w:val="11"/>
+        </w:numPr>
+      </w:pPr>
+      <w:r>
+        <w:rPr>
+          <w:b/>
+        </w:rPr>
+        <w:t>Pch</w:t>
+      </w:r>
+      <w:r>
+        <w:t xml:space="preserve">: Rolling average pitch accuracy (e.g., </w:t>
+      </w:r>
+      <w:r>
+        <w:rPr>
+          <w:b/>
+        </w:rPr>
+        <w:t>87.5%</w:t>
+      </w:r>
+      <w:r>
+        <w:t>)</w:t>
+      </w:r>
+    </w:p>
+    <w:p>
+      <w:pPr>
+        <w:numPr>
+          <w:ilvl w:val="0"/>
+          <w:numId w:val="11"/>
+        </w:numPr>
+      </w:pPr>
+      <w:r>
+        <w:rPr>
+          <w:b/>
+        </w:rPr>
+        <w:t>Tmg</w:t>
+      </w:r>
+      <w:r>
+        <w:t xml:space="preserve">: Rolling average timing consistency (e.g., </w:t>
+      </w:r>
+      <w:r>
+        <w:rPr>
+          <w:b/>
+        </w:rPr>
+        <w:t>100.0%</w:t>
+      </w:r>
+      <w:r>
+        <w:t>)</w:t>
+      </w:r>
+    </w:p>
+    <w:p>
+      <w:pPr>
+        <w:numPr>
+          <w:ilvl w:val="0"/>
+          <w:numId w:val="11"/>
+        </w:numPr>
+      </w:pPr>
+      <w:r>
+        <w:rPr>
+          <w:b/>
+        </w:rPr>
+        <w:t>Overall</w:t>
+      </w:r>
+      <w:r>
+        <w:t xml:space="preserve">: Rolling average overall accuracy (e.g., </w:t>
+      </w:r>
+      <w:r>
+        <w:rPr>
+          <w:b/>
+        </w:rPr>
+        <w:t>85.0%</w:t>
+      </w:r>
+      <w:r>
+        <w:t>)</w:t>
+      </w:r>
+    </w:p>
+    <w:p>
+      <w:pPr>
+        <w:numPr>
+          <w:ilvl w:val="0"/>
+          <w:numId w:val="11"/>
+        </w:numPr>
+      </w:pPr>
+      <w:r>
+        <w:rPr>
+          <w:b/>
+        </w:rPr>
+        <w:t>Notes</w:t>
+      </w:r>
+      <w:r>
+        <w:t xml:space="preserve">: Number of notes in the current session (e.g., </w:t>
+      </w:r>
+      <w:r>
+        <w:rPr>
+          <w:b/>
+        </w:rPr>
+        <w:t>8</w:t>
+      </w:r>
+      <w:r>
+        <w:t>)</w:t>
+      </w:r>
+    </w:p>
+    <w:p>
+      <w:r>
+        <w:rPr>
+          <w:b/>
+        </w:rPr>
+        <w:t>Example display:</w:t>
+      </w:r>
+      <w:r>
+        <w:br/>
+      </w:r>
+      <w:r>
+        <w:rPr>
+          <w:b/>
+        </w:rPr>
+        <w:t>ssns=2/3, Pch=87.5%, Tmg=100.0%, Overall=85.0%, Notes=8</w:t>
+      </w:r>
+    </w:p>
+    <w:p>
+      <w:r>
+        <w:t>This means the student has completed 2 out of 3 qualifying sessions with strong performance!</w:t>
+      </w:r>
+    </w:p>
+    <w:p>
+      <w:r>
+        <w:t>---</w:t>
+      </w:r>
+    </w:p>
+    <w:p>
+      <w:r>
+        <w:rPr>
+          <w:b/>
+        </w:rPr>
+        <w:t>Important Notes</w:t>
+      </w:r>
+    </w:p>
+    <w:p>
+      <w:r>
+        <w:rPr>
+          <w:rFonts w:ascii="Segoe UI Emoji" w:hAnsi="Segoe UI Emoji" w:cs="Segoe UI Emoji"/>
+        </w:rPr>
+        <w:t>✅</w:t>
+      </w:r>
+      <w:r>
+        <w:t xml:space="preserve"> </w:t>
+      </w:r>
+      <w:r>
+        <w:rPr>
+          <w:b/>
+        </w:rPr>
+        <w:t>Level-up is automatic</w:t>
+      </w:r>
+      <w:r>
+        <w:t>—no manual advancement needed</w:t>
+      </w:r>
+      <w:r>
+        <w:br/>
+      </w:r>
+      <w:r>
+        <w:rPr>
+          <w:rFonts w:ascii="Segoe UI Emoji" w:hAnsi="Segoe UI Emoji" w:cs="Segoe UI Emoji"/>
+        </w:rPr>
+        <w:t>✅</w:t>
+      </w:r>
+      <w:r>
+        <w:t xml:space="preserve"> </w:t>
+      </w:r>
+      <w:r>
+        <w:rPr>
+          <w:b/>
+        </w:rPr>
+        <w:t>History is preserved</w:t>
+      </w:r>
+      <w:r>
+        <w:t>—all past sessions remain saved</w:t>
+      </w:r>
+      <w:r>
+        <w:br/>
+      </w:r>
+      <w:r>
+        <w:rPr>
+          <w:rFonts w:ascii="Segoe UI Emoji" w:hAnsi="Segoe UI Emoji" w:cs="Segoe UI Emoji"/>
+        </w:rPr>
+        <w:t>✅</w:t>
+      </w:r>
+      <w:r>
+        <w:t xml:space="preserve"> </w:t>
+      </w:r>
+      <w:r>
+        <w:rPr>
+          <w:b/>
+        </w:rPr>
+        <w:t>Levels never go down automatically</w:t>
+      </w:r>
+      <w:r>
+        <w:br/>
+      </w:r>
+      <w:r>
+        <w:rPr>
+          <w:rFonts w:ascii="Segoe UI Emoji" w:hAnsi="Segoe UI Emoji" w:cs="Segoe UI Emoji"/>
+        </w:rPr>
+        <w:t>✅</w:t>
+      </w:r>
+      <w:r>
+        <w:t xml:space="preserve"> </w:t>
+      </w:r>
+      <w:r>
+        <w:rPr>
+          <w:b/>
+        </w:rPr>
+        <w:t>The system ensures steady, proven progress</w:t>
+      </w:r>
+      <w:r>
+        <w:t xml:space="preserve"> before advancing</w:t>
+      </w:r>
+      <w:r>
+        <w:br/>
+      </w:r>
+      <w:r>
+        <w:rPr>
+          <w:rFonts w:ascii="Segoe UI Emoji" w:hAnsi="Segoe UI Emoji" w:cs="Segoe UI Emoji"/>
+        </w:rPr>
+        <w:t>✅</w:t>
+      </w:r>
+      <w:r>
+        <w:t xml:space="preserve"> </w:t>
+      </w:r>
+      <w:r>
+        <w:rPr>
+          <w:b/>
+        </w:rPr>
+        <w:t>Each instrument tracks separately</w:t>
+      </w:r>
+      <w:r>
+        <w:t>—progress on flute doesn't affect piano level</w:t>
+      </w:r>
+    </w:p>
+    <w:p>
+      <w:r>
+        <w:t>---</w:t>
+      </w:r>
+    </w:p>
+    <w:p>
+      <w:r>
+        <w:rPr>
+          <w:b/>
+        </w:rPr>
+        <w:t>Adjusting Difficulty (Advanced Settings)</w:t>
+      </w:r>
+    </w:p>
+    <w:p>
+      <w:r>
+        <w:t xml:space="preserve">Parents can customize the advancement criteria in the </w:t>
+      </w:r>
+      <w:r>
+        <w:rPr>
+          <w:b/>
+        </w:rPr>
+        <w:t>Advanced settings page</w:t>
+      </w:r>
+      <w:r>
+        <w:t>:</w:t>
+      </w:r>
+    </w:p>
+    <w:tbl>
+      <w:tblPr>
+        <w:tblW w:w="0" w:type="auto"/>
+        <w:tblInd w:w="10" w:type="dxa"/>
+        <w:tblBorders>
+          <w:bottom w:val="single" w:sz="6" w:space="0" w:color="1E1E1E"/>
+          <w:right w:val="single" w:sz="6" w:space="0" w:color="1E1E1E"/>
+        </w:tblBorders>
+        <w:tblLayout w:type="fixed"/>
+        <w:tblCellMar>
+          <w:top w:w="10" w:type="dxa"/>
+          <w:left w:w="10" w:type="dxa"/>
+          <w:bottom w:w="10" w:type="dxa"/>
+          <w:right w:w="10" w:type="dxa"/>
+        </w:tblCellMar>
+        <w:tblLook w:val="0000" w:firstRow="0" w:lastRow="0" w:firstColumn="0" w:lastColumn="0" w:noHBand="0" w:noVBand="0"/>
+      </w:tblPr>
+      <w:tblGrid>
+        <w:gridCol w:w="1440"/>
+        <w:gridCol w:w="1440"/>
+        <w:gridCol w:w="1440"/>
+      </w:tblGrid>
+      <w:tr>
+        <w:tc>
+          <w:tcPr>
+            <w:tcW w:w="1440" w:type="dxa"/>
+            <w:tcBorders>
+              <w:top w:val="nil"/>
+              <w:left w:val="nil"/>
+              <w:bottom w:val="single" w:sz="6" w:space="0" w:color="1E1E1E"/>
+              <w:right w:val="single" w:sz="6" w:space="0" w:color="1E1E1E"/>
+            </w:tcBorders>
+          </w:tcPr>
+          <w:p>
+            <w:r>
+              <w:t>Criterion</w:t>
+            </w:r>
+          </w:p>
+        </w:tc>
+        <w:tc>
+          <w:tcPr>
+            <w:tcW w:w="1440" w:type="dxa"/>
+            <w:tcBorders>
+              <w:top w:val="nil"/>
+              <w:left w:val="nil"/>
+              <w:bottom w:val="single" w:sz="6" w:space="0" w:color="1E1E1E"/>
+              <w:right w:val="single" w:sz="6" w:space="0" w:color="1E1E1E"/>
+            </w:tcBorders>
+          </w:tcPr>
+          <w:p>
+            <w:r>
+              <w:t>Default</w:t>
+            </w:r>
+          </w:p>
+        </w:tc>
+        <w:tc>
+          <w:tcPr>
+            <w:tcW w:w="1440" w:type="dxa"/>
+            <w:tcBorders>
+              <w:top w:val="nil"/>
+              <w:left w:val="nil"/>
+              <w:bottom w:val="single" w:sz="6" w:space="0" w:color="1E1E1E"/>
+            </w:tcBorders>
+          </w:tcPr>
+          <w:p>
+            <w:r>
+              <w:t>Purpose</w:t>
+            </w:r>
+          </w:p>
+        </w:tc>
+      </w:tr>
+      <w:tr>
+        <w:tc>
+          <w:tcPr>
+            <w:tcW w:w="1440" w:type="dxa"/>
+            <w:tcBorders>
+              <w:top w:val="nil"/>
+              <w:left w:val="nil"/>
+              <w:bottom w:val="single" w:sz="6" w:space="0" w:color="1E1E1E"/>
+              <w:right w:val="single" w:sz="6" w:space="0" w:color="1E1E1E"/>
+            </w:tcBorders>
+          </w:tcPr>
+          <w:p>
+            <w:r>
+              <w:t>Number of sessions required</w:t>
+            </w:r>
+          </w:p>
+        </w:tc>
+        <w:tc>
+          <w:tcPr>
+            <w:tcW w:w="1440" w:type="dxa"/>
+            <w:tcBorders>
+              <w:top w:val="nil"/>
+              <w:left w:val="nil"/>
+              <w:bottom w:val="single" w:sz="6" w:space="0" w:color="1E1E1E"/>
+              <w:right w:val="single" w:sz="6" w:space="0" w:color="1E1E1E"/>
+            </w:tcBorders>
+          </w:tcPr>
+          <w:p>
+            <w:r>
+              <w:rPr>
+                <w:b/>
+              </w:rPr>
+              <w:t>3</w:t>
+            </w:r>
+          </w:p>
+        </w:tc>
+        <w:tc>
+          <w:tcPr>
+            <w:tcW w:w="1440" w:type="dxa"/>
+            <w:tcBorders>
+              <w:top w:val="nil"/>
+              <w:left w:val="nil"/>
+              <w:bottom w:val="single" w:sz="6" w:space="0" w:color="1E1E1E"/>
+            </w:tcBorders>
+          </w:tcPr>
+          <w:p>
+            <w:r>
+              <w:t>Rolling window size</w:t>
+            </w:r>
+          </w:p>
+        </w:tc>
+      </w:tr>
+      <w:tr>
+        <w:tc>
+          <w:tcPr>
+            <w:tcW w:w="1440" w:type="dxa"/>
+            <w:tcBorders>
+              <w:top w:val="nil"/>
+              <w:left w:val="nil"/>
+              <w:bottom w:val="single" w:sz="6" w:space="0" w:color="1E1E1E"/>
+              <w:right w:val="single" w:sz="6" w:space="0" w:color="1E1E1E"/>
+            </w:tcBorders>
+          </w:tcPr>
+          <w:p>
+            <w:r>
+              <w:t>Minimum pitch accuracy %</w:t>
+            </w:r>
+          </w:p>
+        </w:tc>
+        <w:tc>
+          <w:tcPr>
+            <w:tcW w:w="1440" w:type="dxa"/>
+            <w:tcBorders>
+              <w:top w:val="nil"/>
+              <w:left w:val="nil"/>
+              <w:bottom w:val="single" w:sz="6" w:space="0" w:color="1E1E1E"/>
+              <w:right w:val="single" w:sz="6" w:space="0" w:color="1E1E1E"/>
+            </w:tcBorders>
+          </w:tcPr>
+          <w:p>
+            <w:r>
+              <w:rPr>
+                <w:b/>
+              </w:rPr>
+              <w:t>85%</w:t>
+            </w:r>
+          </w:p>
+        </w:tc>
+        <w:tc>
+          <w:tcPr>
+            <w:tcW w:w="1440" w:type="dxa"/>
+            <w:tcBorders>
+              <w:top w:val="nil"/>
+              <w:left w:val="nil"/>
+              <w:bottom w:val="single" w:sz="6" w:space="0" w:color="1E1E1E"/>
+            </w:tcBorders>
+          </w:tcPr>
+          <w:p>
+            <w:r>
+              <w:t>Average across sessions</w:t>
+            </w:r>
+          </w:p>
+        </w:tc>
+      </w:tr>
+      <w:tr>
+        <w:tc>
+          <w:tcPr>
+            <w:tcW w:w="1440" w:type="dxa"/>
+            <w:tcBorders>
+              <w:top w:val="nil"/>
+              <w:left w:val="nil"/>
+              <w:bottom w:val="single" w:sz="6" w:space="0" w:color="1E1E1E"/>
+              <w:right w:val="single" w:sz="6" w:space="0" w:color="1E1E1E"/>
+            </w:tcBorders>
+          </w:tcPr>
+          <w:p>
+            <w:r>
+              <w:t>Minimum overall accuracy %</w:t>
+            </w:r>
+          </w:p>
+        </w:tc>
+        <w:tc>
+          <w:tcPr>
+            <w:tcW w:w="1440" w:type="dxa"/>
+            <w:tcBorders>
+              <w:top w:val="nil"/>
+              <w:left w:val="nil"/>
+              <w:bottom w:val="single" w:sz="6" w:space="0" w:color="1E1E1E"/>
+              <w:right w:val="single" w:sz="6" w:space="0" w:color="1E1E1E"/>
+            </w:tcBorders>
+          </w:tcPr>
+          <w:p>
+            <w:r>
+              <w:rPr>
+                <w:b/>
+              </w:rPr>
+              <w:t>80%</w:t>
+            </w:r>
+          </w:p>
+        </w:tc>
+        <w:tc>
+          <w:tcPr>
+            <w:tcW w:w="1440" w:type="dxa"/>
+            <w:tcBorders>
+              <w:top w:val="nil"/>
+              <w:left w:val="nil"/>
+              <w:bottom w:val="single" w:sz="6" w:space="0" w:color="1E1E1E"/>
+            </w:tcBorders>
+          </w:tcPr>
+          <w:p>
+            <w:r>
+              <w:t>Average across sessions</w:t>
+            </w:r>
+          </w:p>
+        </w:tc>
+      </w:tr>
+      <w:tr>
+        <w:tc>
+          <w:tcPr>
+            <w:tcW w:w="1440" w:type="dxa"/>
+            <w:tcBorders>
+              <w:top w:val="nil"/>
+              <w:left w:val="nil"/>
+              <w:bottom w:val="single" w:sz="6" w:space="0" w:color="1E1E1E"/>
+              <w:right w:val="single" w:sz="6" w:space="0" w:color="1E1E1E"/>
+            </w:tcBorders>
+          </w:tcPr>
+          <w:p>
+            <w:r>
+              <w:t>Minimum timing accuracy %</w:t>
+            </w:r>
+          </w:p>
+        </w:tc>
+        <w:tc>
+          <w:tcPr>
+            <w:tcW w:w="1440" w:type="dxa"/>
+            <w:tcBorders>
+              <w:top w:val="nil"/>
+              <w:left w:val="nil"/>
+              <w:bottom w:val="single" w:sz="6" w:space="0" w:color="1E1E1E"/>
+              <w:right w:val="single" w:sz="6" w:space="0" w:color="1E1E1E"/>
+            </w:tcBorders>
+          </w:tcPr>
+          <w:p>
+            <w:r>
+              <w:rPr>
+                <w:b/>
+              </w:rPr>
+              <w:t>75%</w:t>
+            </w:r>
+          </w:p>
+        </w:tc>
+        <w:tc>
+          <w:tcPr>
+            <w:tcW w:w="1440" w:type="dxa"/>
+            <w:tcBorders>
+              <w:top w:val="nil"/>
+              <w:left w:val="nil"/>
+              <w:bottom w:val="single" w:sz="6" w:space="0" w:color="1E1E1E"/>
+            </w:tcBorders>
+          </w:tcPr>
+          <w:p>
+            <w:r>
+              <w:t>Average (when timing data available)</w:t>
+            </w:r>
+          </w:p>
+        </w:tc>
+      </w:tr>
+      <w:tr>
+        <w:tc>
+          <w:tcPr>
+            <w:tcW w:w="1440" w:type="dxa"/>
+            <w:tcBorders>
+              <w:top w:val="nil"/>
+              <w:left w:val="nil"/>
+              <w:bottom w:val="single" w:sz="6" w:space="0" w:color="1E1E1E"/>
+              <w:right w:val="single" w:sz="6" w:space="0" w:color="1E1E1E"/>
+            </w:tcBorders>
+          </w:tcPr>
+          <w:p>
+            <w:r>
+              <w:t>Minimum notes per session</w:t>
+            </w:r>
+          </w:p>
+        </w:tc>
+        <w:tc>
+          <w:tcPr>
+            <w:tcW w:w="1440" w:type="dxa"/>
+            <w:tcBorders>
+              <w:top w:val="nil"/>
+              <w:left w:val="nil"/>
+              <w:bottom w:val="single" w:sz="6" w:space="0" w:color="1E1E1E"/>
+              <w:right w:val="single" w:sz="6" w:space="0" w:color="1E1E1E"/>
+            </w:tcBorders>
+          </w:tcPr>
+          <w:p>
+            <w:r>
+              <w:rPr>
+                <w:b/>
+              </w:rPr>
+              <w:t>4</w:t>
+            </w:r>
+          </w:p>
+        </w:tc>
+        <w:tc>
+          <w:tcPr>
+            <w:tcW w:w="1440" w:type="dxa"/>
+            <w:tcBorders>
+              <w:top w:val="nil"/>
+              <w:left w:val="nil"/>
+              <w:bottom w:val="single" w:sz="6" w:space="0" w:color="1E1E1E"/>
+            </w:tcBorders>
+          </w:tcPr>
+          <w:p>
+            <w:r>
+              <w:t>Excludes very short sessions</w:t>
+            </w:r>
+          </w:p>
+        </w:tc>
+      </w:tr>
+      <w:tr>
+        <w:tc>
+          <w:tcPr>
+            <w:tcW w:w="1440" w:type="dxa"/>
+            <w:tcBorders>
+              <w:top w:val="nil"/>
+              <w:left w:val="nil"/>
+              <w:bottom w:val="single" w:sz="6" w:space="0" w:color="1E1E1E"/>
+              <w:right w:val="single" w:sz="6" w:space="0" w:color="1E1E1E"/>
+            </w:tcBorders>
+          </w:tcPr>
+          <w:p>
+            <w:r>
+              <w:t>Accuracy floor %</w:t>
+            </w:r>
+          </w:p>
+        </w:tc>
+        <w:tc>
+          <w:tcPr>
+            <w:tcW w:w="1440" w:type="dxa"/>
+            <w:tcBorders>
+              <w:top w:val="nil"/>
+              <w:left w:val="nil"/>
+              <w:bottom w:val="single" w:sz="6" w:space="0" w:color="1E1E1E"/>
+              <w:right w:val="single" w:sz="6" w:space="0" w:color="1E1E1E"/>
+            </w:tcBorders>
+          </w:tcPr>
+          <w:p>
+            <w:r>
+              <w:rPr>
+                <w:b/>
+              </w:rPr>
+              <w:t>60%</w:t>
+            </w:r>
+          </w:p>
+        </w:tc>
+        <w:tc>
+          <w:tcPr>
+            <w:tcW w:w="1440" w:type="dxa"/>
+            <w:tcBorders>
+              <w:top w:val="nil"/>
+              <w:left w:val="nil"/>
+              <w:bottom w:val="single" w:sz="6" w:space="0" w:color="1E1E1E"/>
+            </w:tcBorders>
+          </w:tcPr>
+          <w:p>
+            <w:r>
+              <w:t>No session can fall below this</w:t>
+            </w:r>
+          </w:p>
+        </w:tc>
+      </w:tr>
+    </w:tbl>
+    <w:p>
+      <w:r>
+        <w:t xml:space="preserve">These settings let you make advancement </w:t>
+      </w:r>
+      <w:r>
+        <w:rPr>
+          <w:b/>
+        </w:rPr>
+        <w:t>easier for beginners</w:t>
+      </w:r>
+      <w:r>
+        <w:t xml:space="preserve"> or </w:t>
+      </w:r>
+      <w:r>
+        <w:rPr>
+          <w:b/>
+        </w:rPr>
+        <w:t>more challenging for advanced students</w:t>
+      </w:r>
+      <w:r>
+        <w:t>.</w:t>
+      </w:r>
+    </w:p>
+    <w:p>
+      <w:r>
+        <w:t>---</w:t>
+      </w:r>
+    </w:p>
+    <w:p/>
+    <w:p>
       <w:pPr>
         <w:pStyle w:val="Heading1"/>
       </w:pPr>
@@ -2160,6 +3198,588 @@
         <w:t>Finally the specified percentage of notes are randomly made sharp, flat or neutral. (This can result in  a few notes being repeated  - enharmonics).</w:t>
       </w:r>
     </w:p>
+    <w:p>
+      <w:pPr>
+        <w:pStyle w:val="Heading1"/>
+      </w:pPr>
+      <w:r>
+        <w:t>Tips for Parents</w:t>
+      </w:r>
+    </w:p>
+    <w:p>
+      <w:r>
+        <w:rPr>
+          <w:b/>
+        </w:rPr>
+        <w:t>Encouraging Consistent Practice</w:t>
+      </w:r>
+    </w:p>
+    <w:p>
+      <w:pPr>
+        <w:numPr>
+          <w:ilvl w:val="0"/>
+          <w:numId w:val="11"/>
+        </w:numPr>
+      </w:pPr>
+      <w:r>
+        <w:rPr>
+          <w:b/>
+        </w:rPr>
+        <w:t>Short, daily sessions</w:t>
+      </w:r>
+      <w:r>
+        <w:t xml:space="preserve"> work better than long, infrequent ones</w:t>
+      </w:r>
+    </w:p>
+    <w:p>
+      <w:pPr>
+        <w:numPr>
+          <w:ilvl w:val="0"/>
+          <w:numId w:val="11"/>
+        </w:numPr>
+      </w:pPr>
+      <w:r>
+        <w:t xml:space="preserve">The 3-session requirement encourages </w:t>
+      </w:r>
+      <w:r>
+        <w:rPr>
+          <w:b/>
+        </w:rPr>
+        <w:t>regular practice habits</w:t>
+      </w:r>
+    </w:p>
+    <w:p>
+      <w:pPr>
+        <w:numPr>
+          <w:ilvl w:val="0"/>
+          <w:numId w:val="11"/>
+        </w:numPr>
+      </w:pPr>
+      <w:r>
+        <w:t>Progress is saved automatically—</w:t>
+      </w:r>
+      <w:r>
+        <w:rPr>
+          <w:b/>
+        </w:rPr>
+        <w:t>no need to finish in one sitting</w:t>
+      </w:r>
+    </w:p>
+    <w:p>
+      <w:r>
+        <w:rPr>
+          <w:b/>
+        </w:rPr>
+        <w:t>Understanding the Metrics</w:t>
+      </w:r>
+    </w:p>
+    <w:p>
+      <w:pPr>
+        <w:numPr>
+          <w:ilvl w:val="0"/>
+          <w:numId w:val="11"/>
+        </w:numPr>
+      </w:pPr>
+      <w:r>
+        <w:rPr>
+          <w:b/>
+        </w:rPr>
+        <w:t>Pitch Accuracy</w:t>
+      </w:r>
+      <w:r>
+        <w:t>: How often the correct note was played</w:t>
+      </w:r>
+    </w:p>
+    <w:p>
+      <w:pPr>
+        <w:numPr>
+          <w:ilvl w:val="0"/>
+          <w:numId w:val="11"/>
+        </w:numPr>
+      </w:pPr>
+      <w:r>
+        <w:rPr>
+          <w:b/>
+        </w:rPr>
+        <w:t>Timing Consistency</w:t>
+      </w:r>
+      <w:r>
+        <w:t>: How steady the rhythm was (lower variation = better)</w:t>
+      </w:r>
+    </w:p>
+    <w:p>
+      <w:pPr>
+        <w:numPr>
+          <w:ilvl w:val="0"/>
+          <w:numId w:val="11"/>
+        </w:numPr>
+      </w:pPr>
+      <w:r>
+        <w:rPr>
+          <w:b/>
+        </w:rPr>
+        <w:t>Overall Accuracy</w:t>
+      </w:r>
+      <w:r>
+        <w:t>: Combined score (currently same as pitch; timing will blend in future updates)</w:t>
+      </w:r>
+    </w:p>
+    <w:p>
+      <w:r>
+        <w:rPr>
+          <w:b/>
+        </w:rPr>
+        <w:t>When to Adjust Settings</w:t>
+      </w:r>
+    </w:p>
+    <w:p>
+      <w:pPr>
+        <w:numPr>
+          <w:ilvl w:val="0"/>
+          <w:numId w:val="11"/>
+        </w:numPr>
+      </w:pPr>
+      <w:r>
+        <w:rPr>
+          <w:b/>
+        </w:rPr>
+        <w:t>Child feels frustrated</w:t>
+      </w:r>
+      <w:r>
+        <w:t xml:space="preserve"> → Lower the accuracy thresholds temporarily</w:t>
+      </w:r>
+    </w:p>
+    <w:p>
+      <w:pPr>
+        <w:numPr>
+          <w:ilvl w:val="0"/>
+          <w:numId w:val="11"/>
+        </w:numPr>
+      </w:pPr>
+      <w:r>
+        <w:rPr>
+          <w:b/>
+        </w:rPr>
+        <w:t>Child breezes through levels</w:t>
+      </w:r>
+      <w:r>
+        <w:t xml:space="preserve"> → Raise the thresholds or session count</w:t>
+      </w:r>
+    </w:p>
+    <w:p>
+      <w:pPr>
+        <w:numPr>
+          <w:ilvl w:val="0"/>
+          <w:numId w:val="11"/>
+        </w:numPr>
+      </w:pPr>
+      <w:r>
+        <w:rPr>
+          <w:b/>
+        </w:rPr>
+        <w:t>Very young children</w:t>
+      </w:r>
+      <w:r>
+        <w:t xml:space="preserve"> → Consider reducing the session count to </w:t>
+      </w:r>
+      <w:r>
+        <w:rPr>
+          <w:b/>
+        </w:rPr>
+        <w:t>1 or 2</w:t>
+      </w:r>
+    </w:p>
+    <w:p>
+      <w:r>
+        <w:rPr>
+          <w:b/>
+        </w:rPr>
+        <w:t>Privacy &amp; Data</w:t>
+      </w:r>
+    </w:p>
+    <w:p>
+      <w:pPr>
+        <w:numPr>
+          <w:ilvl w:val="0"/>
+          <w:numId w:val="11"/>
+        </w:numPr>
+      </w:pPr>
+      <w:r>
+        <w:rPr>
+          <w:rFonts w:ascii="Segoe UI Emoji" w:hAnsi="Segoe UI Emoji" w:cs="Segoe UI Emoji"/>
+        </w:rPr>
+        <w:t>✅</w:t>
+      </w:r>
+      <w:r>
+        <w:t xml:space="preserve"> All progress data is </w:t>
+      </w:r>
+      <w:r>
+        <w:rPr>
+          <w:b/>
+        </w:rPr>
+        <w:t>stored locally</w:t>
+      </w:r>
+      <w:r>
+        <w:t xml:space="preserve"> on your device</w:t>
+      </w:r>
+    </w:p>
+    <w:p>
+      <w:pPr>
+        <w:numPr>
+          <w:ilvl w:val="0"/>
+          <w:numId w:val="11"/>
+        </w:numPr>
+      </w:pPr>
+      <w:r>
+        <w:rPr>
+          <w:rFonts w:ascii="Segoe UI Emoji" w:hAnsi="Segoe UI Emoji" w:cs="Segoe UI Emoji"/>
+        </w:rPr>
+        <w:t>✅</w:t>
+      </w:r>
+      <w:r>
+        <w:t xml:space="preserve"> Session history helps </w:t>
+      </w:r>
+      <w:r>
+        <w:rPr>
+          <w:b/>
+        </w:rPr>
+        <w:t>track improvement</w:t>
+      </w:r>
+      <w:r>
+        <w:t xml:space="preserve"> over time</w:t>
+      </w:r>
+    </w:p>
+    <w:p>
+      <w:pPr>
+        <w:numPr>
+          <w:ilvl w:val="0"/>
+          <w:numId w:val="11"/>
+        </w:numPr>
+      </w:pPr>
+      <w:r>
+        <w:rPr>
+          <w:rFonts w:ascii="Segoe UI Emoji" w:hAnsi="Segoe UI Emoji" w:cs="Segoe UI Emoji"/>
+        </w:rPr>
+        <w:t>✅</w:t>
+      </w:r>
+      <w:r>
+        <w:t xml:space="preserve"> You can </w:t>
+      </w:r>
+      <w:r>
+        <w:rPr>
+          <w:b/>
+        </w:rPr>
+        <w:t>clear statistics</w:t>
+      </w:r>
+      <w:r>
+        <w:t xml:space="preserve"> in Settings if needed</w:t>
+      </w:r>
+    </w:p>
+    <w:p>
+      <w:r>
+        <w:t>---</w:t>
+      </w:r>
+    </w:p>
+    <w:p>
+      <w:pPr>
+        <w:pStyle w:val="Heading1"/>
+      </w:pPr>
+      <w:r>
+        <w:t>Technical Details (for Developers)</w:t>
+      </w:r>
+    </w:p>
+    <w:p>
+      <w:r>
+        <w:t xml:space="preserve">The level-up system uses a </w:t>
+      </w:r>
+      <w:r>
+        <w:rPr>
+          <w:b/>
+        </w:rPr>
+        <w:t>rolling-average</w:t>
+      </w:r>
+      <w:r>
+        <w:t xml:space="preserve"> algorithm:</w:t>
+      </w:r>
+    </w:p>
+    <w:p>
+      <w:pPr>
+        <w:numPr>
+          <w:ilvl w:val="0"/>
+          <w:numId w:val="12"/>
+        </w:numPr>
+      </w:pPr>
+      <w:r>
+        <w:t xml:space="preserve">Fetches the most recent sessions for the same </w:t>
+      </w:r>
+      <w:r>
+        <w:rPr>
+          <w:b/>
+        </w:rPr>
+        <w:t>level + instrument</w:t>
+      </w:r>
+    </w:p>
+    <w:p>
+      <w:pPr>
+        <w:numPr>
+          <w:ilvl w:val="0"/>
+          <w:numId w:val="12"/>
+        </w:numPr>
+      </w:pPr>
+      <w:r>
+        <w:t>Filters out sessions that are too short or have data errors</w:t>
+      </w:r>
+    </w:p>
+    <w:p>
+      <w:pPr>
+        <w:numPr>
+          <w:ilvl w:val="0"/>
+          <w:numId w:val="12"/>
+        </w:numPr>
+      </w:pPr>
+      <w:r>
+        <w:t xml:space="preserve">Takes the most recent </w:t>
+      </w:r>
+      <w:r>
+        <w:rPr>
+          <w:b/>
+        </w:rPr>
+        <w:t>N qualifying sessions</w:t>
+      </w:r>
+      <w:r>
+        <w:t xml:space="preserve"> (default 3)</w:t>
+      </w:r>
+    </w:p>
+    <w:p>
+      <w:pPr>
+        <w:numPr>
+          <w:ilvl w:val="0"/>
+          <w:numId w:val="12"/>
+        </w:numPr>
+      </w:pPr>
+      <w:r>
+        <w:t xml:space="preserve">Computes </w:t>
+      </w:r>
+      <w:r>
+        <w:rPr>
+          <w:b/>
+        </w:rPr>
+        <w:t>rolling averages</w:t>
+      </w:r>
+      <w:r>
+        <w:t xml:space="preserve"> for pitch, timing, and overall accuracy</w:t>
+      </w:r>
+    </w:p>
+    <w:p>
+      <w:pPr>
+        <w:numPr>
+          <w:ilvl w:val="0"/>
+          <w:numId w:val="12"/>
+        </w:numPr>
+      </w:pPr>
+      <w:r>
+        <w:t>Checks that:</w:t>
+      </w:r>
+    </w:p>
+    <w:p>
+      <w:pPr>
+        <w:numPr>
+          <w:ilvl w:val="1"/>
+          <w:numId w:val="10"/>
+        </w:numPr>
+      </w:pPr>
+      <w:r>
+        <w:t>All averages meet or exceed thresholds</w:t>
+      </w:r>
+    </w:p>
+    <w:p>
+      <w:pPr>
+        <w:numPr>
+          <w:ilvl w:val="1"/>
+          <w:numId w:val="10"/>
+        </w:numPr>
+      </w:pPr>
+      <w:r>
+        <w:t>No individual session falls below the minimum floor (60%)</w:t>
+      </w:r>
+    </w:p>
+    <w:p>
+      <w:pPr>
+        <w:numPr>
+          <w:ilvl w:val="0"/>
+          <w:numId w:val="12"/>
+        </w:numPr>
+      </w:pPr>
+      <w:r>
+        <w:t xml:space="preserve">Advances by </w:t>
+      </w:r>
+      <w:r>
+        <w:rPr>
+          <w:b/>
+        </w:rPr>
+        <w:t>+1 level</w:t>
+      </w:r>
+      <w:r>
+        <w:t xml:space="preserve"> if all criteria are met</w:t>
+      </w:r>
+    </w:p>
+    <w:p>
+      <w:pPr>
+        <w:numPr>
+          <w:ilvl w:val="0"/>
+          <w:numId w:val="12"/>
+        </w:numPr>
+      </w:pPr>
+      <w:r>
+        <w:t>Persists the new level to local storage</w:t>
+      </w:r>
+    </w:p>
+    <w:p>
+      <w:r>
+        <w:t xml:space="preserve">This approach ensures </w:t>
+      </w:r>
+      <w:r>
+        <w:rPr>
+          <w:b/>
+        </w:rPr>
+        <w:t>consistent performance</w:t>
+      </w:r>
+      <w:r>
+        <w:t xml:space="preserve"> across multiple sessions rather than allowing advancement based on a single lucky session.</w:t>
+      </w:r>
+    </w:p>
+    <w:p>
+      <w:r>
+        <w:t>---</w:t>
+      </w:r>
+    </w:p>
+    <w:p>
+      <w:pPr>
+        <w:pStyle w:val="Heading1"/>
+      </w:pPr>
+      <w:r>
+        <w:t>Frequently Asked Questions</w:t>
+      </w:r>
+    </w:p>
+    <w:p>
+      <w:r>
+        <w:rPr>
+          <w:b/>
+        </w:rPr>
+        <w:t>Q: Can my child practice at a higher level manually?</w:t>
+      </w:r>
+      <w:r>
+        <w:br/>
+        <w:t>A: Yes! Parents can adjust the starting level on the Child Home page.</w:t>
+      </w:r>
+    </w:p>
+    <w:p>
+      <w:r>
+        <w:rPr>
+          <w:b/>
+        </w:rPr>
+        <w:t>Q: What happens if my child switches instruments?</w:t>
+      </w:r>
+      <w:r>
+        <w:br/>
+        <w:t>A: Each instrument tracks progress independently. Progress on piano does not affect violin level.</w:t>
+      </w:r>
+    </w:p>
+    <w:p>
+      <w:r>
+        <w:rPr>
+          <w:b/>
+        </w:rPr>
+        <w:t>Q: Can the level go down?</w:t>
+      </w:r>
+      <w:r>
+        <w:br/>
+        <w:t>A: No, levels never decrease automatically. Only manual adjustment can lower the level.</w:t>
+      </w:r>
+    </w:p>
+    <w:p>
+      <w:r>
+        <w:rPr>
+          <w:b/>
+        </w:rPr>
+        <w:t>Q: What if my child plays a session perfectly but doesn't level up?</w:t>
+      </w:r>
+      <w:r>
+        <w:br/>
+        <w:t xml:space="preserve">A: The system requires </w:t>
+      </w:r>
+      <w:r>
+        <w:rPr>
+          <w:b/>
+        </w:rPr>
+        <w:t>3 qualifying sessions</w:t>
+      </w:r>
+      <w:r>
+        <w:t xml:space="preserve"> with good performance. One perfect session counts toward the requirement but isn't enough alone.</w:t>
+      </w:r>
+    </w:p>
+    <w:p>
+      <w:r>
+        <w:rPr>
+          <w:b/>
+        </w:rPr>
+        <w:t>Q: How do I make it easier/harder?</w:t>
+      </w:r>
+      <w:r>
+        <w:br/>
+        <w:t xml:space="preserve">A: Visit the Advanced settings page to adjust thresholds. For quick testing, set all criteria to </w:t>
+      </w:r>
+      <w:r>
+        <w:rPr>
+          <w:b/>
+        </w:rPr>
+        <w:t>1</w:t>
+      </w:r>
+      <w:r>
+        <w:t xml:space="preserve"> (session count, minimum accuracy, notes required).</w:t>
+      </w:r>
+    </w:p>
+    <w:p>
+      <w:r>
+        <w:t>---</w:t>
+      </w:r>
+    </w:p>
+    <w:p>
+      <w:r>
+        <w:rPr>
+          <w:b/>
+        </w:rPr>
+        <w:t>Music Mate</w:t>
+      </w:r>
+      <w:r>
+        <w:t xml:space="preserve"> is designed to make music practice </w:t>
+      </w:r>
+      <w:r>
+        <w:rPr>
+          <w:b/>
+        </w:rPr>
+        <w:t>fun, rewarding, and educational</w:t>
+      </w:r>
+      <w:r>
+        <w:t>. The intelligent level-up system ensures your child progresses at the right pace—</w:t>
+      </w:r>
+      <w:r>
+        <w:rPr>
+          <w:b/>
+        </w:rPr>
+        <w:t>challenging enough to learn, but achievable enough to stay motivated!</w:t>
+      </w:r>
+      <w:r>
+        <w:t xml:space="preserve"> </w:t>
+      </w:r>
+      <w:r>
+        <w:rPr>
+          <w:rFonts w:ascii="Segoe UI Emoji" w:hAnsi="Segoe UI Emoji" w:cs="Segoe UI Emoji"/>
+        </w:rPr>
+        <w:t>🎵🎉</w:t>
+      </w:r>
+    </w:p>
+    <w:p/>
     <w:p>
       <w:pPr>
         <w:rPr>
@@ -2479,6 +4099,134 @@
         </w:tabs>
         <w:ind w:left="6480" w:hanging="360"/>
       </w:pPr>
+    </w:lvl>
+  </w:abstractNum>
+  <w:abstractNum w:abstractNumId="11" w15:restartNumberingAfterBreak="0">
+    <w:nsid w:val="00000002"/>
+    <w:multiLevelType w:val="hybridMultilevel"/>
+    <w:tmpl w:val="FFFFFFFF"/>
+    <w:lvl w:ilvl="0" w:tplc="0000000E">
+      <w:start w:val="1"/>
+      <w:numFmt w:val="decimal"/>
+      <w:lvlText w:val="%1."/>
+      <w:lvlJc w:val="left"/>
+      <w:pPr>
+        <w:tabs>
+          <w:tab w:val="num" w:pos="720"/>
+        </w:tabs>
+        <w:ind w:left="720" w:hanging="360"/>
+      </w:pPr>
+    </w:lvl>
+    <w:lvl w:ilvl="1" w:tplc="0000000F">
+      <w:start w:val="1"/>
+      <w:numFmt w:val="decimal"/>
+      <w:lvlText w:val="%2."/>
+      <w:lvlJc w:val="left"/>
+      <w:pPr>
+        <w:tabs>
+          <w:tab w:val="num" w:pos="1440"/>
+        </w:tabs>
+        <w:ind w:left="1440" w:hanging="360"/>
+      </w:pPr>
+    </w:lvl>
+    <w:lvl w:ilvl="2" w:tplc="00000010">
+      <w:start w:val="1"/>
+      <w:numFmt w:val="decimal"/>
+      <w:lvlText w:val="%3."/>
+      <w:lvlJc w:val="left"/>
+      <w:pPr>
+        <w:tabs>
+          <w:tab w:val="num" w:pos="2160"/>
+        </w:tabs>
+        <w:ind w:left="2160" w:hanging="360"/>
+      </w:pPr>
+    </w:lvl>
+    <w:lvl w:ilvl="3" w:tplc="00000011">
+      <w:start w:val="1"/>
+      <w:numFmt w:val="decimal"/>
+      <w:lvlText w:val="%4."/>
+      <w:lvlJc w:val="left"/>
+      <w:pPr>
+        <w:tabs>
+          <w:tab w:val="num" w:pos="2880"/>
+        </w:tabs>
+        <w:ind w:left="2880" w:hanging="360"/>
+      </w:pPr>
+    </w:lvl>
+    <w:lvl w:ilvl="4" w:tplc="00000012">
+      <w:start w:val="1"/>
+      <w:numFmt w:val="decimal"/>
+      <w:lvlText w:val="%5."/>
+      <w:lvlJc w:val="left"/>
+      <w:pPr>
+        <w:tabs>
+          <w:tab w:val="num" w:pos="3600"/>
+        </w:tabs>
+        <w:ind w:left="3600" w:hanging="360"/>
+      </w:pPr>
+    </w:lvl>
+    <w:lvl w:ilvl="5" w:tplc="00000013">
+      <w:start w:val="1"/>
+      <w:numFmt w:val="decimal"/>
+      <w:lvlText w:val="%6."/>
+      <w:lvlJc w:val="left"/>
+      <w:pPr>
+        <w:tabs>
+          <w:tab w:val="num" w:pos="4320"/>
+        </w:tabs>
+        <w:ind w:left="4320" w:hanging="360"/>
+      </w:pPr>
+    </w:lvl>
+    <w:lvl w:ilvl="6" w:tplc="00000014">
+      <w:start w:val="1"/>
+      <w:numFmt w:val="decimal"/>
+      <w:lvlText w:val="%7."/>
+      <w:lvlJc w:val="left"/>
+      <w:pPr>
+        <w:tabs>
+          <w:tab w:val="num" w:pos="5040"/>
+        </w:tabs>
+        <w:ind w:left="5040" w:hanging="360"/>
+      </w:pPr>
+    </w:lvl>
+    <w:lvl w:ilvl="7" w:tplc="00000015">
+      <w:start w:val="1"/>
+      <w:numFmt w:val="decimal"/>
+      <w:lvlText w:val="%8."/>
+      <w:lvlJc w:val="left"/>
+      <w:pPr>
+        <w:tabs>
+          <w:tab w:val="num" w:pos="5760"/>
+        </w:tabs>
+        <w:ind w:left="5760" w:hanging="360"/>
+      </w:pPr>
+    </w:lvl>
+    <w:lvl w:ilvl="8" w:tplc="00000016">
+      <w:start w:val="1"/>
+      <w:numFmt w:val="decimal"/>
+      <w:lvlText w:val="%9."/>
+      <w:lvlJc w:val="left"/>
+      <w:pPr>
+        <w:tabs>
+          <w:tab w:val="num" w:pos="6480"/>
+        </w:tabs>
+        <w:ind w:left="6480" w:hanging="360"/>
+      </w:pPr>
+    </w:lvl>
+  </w:abstractNum>
+  <w:abstractNum w:abstractNumId="12" w15:restartNumberingAfterBreak="0">
+    <w:nsid w:val="6F776BB6"/>
+    <w:multiLevelType w:val="singleLevel"/>
+    <w:tmpl w:val="D74879B0"/>
+    <w:lvl w:ilvl="0">
+      <w:start w:val="1"/>
+      <w:numFmt w:val="decimal"/>
+      <w:lvlText w:val="%1."/>
+      <w:legacy w:legacy="1" w:legacySpace="0" w:legacyIndent="0"/>
+      <w:lvlJc w:val="left"/>
+      <w:rPr>
+        <w:rFonts w:ascii="Times New Roman" w:hAnsi="Times New Roman" w:cs="Times New Roman" w:hint="default"/>
+      </w:rPr>
     </w:lvl>
   </w:abstractNum>
   <w:num w:numId="1" w16cid:durableId="2017268076">
@@ -2525,6 +4273,12 @@
         </w:rPr>
       </w:lvl>
     </w:lvlOverride>
+  </w:num>
+  <w:num w:numId="12" w16cid:durableId="362948949">
+    <w:abstractNumId w:val="11"/>
+  </w:num>
+  <w:num w:numId="13" w16cid:durableId="2058889890">
+    <w:abstractNumId w:val="12"/>
   </w:num>
 </w:numbering>
 </file>
@@ -3137,7 +4891,6 @@
   <w:style w:type="character" w:default="1" w:styleId="DefaultParagraphFont">
     <w:name w:val="Default Paragraph Font"/>
     <w:uiPriority w:val="1"/>
-    <w:semiHidden/>
     <w:unhideWhenUsed/>
   </w:style>
   <w:style w:type="table" w:default="1" w:styleId="TableNormal">

</xml_diff>